<commit_message>
get started with project design
</commit_message>
<xml_diff>
--- a/System design.docx
+++ b/System design.docx
@@ -4,50 +4,166 @@
   <w:body>
     <w:p>
       <w:pPr>
-        <w:rPr>
-          <w:lang w:val="en-US"/>
-        </w:rPr>
-      </w:pPr>
-      <w:r>
-        <w:rPr>
-          <w:lang w:val="en-US"/>
-        </w:rPr>
-        <w:t>Notes/reminders:</w:t>
-      </w:r>
-    </w:p>
-    <w:p>
-      <w:pPr>
-        <w:rPr>
-          <w:lang w:val="en-US"/>
-        </w:rPr>
-      </w:pPr>
+        <w:pStyle w:val="Heading1"/>
+      </w:pPr>
+      <w:r>
+        <w:t>Project and system design</w:t>
+      </w:r>
+    </w:p>
+    <w:p>
+      <w:pPr>
+        <w:pStyle w:val="Heading2"/>
+      </w:pPr>
+      <w:r>
+        <w:t>System overview</w:t>
+      </w:r>
+    </w:p>
+    <w:p>
+      <w:pPr>
+        <w:rPr>
+          <w:lang w:val="en-AT"/>
+        </w:rPr>
+      </w:pPr>
+      <w:r>
+        <w:rPr>
+          <w:lang w:val="en-AT"/>
+        </w:rPr>
+        <w:t>The project is an Android mobile application for local disaster preparedness and response. The app combines real-time emergency information with gamified learning features to help users become better prepared for disasters in their local community. The core idea is to make preparedness more accessible, engaging, and practical by combining live information, emergency guidance, checklists, quizzes, badges, and local resources in one mobile application.</w:t>
+      </w:r>
+    </w:p>
+    <w:p>
+      <w:pPr>
+        <w:rPr>
+          <w:lang w:val="en-AT"/>
+        </w:rPr>
+      </w:pPr>
+      <w:r>
+        <w:rPr>
+          <w:lang w:val="en-AT"/>
+        </w:rPr>
+        <w:t xml:space="preserve">The app is based on the template </w:t>
+      </w:r>
+      <w:r>
+        <w:rPr>
+          <w:b/>
+          <w:bCs/>
+          <w:lang w:val="en-AT"/>
+        </w:rPr>
+        <w:t>“Developing a Mobile App for Local Disaster Preparedness and Response.”</w:t>
+      </w:r>
+      <w:r>
+        <w:rPr>
+          <w:lang w:val="en-AT"/>
+        </w:rPr>
+        <w:t xml:space="preserve"> The target users are young to middle-aged adults in Austria who want quick access to information about disasters, weather risks, local alerts, emergency numbers, and preparedness guidance. </w:t>
+      </w:r>
+      <w:r>
+        <w:rPr>
+          <w:lang w:val="en-AT"/>
+        </w:rPr>
+        <w:t xml:space="preserve">This thought is supported by the fact that this age group would normally have younger children at home, which could motivate the reasons for preparedness and learning. </w:t>
+      </w:r>
+    </w:p>
+    <w:p>
+      <w:pPr>
+        <w:rPr>
+          <w:lang w:val="en-AT"/>
+        </w:rPr>
+      </w:pPr>
+      <w:r>
+        <w:rPr>
+          <w:lang w:val="en-AT"/>
+        </w:rPr>
+        <w:t xml:space="preserve">The domain of the project is </w:t>
+      </w:r>
+      <w:r>
+        <w:rPr>
+          <w:b/>
+          <w:bCs/>
+          <w:lang w:val="en-AT"/>
+        </w:rPr>
+        <w:t>local disaster preparedness and response</w:t>
+      </w:r>
+      <w:r>
+        <w:rPr>
+          <w:lang w:val="en-AT"/>
+        </w:rPr>
+        <w:t xml:space="preserve">, implemented as a </w:t>
+      </w:r>
+      <w:r>
+        <w:rPr>
+          <w:b/>
+          <w:bCs/>
+          <w:lang w:val="en-AT"/>
+        </w:rPr>
+        <w:t>React Native Android mobile app</w:t>
+      </w:r>
+      <w:r>
+        <w:rPr>
+          <w:lang w:val="en-AT"/>
+        </w:rPr>
+        <w:t>. The app is designed around two main needs of the domain:</w:t>
+      </w:r>
     </w:p>
     <w:p>
       <w:pPr>
         <w:pStyle w:val="ListParagraph"/>
         <w:numPr>
           <w:ilvl w:val="0"/>
-          <w:numId w:val="1"/>
+          <w:numId w:val="2"/>
         </w:numPr>
         <w:rPr>
-          <w:lang w:val="en-US"/>
-        </w:rPr>
-      </w:pPr>
-      <w:r>
-        <w:rPr>
-          <w:lang w:val="en-US"/>
-        </w:rPr>
-        <w:t>Settings page:</w:t>
+          <w:lang w:val="en-AT"/>
+        </w:rPr>
+      </w:pPr>
+      <w:r>
+        <w:rPr>
+          <w:lang w:val="en-AT"/>
+        </w:rPr>
+        <w:t>First, users need reliable and location-relevant information during potential emergencies. This includes weather conditions, alerts, air quality, radiation data, and access to emergency numbers or local resources.</w:t>
       </w:r>
     </w:p>
     <w:p>
       <w:pPr>
         <w:pStyle w:val="ListParagraph"/>
         <w:numPr>
-          <w:ilvl w:val="1"/>
-          <w:numId w:val="1"/>
+          <w:ilvl w:val="0"/>
+          <w:numId w:val="2"/>
         </w:numPr>
         <w:rPr>
+          <w:lang w:val="en-AT"/>
+        </w:rPr>
+      </w:pPr>
+      <w:r>
+        <w:rPr>
+          <w:lang w:val="en-AT"/>
+        </w:rPr>
+        <w:t>Second, users need to build preparedness before an emergency happens. This is supported through a learning mode with checklists, short reading material, quizzes, and preparedness badges.</w:t>
+      </w:r>
+    </w:p>
+    <w:p>
+      <w:pPr>
+        <w:pStyle w:val="Heading2"/>
+      </w:pPr>
+      <w:r>
+        <w:t>S</w:t>
+      </w:r>
+      <w:r>
+        <w:t xml:space="preserve">ystem </w:t>
+      </w:r>
+      <w:r>
+        <w:t>a</w:t>
+      </w:r>
+      <w:r>
+        <w:t>rchitecture</w:t>
+      </w:r>
+      <w:r>
+        <w:t xml:space="preserve"> and technologies</w:t>
+      </w:r>
+    </w:p>
+    <w:p>
+      <w:pPr>
+        <w:rPr>
           <w:lang w:val="en-US"/>
         </w:rPr>
       </w:pPr>
@@ -55,290 +171,1732 @@
         <w:rPr>
           <w:lang w:val="en-US"/>
         </w:rPr>
-        <w:t xml:space="preserve">Add license and credits section to list the names of </w:t>
-      </w:r>
-      <w:proofErr w:type="gramStart"/>
-      <w:r>
+        <w:t>The application follows a mobile-first architecture based on React Native and Expo. This choice supports efficient Android app development while still allowing access to important mobile features such as GPS location, device notifications, local storage, and background activity.</w:t>
+      </w:r>
+    </w:p>
+    <w:p>
+      <w:pPr>
         <w:rPr>
           <w:lang w:val="en-US"/>
         </w:rPr>
-        <w:t>third party</w:t>
-      </w:r>
-      <w:proofErr w:type="gramEnd"/>
+      </w:pPr>
       <w:r>
         <w:rPr>
           <w:lang w:val="en-US"/>
         </w:rPr>
-        <w:t xml:space="preserve"> services that use creative commons licensing. </w:t>
-      </w:r>
-      <w:proofErr w:type="gramStart"/>
-      <w:r>
-        <w:rPr>
-          <w:lang w:val="en-US"/>
-        </w:rPr>
-        <w:t>E.g.</w:t>
-      </w:r>
-      <w:proofErr w:type="gramEnd"/>
-      <w:r>
-        <w:rPr>
-          <w:lang w:val="en-US"/>
-        </w:rPr>
+        <w:t>The app is structured around the mobile frontend, local device services, local data storage, and external public APIs. The React Native frontend handles the user interface, navigation, app state, and interaction logic. Expo is used to simplify development, testing, and access to device features.</w:t>
+      </w:r>
+    </w:p>
+    <w:p>
+      <w:pPr>
+        <w:rPr>
+          <w:lang w:val="en-AT"/>
+        </w:rPr>
+      </w:pPr>
+      <w:r>
+        <w:rPr>
+          <w:lang w:val="en-AT"/>
+        </w:rPr>
+        <w:t xml:space="preserve">The overall structure can be described as </w:t>
+      </w:r>
+      <w:r>
+        <w:rPr>
+          <w:lang w:val="en-AT"/>
+        </w:rPr>
+        <w:t>in Figure 1.</w:t>
+      </w:r>
+    </w:p>
+    <w:p>
+      <w:pPr>
+        <w:rPr>
+          <w:lang w:val="en-AT"/>
+        </w:rPr>
+      </w:pPr>
+      <w:r>
+        <w:rPr>
+          <w:highlight w:val="darkCyan"/>
+          <w:lang w:val="en-AT"/>
+        </w:rPr>
+        <w:t>User</w:t>
+      </w:r>
+      <w:r>
+        <w:rPr>
+          <w:highlight w:val="darkCyan"/>
+          <w:lang w:val="en-AT"/>
+        </w:rPr>
+        <w:br/>
+        <w:t xml:space="preserve"> ↓</w:t>
+      </w:r>
+      <w:r>
+        <w:rPr>
+          <w:highlight w:val="darkCyan"/>
+          <w:lang w:val="en-AT"/>
+        </w:rPr>
+        <w:br/>
+        <w:t>React Native / Expo Android App</w:t>
+      </w:r>
+      <w:r>
+        <w:rPr>
+          <w:highlight w:val="darkCyan"/>
+          <w:lang w:val="en-AT"/>
+        </w:rPr>
+        <w:br/>
+        <w:t xml:space="preserve"> ↓</w:t>
+      </w:r>
+      <w:r>
+        <w:rPr>
+          <w:highlight w:val="darkCyan"/>
+          <w:lang w:val="en-AT"/>
+        </w:rPr>
+        <w:br/>
+        <w:t>UI Screens, Navigation, Local State</w:t>
+      </w:r>
+      <w:r>
+        <w:rPr>
+          <w:highlight w:val="darkCyan"/>
+          <w:lang w:val="en-AT"/>
+        </w:rPr>
+        <w:br/>
+        <w:t xml:space="preserve"> ↓</w:t>
+      </w:r>
+      <w:r>
+        <w:rPr>
+          <w:highlight w:val="darkCyan"/>
+          <w:lang w:val="en-AT"/>
+        </w:rPr>
+        <w:br/>
+        <w:t>Device Services</w:t>
+      </w:r>
+      <w:r>
+        <w:rPr>
+          <w:highlight w:val="darkCyan"/>
+          <w:lang w:val="en-AT"/>
+        </w:rPr>
+        <w:br/>
+        <w:t>- GPS location</w:t>
+      </w:r>
+      <w:r>
+        <w:rPr>
+          <w:highlight w:val="darkCyan"/>
+          <w:lang w:val="en-AT"/>
+        </w:rPr>
+        <w:br/>
+      </w:r>
+      <w:r>
+        <w:rPr>
+          <w:highlight w:val="darkCyan"/>
+          <w:lang w:val="en-AT"/>
+        </w:rPr>
+        <w:lastRenderedPageBreak/>
+        <w:t>- Local notifications</w:t>
+      </w:r>
+      <w:r>
+        <w:rPr>
+          <w:highlight w:val="darkCyan"/>
+          <w:lang w:val="en-AT"/>
+        </w:rPr>
+        <w:br/>
+        <w:t>- Background sync</w:t>
+      </w:r>
+      <w:r>
+        <w:rPr>
+          <w:highlight w:val="darkCyan"/>
+          <w:lang w:val="en-AT"/>
+        </w:rPr>
+        <w:br/>
+      </w:r>
+      <w:r>
+        <w:rPr>
+          <w:highlight w:val="darkCyan"/>
+          <w:lang w:val="en-AT"/>
+        </w:rPr>
+        <w:br/>
+        <w:t xml:space="preserve"> ↓</w:t>
+      </w:r>
+      <w:r>
+        <w:rPr>
+          <w:highlight w:val="darkCyan"/>
+          <w:lang w:val="en-AT"/>
+        </w:rPr>
+        <w:br/>
+        <w:t>Local SQLite Database</w:t>
+      </w:r>
+      <w:r>
+        <w:rPr>
+          <w:highlight w:val="darkCyan"/>
+          <w:lang w:val="en-AT"/>
+        </w:rPr>
+        <w:br/>
+        <w:t>- Saved locations</w:t>
+      </w:r>
+      <w:r>
+        <w:rPr>
+          <w:highlight w:val="darkCyan"/>
+          <w:lang w:val="en-AT"/>
+        </w:rPr>
+        <w:br/>
+        <w:t>- Preparedness progress</w:t>
+      </w:r>
+      <w:r>
+        <w:rPr>
+          <w:highlight w:val="darkCyan"/>
+          <w:lang w:val="en-AT"/>
+        </w:rPr>
+        <w:br/>
+        <w:t>- Quiz results</w:t>
+      </w:r>
+      <w:r>
+        <w:rPr>
+          <w:highlight w:val="darkCyan"/>
+          <w:lang w:val="en-AT"/>
+        </w:rPr>
+        <w:br/>
+        <w:t>- Badge status</w:t>
+      </w:r>
+      <w:r>
+        <w:rPr>
+          <w:highlight w:val="darkCyan"/>
+          <w:lang w:val="en-AT"/>
+        </w:rPr>
+        <w:br/>
+        <w:t>- Cached alert/weather data</w:t>
+      </w:r>
+      <w:r>
+        <w:rPr>
+          <w:highlight w:val="darkCyan"/>
+          <w:lang w:val="en-AT"/>
+        </w:rPr>
+        <w:br/>
+      </w:r>
+      <w:r>
+        <w:rPr>
+          <w:highlight w:val="darkCyan"/>
+          <w:lang w:val="en-AT"/>
+        </w:rPr>
+        <w:br/>
+        <w:t xml:space="preserve"> ↓</w:t>
+      </w:r>
+      <w:r>
+        <w:rPr>
+          <w:highlight w:val="darkCyan"/>
+          <w:lang w:val="en-AT"/>
+        </w:rPr>
+        <w:br/>
+        <w:t>External REST APIs</w:t>
+      </w:r>
+      <w:r>
+        <w:rPr>
+          <w:highlight w:val="darkCyan"/>
+          <w:lang w:val="en-AT"/>
+        </w:rPr>
+        <w:br/>
+        <w:t>- Weather data</w:t>
+      </w:r>
+      <w:r>
+        <w:rPr>
+          <w:highlight w:val="darkCyan"/>
+          <w:lang w:val="en-AT"/>
+        </w:rPr>
+        <w:br/>
+        <w:t>- Disaster alerts</w:t>
+      </w:r>
+      <w:r>
+        <w:rPr>
+          <w:highlight w:val="darkCyan"/>
+          <w:lang w:val="en-AT"/>
+        </w:rPr>
+        <w:br/>
+        <w:t>- Air quality data</w:t>
+      </w:r>
+      <w:r>
+        <w:rPr>
+          <w:highlight w:val="darkCyan"/>
+          <w:lang w:val="en-AT"/>
+        </w:rPr>
+        <w:br/>
+        <w:t>- Radiation information</w:t>
+      </w:r>
+      <w:r>
+        <w:rPr>
+          <w:highlight w:val="darkCyan"/>
+          <w:lang w:val="en-AT"/>
+        </w:rPr>
+        <w:br/>
+        <w:t>- Local public resources</w:t>
+      </w:r>
+    </w:p>
+    <w:p>
+      <w:pPr>
+        <w:rPr>
+          <w:lang w:val="en-AT"/>
+        </w:rPr>
+      </w:pPr>
+    </w:p>
+    <w:p>
+      <w:pPr>
+        <w:rPr>
+          <w:lang w:val="en-AT"/>
+        </w:rPr>
+      </w:pPr>
+      <w:r>
+        <w:rPr>
+          <w:lang w:val="en-AT"/>
+        </w:rPr>
+        <w:t>The local SQLite database is used to store information that should remain available between app sessions. This includes saved custom locations, preparedness checklist progress, quiz results, badge status, cached dashboard data, and notification-related settings. Local storage is important for this domain because users may need access to previously loaded information even when the network connection is unstable.</w:t>
+      </w:r>
+    </w:p>
+    <w:p>
+      <w:pPr>
+        <w:rPr>
+          <w:lang w:val="en-AT"/>
+        </w:rPr>
+      </w:pPr>
+      <w:r>
+        <w:rPr>
+          <w:lang w:val="en-AT"/>
+        </w:rPr>
+        <w:t xml:space="preserve">The app uses GPS sensor data to provide location-based information. When the user selects the location </w:t>
+      </w:r>
+      <w:r>
+        <w:rPr>
+          <w:lang w:val="en-AT"/>
+        </w:rPr>
+        <w:t>(current or custom)</w:t>
+      </w:r>
+      <w:r>
+        <w:rPr>
+          <w:lang w:val="en-AT"/>
+        </w:rPr>
+        <w:t xml:space="preserve">, the app reads the device location and uses it to request relevant data from external REST APIs. </w:t>
+      </w:r>
+    </w:p>
+    <w:p>
+      <w:pPr>
+        <w:rPr>
+          <w:lang w:val="en-AT"/>
+        </w:rPr>
+      </w:pPr>
+      <w:r>
+        <w:rPr>
+          <w:lang w:val="en-AT"/>
+        </w:rPr>
+        <w:t>Device notifications are used for two main purposes: alert notifications and preparedness reminders. Alert notifications inform users when relevant weather or disaster alerts are detected for their selected area. Preparedness reminders notify users when their preparedness status has expired and should be reviewed again.</w:t>
+      </w:r>
+      <w:r>
+        <w:rPr>
+          <w:lang w:val="en-AT"/>
+        </w:rPr>
+        <w:t xml:space="preserve"> Notifications in the background </w:t>
+      </w:r>
+      <w:r>
+        <w:rPr>
+          <w:lang w:val="en-AT"/>
+        </w:rPr>
+        <w:t>support the goal of keeping users informed without requiring them to manually refresh the app. However, this functionality depends on mobile operating system restrictions and Expo capabilities, so it is treated as an important but potentially adjustable feature.</w:t>
+      </w:r>
+    </w:p>
+    <w:p>
+      <w:pPr>
+        <w:rPr>
+          <w:lang w:val="en-AT"/>
+        </w:rPr>
+      </w:pPr>
+      <w:r>
+        <w:rPr>
+          <w:lang w:val="en-AT"/>
+        </w:rPr>
+        <w:t xml:space="preserve">External REST APIs provide the real-time and public information used by the dashboard and national overview. These APIs may include weather data, local disaster alerts, air quality data, radiation information, and public emergency resources. Since the app depends on third-party data sources, the system also includes a license and credits section where providers such as </w:t>
+      </w:r>
+      <w:proofErr w:type="spellStart"/>
+      <w:r>
+        <w:rPr>
+          <w:lang w:val="en-AT"/>
+        </w:rPr>
+        <w:t>GeoSphere</w:t>
+      </w:r>
+      <w:proofErr w:type="spellEnd"/>
+      <w:r>
+        <w:rPr>
+          <w:lang w:val="en-AT"/>
+        </w:rPr>
+        <w:t xml:space="preserve"> Austria or Copernicus Atmosphere Monitoring Service can be attributed.</w:t>
+      </w:r>
+    </w:p>
+    <w:p>
+      <w:pPr>
+        <w:rPr>
+          <w:lang w:val="en-AT"/>
+        </w:rPr>
+      </w:pPr>
+      <w:r>
+        <w:rPr>
+          <w:lang w:val="en-AT"/>
+        </w:rPr>
+        <w:t>Google Forms is used during evaluation to collect user testing feedback. Linear is used for task planning and project management. These tools are not part of the runtime architecture of the app, but they support the development and evaluation process.</w:t>
+      </w:r>
+    </w:p>
+    <w:p>
+      <w:pPr>
+        <w:rPr>
+          <w:lang w:val="en-AT"/>
+        </w:rPr>
+      </w:pPr>
+      <w:r>
+        <w:rPr>
+          <w:lang w:val="en-AT"/>
+        </w:rPr>
+        <w:t xml:space="preserve">The selected architecture is suitable for the project because it keeps the app lightweight and realistic for the project scope. React Native and Expo reduce development complexity, SQLite </w:t>
+      </w:r>
+      <w:r>
+        <w:rPr>
+          <w:lang w:val="en-AT"/>
+        </w:rPr>
+        <w:lastRenderedPageBreak/>
+        <w:t>supports local persistence, GPS and notifications enable location-based mobile features, and REST APIs provide the live data required for disaster preparedness and response.</w:t>
+      </w:r>
+    </w:p>
+    <w:p>
+      <w:pPr>
+        <w:pStyle w:val="Heading2"/>
+      </w:pPr>
+      <w:r>
+        <w:t>User Interface</w:t>
+      </w:r>
+      <w:r>
+        <w:t xml:space="preserve">, </w:t>
+      </w:r>
+      <w:r>
+        <w:t>User Experience</w:t>
+      </w:r>
+      <w:r>
+        <w:t>,</w:t>
+      </w:r>
+      <w:r>
         <w:t xml:space="preserve"> </w:t>
       </w:r>
+      <w:r>
+        <w:t>and d</w:t>
+      </w:r>
+      <w:r>
+        <w:t>esign</w:t>
+      </w:r>
+      <w:r>
+        <w:t xml:space="preserve"> rationale</w:t>
+      </w:r>
+    </w:p>
+    <w:p>
+      <w:pPr>
+        <w:rPr>
+          <w:lang w:val="en-AT"/>
+        </w:rPr>
+      </w:pPr>
+      <w:r>
+        <w:rPr>
+          <w:lang w:val="en-AT"/>
+        </w:rPr>
+        <w:t>The design of the application is based on the needs of users in the disaster preparedness and response domain. In this context, users need information that is quick to understand, location-relevant, and reliable. During an emergency, users may be stressed or under time pressure, so the interface must avoid unnecessary complexity. For this reason, the app uses a minimal Material Design-inspired layout with dark mode as the default visual style.</w:t>
+      </w:r>
+    </w:p>
+    <w:p>
+      <w:pPr>
+        <w:rPr>
+          <w:lang w:val="en-AT"/>
+        </w:rPr>
+      </w:pPr>
+      <w:r>
+        <w:rPr>
+          <w:lang w:val="en-AT"/>
+        </w:rPr>
+        <w:t xml:space="preserve">The app is organised around a small number of clearly separated areas: the main dashboard, national information, emergency resources, learning </w:t>
+      </w:r>
+      <w:r>
+        <w:rPr>
+          <w:lang w:val="en-AT"/>
+        </w:rPr>
+        <w:t>centre</w:t>
+      </w:r>
+      <w:r>
+        <w:rPr>
+          <w:lang w:val="en-AT"/>
+        </w:rPr>
+        <w:t xml:space="preserve">, and settings. This structure supports both immediate response and long-term preparedness. The dashboard focuses on live local information, while the learning </w:t>
+      </w:r>
+      <w:r>
+        <w:rPr>
+          <w:lang w:val="en-AT"/>
+        </w:rPr>
+        <w:t>centre</w:t>
+      </w:r>
+      <w:r>
+        <w:rPr>
+          <w:lang w:val="en-AT"/>
+        </w:rPr>
+        <w:t xml:space="preserve"> helps users prepare before an emergency occurs.</w:t>
+      </w:r>
+    </w:p>
+    <w:p>
+      <w:pPr>
+        <w:pStyle w:val="Heading3"/>
+      </w:pPr>
+      <w:r>
+        <w:t xml:space="preserve">Main </w:t>
+      </w:r>
+      <w:r>
+        <w:t>d</w:t>
+      </w:r>
+      <w:r>
+        <w:t>ashboard</w:t>
+      </w:r>
+    </w:p>
+    <w:p>
+      <w:pPr>
+        <w:rPr>
+          <w:lang w:val="en-AT"/>
+        </w:rPr>
+      </w:pPr>
+      <w:r>
+        <w:rPr>
+          <w:lang w:val="en-AT"/>
+        </w:rPr>
+        <w:t>The main dashboard is the central screen of the application. It provides live information for the selected location, including weather conditions, local alerts, radiation information, air quality, and a summary of the user’s preparedness status.</w:t>
+      </w:r>
+    </w:p>
+    <w:p>
+      <w:pPr>
+        <w:rPr>
+          <w:lang w:val="en-AT"/>
+        </w:rPr>
+      </w:pPr>
+      <w:r>
+        <w:rPr>
+          <w:lang w:val="en-AT"/>
+        </w:rPr>
+        <w:t>At the top of the dashboard, the user can switch between their current GPS location and a custom location. This design choice supports users who want to monitor both their own area and another relevant place, for example where family members live. When the selected location changes, the dashboard updates accordingly.</w:t>
+      </w:r>
+      <w:r>
+        <w:rPr>
+          <w:lang w:val="en-AT"/>
+        </w:rPr>
+        <w:t xml:space="preserve"> This feature is inspired by the NERV Japanese app for disaster alerts </w:t>
+      </w:r>
+      <w:sdt>
+        <w:sdtPr>
+          <w:rPr>
+            <w:rFonts w:ascii="Aptos" w:hAnsi="Aptos"/>
+            <w:color w:val="000000"/>
+            <w:lang w:val="en-AT"/>
+          </w:rPr>
+          <w:tag w:val="MENDELEY_CITATION_v3_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"/>
+          <w:id w:val="-1996255297"/>
+          <w:placeholder>
+            <w:docPart w:val="DefaultPlaceholder_-1854013440"/>
+          </w:placeholder>
+        </w:sdtPr>
+        <w:sdtContent>
+          <w:r>
+            <w:rPr>
+              <w:rFonts w:ascii="Aptos" w:hAnsi="Aptos"/>
+              <w:color w:val="000000"/>
+              <w:lang w:val="en-AT"/>
+            </w:rPr>
+            <w:t>(</w:t>
+          </w:r>
+          <w:proofErr w:type="spellStart"/>
+          <w:r>
+            <w:rPr>
+              <w:rFonts w:ascii="Aptos" w:hAnsi="Aptos"/>
+              <w:color w:val="000000"/>
+              <w:lang w:val="en-AT"/>
+            </w:rPr>
+            <w:t>Gehirn</w:t>
+          </w:r>
+          <w:proofErr w:type="spellEnd"/>
+          <w:r>
+            <w:rPr>
+              <w:rFonts w:ascii="Aptos" w:hAnsi="Aptos"/>
+              <w:color w:val="000000"/>
+              <w:lang w:val="en-AT"/>
+            </w:rPr>
+            <w:t xml:space="preserve"> Inc., 2026)</w:t>
+          </w:r>
+        </w:sdtContent>
+      </w:sdt>
+      <w:r>
+        <w:rPr>
+          <w:lang w:val="en-AT"/>
+        </w:rPr>
+        <w:t>.</w:t>
+      </w:r>
+    </w:p>
+    <w:p>
+      <w:pPr>
+        <w:pStyle w:val="Heading3"/>
+      </w:pPr>
+      <w:r>
+        <w:t xml:space="preserve">Background </w:t>
+      </w:r>
+      <w:r>
+        <w:t>a</w:t>
+      </w:r>
+      <w:r>
+        <w:t xml:space="preserve">lert </w:t>
+      </w:r>
+      <w:r>
+        <w:t>s</w:t>
+      </w:r>
+      <w:r>
+        <w:t>ync</w:t>
+      </w:r>
+    </w:p>
+    <w:p>
+      <w:pPr>
+        <w:rPr>
+          <w:lang w:val="en-AT"/>
+        </w:rPr>
+      </w:pPr>
+      <w:r>
+        <w:rPr>
+          <w:lang w:val="en-AT"/>
+        </w:rPr>
+        <w:t xml:space="preserve">The app includes background activity to </w:t>
+      </w:r>
+      <w:r>
+        <w:rPr>
+          <w:lang w:val="en-AT"/>
+        </w:rPr>
+        <w:t xml:space="preserve">periodically </w:t>
+      </w:r>
+      <w:r>
+        <w:rPr>
+          <w:lang w:val="en-AT"/>
+        </w:rPr>
+        <w:t>check for alerts in the extended region around the user, approximately within a 100 km radius. The purpose is to notify users about relevant local or regional alerts without requiring them to manually open the app.</w:t>
+      </w:r>
+      <w:r>
+        <w:rPr>
+          <w:lang w:val="en-AT"/>
+        </w:rPr>
+        <w:t xml:space="preserve"> </w:t>
+      </w:r>
+      <w:r>
+        <w:rPr>
+          <w:lang w:val="en-AT"/>
+        </w:rPr>
+        <w:t xml:space="preserve">However, </w:t>
+      </w:r>
+      <w:r>
+        <w:rPr>
+          <w:lang w:val="en-AT"/>
+        </w:rPr>
+        <w:t>the app only</w:t>
+      </w:r>
+      <w:r>
+        <w:rPr>
+          <w:lang w:val="en-AT"/>
+        </w:rPr>
+        <w:t xml:space="preserve"> acts as a preparedness and awareness tool rather than as a replacement for official warning systems.</w:t>
+      </w:r>
+    </w:p>
+    <w:p>
+      <w:pPr>
+        <w:pStyle w:val="Heading3"/>
+      </w:pPr>
+      <w:r>
+        <w:t xml:space="preserve">National </w:t>
+      </w:r>
+      <w:r>
+        <w:t>i</w:t>
+      </w:r>
+      <w:r>
+        <w:t>nformation</w:t>
+      </w:r>
+    </w:p>
+    <w:p>
+      <w:pPr>
+        <w:rPr>
+          <w:lang w:val="en-AT"/>
+        </w:rPr>
+      </w:pPr>
+      <w:r>
+        <w:rPr>
+          <w:lang w:val="en-AT"/>
+        </w:rPr>
+        <w:t>The national information section gives users a broader overview of conditions across Austria. It shows weather conditions for the capital city of each Austrian state and includes a coloured map for visual comparison.</w:t>
+      </w:r>
+    </w:p>
+    <w:p>
+      <w:pPr>
+        <w:rPr>
+          <w:lang w:val="en-AT"/>
+        </w:rPr>
+      </w:pPr>
+      <w:r>
+        <w:rPr>
+          <w:lang w:val="en-AT"/>
+        </w:rPr>
+        <w:t xml:space="preserve">This design </w:t>
+      </w:r>
+      <w:r>
+        <w:rPr>
+          <w:lang w:val="en-AT"/>
+        </w:rPr>
+        <w:t xml:space="preserve">idea was chosen </w:t>
+      </w:r>
+      <w:r>
+        <w:rPr>
+          <w:lang w:val="en-AT"/>
+        </w:rPr>
+        <w:t>because disasters and severe weather events often affect larger regions, not only one city or district. A national overview helps users understand whether their local situation is isolated or part of a wider event.</w:t>
+      </w:r>
+    </w:p>
+    <w:p>
+      <w:pPr>
+        <w:pStyle w:val="Heading3"/>
+      </w:pPr>
+      <w:r>
+        <w:t xml:space="preserve">Emergency </w:t>
+      </w:r>
+      <w:r>
+        <w:t>r</w:t>
+      </w:r>
+      <w:r>
+        <w:t>esources</w:t>
+      </w:r>
+    </w:p>
+    <w:p>
+      <w:pPr>
+        <w:rPr>
+          <w:lang w:val="en-AT"/>
+        </w:rPr>
+      </w:pPr>
+      <w:r>
+        <w:rPr>
+          <w:lang w:val="en-AT"/>
+        </w:rPr>
+        <w:t>The emergency section provides quick access to important emergency numbers, official resources, and basic response guidance. This section is designed for speed and clarity. Users should be able to find essential contact information without navigating through long explanations or learning content.</w:t>
+      </w:r>
+      <w:r>
+        <w:rPr>
+          <w:lang w:val="en-AT"/>
+        </w:rPr>
+        <w:t xml:space="preserve"> </w:t>
+      </w:r>
+      <w:r>
+        <w:rPr>
+          <w:lang w:val="en-AT"/>
+        </w:rPr>
+        <w:t xml:space="preserve">Some content will </w:t>
+      </w:r>
+      <w:r>
+        <w:rPr>
+          <w:lang w:val="en-AT"/>
+        </w:rPr>
+        <w:t xml:space="preserve">include the European emergency number, </w:t>
+      </w:r>
+      <w:r>
+        <w:rPr>
+          <w:lang w:val="en-AT"/>
+        </w:rPr>
+        <w:lastRenderedPageBreak/>
+        <w:t>fire department, police, ambulance, poison control, civil protection links, and official Austrian emergency guidance.</w:t>
+      </w:r>
+    </w:p>
+    <w:p>
+      <w:pPr>
+        <w:pStyle w:val="Heading3"/>
+      </w:pPr>
+      <w:r>
+        <w:t xml:space="preserve">Learning </w:t>
+      </w:r>
+      <w:r>
+        <w:t>centre</w:t>
+      </w:r>
+    </w:p>
+    <w:p>
+      <w:pPr>
+        <w:rPr>
+          <w:lang w:val="en-AT"/>
+        </w:rPr>
+      </w:pPr>
+      <w:r>
+        <w:rPr>
+          <w:lang w:val="en-AT"/>
+        </w:rPr>
+        <w:t xml:space="preserve">The learning </w:t>
+      </w:r>
+      <w:r>
+        <w:rPr>
+          <w:lang w:val="en-AT"/>
+        </w:rPr>
+        <w:t>centre</w:t>
+      </w:r>
+      <w:r>
+        <w:rPr>
+          <w:lang w:val="en-AT"/>
+        </w:rPr>
+        <w:t xml:space="preserve"> supports long-term preparedness. It is not placed as one of the main emergency tabs because it is mainly used before an emergency, not during one. Instead, it is connected to the dashboard and accessible as an additional preparedness feature.</w:t>
+      </w:r>
+    </w:p>
+    <w:p>
+      <w:pPr>
+        <w:rPr>
+          <w:lang w:val="en-AT"/>
+        </w:rPr>
+      </w:pPr>
+      <w:r>
+        <w:rPr>
+          <w:lang w:val="en-AT"/>
+        </w:rPr>
+        <w:t>Users can choose a preparedness topic, read short guidance material, complete checklists, and answer quiz questions. After completing a topic, the app assesses the user’s preparedness level and grants a badge.</w:t>
+      </w:r>
+    </w:p>
+    <w:p>
+      <w:pPr>
+        <w:rPr>
+          <w:lang w:val="en-AT"/>
+        </w:rPr>
+      </w:pPr>
+      <w:r>
+        <w:rPr>
+          <w:lang w:val="en-AT"/>
+        </w:rPr>
+        <w:t>Possible learning topics include first aid, children’s safety at home, flood preparedness, heatwave preparedness, storm and power outage preparedness, and emergency bag preparation.</w:t>
+      </w:r>
+    </w:p>
+    <w:p>
+      <w:pPr>
+        <w:rPr>
+          <w:lang w:val="en-AT"/>
+        </w:rPr>
+      </w:pPr>
+      <w:r>
+        <w:rPr>
+          <w:lang w:val="en-AT"/>
+        </w:rPr>
+        <w:t>The badge system is designed to encourage repeated engagement. Preparedness status decreases over time, and after three months the user receives a notification reminding them to recheck their preparedness. This reflects the idea that emergency knowledge and household readiness should be refreshed regularly.</w:t>
+      </w:r>
+    </w:p>
+    <w:p>
+      <w:pPr>
+        <w:pStyle w:val="Heading3"/>
+      </w:pPr>
+      <w:r>
+        <w:t>Notifications</w:t>
+      </w:r>
+    </w:p>
+    <w:p>
+      <w:pPr>
+        <w:rPr>
+          <w:lang w:val="en-AT"/>
+        </w:rPr>
+      </w:pPr>
+      <w:r>
+        <w:rPr>
+          <w:lang w:val="en-AT"/>
+        </w:rPr>
+        <w:t>Notifications are used for two main purposes. The first is to inform users when weather or disaster alerts are detected for their selected area. The second is to remind users when their preparedness status has expired and should be reviewed.</w:t>
+      </w:r>
+    </w:p>
+    <w:p>
+      <w:pPr>
+        <w:rPr>
+          <w:lang w:val="en-AT"/>
+        </w:rPr>
+      </w:pPr>
+      <w:r>
+        <w:rPr>
+          <w:lang w:val="en-AT"/>
+        </w:rPr>
+        <w:t>This supports both immediate response and long-term preparedness. Alert notifications help users react to current risks, while preparedness reminders encourage users to keep their knowledge and supplies up to date.</w:t>
+      </w:r>
+    </w:p>
+    <w:p>
+      <w:pPr>
+        <w:pStyle w:val="Heading3"/>
+      </w:pPr>
+      <w:r>
+        <w:t xml:space="preserve">Settings, </w:t>
+      </w:r>
+      <w:r>
+        <w:t>l</w:t>
+      </w:r>
+      <w:r>
+        <w:t xml:space="preserve">icenses, and </w:t>
+      </w:r>
+      <w:r>
+        <w:t>c</w:t>
+      </w:r>
+      <w:r>
+        <w:t>redits</w:t>
+      </w:r>
+    </w:p>
+    <w:p>
+      <w:pPr>
+        <w:rPr>
+          <w:lang w:val="en-AT"/>
+        </w:rPr>
+      </w:pPr>
+      <w:r>
+        <w:rPr>
+          <w:lang w:val="en-AT"/>
+        </w:rPr>
+        <w:t>The settings section includes general preferences, location settings, notification settings, and a license and credits area. The credits section is important because the app uses third-party public data sources and resources that require attribution</w:t>
+      </w:r>
+      <w:r>
+        <w:rPr>
+          <w:lang w:val="en-AT"/>
+        </w:rPr>
+        <w:t xml:space="preserve"> due to Creative Commons and legal reasons</w:t>
+      </w:r>
+      <w:r>
+        <w:rPr>
+          <w:lang w:val="en-AT"/>
+        </w:rPr>
+        <w:t>.</w:t>
+      </w:r>
+      <w:r>
+        <w:rPr>
+          <w:lang w:val="en-AT"/>
+        </w:rPr>
+        <w:t xml:space="preserve"> </w:t>
+      </w:r>
+      <w:r>
+        <w:rPr>
+          <w:lang w:val="en-AT"/>
+        </w:rPr>
+        <w:t xml:space="preserve">For example, data from </w:t>
+      </w:r>
       <w:proofErr w:type="spellStart"/>
       <w:r>
         <w:rPr>
-          <w:lang w:val="en-US"/>
+          <w:lang w:val="en-AT"/>
         </w:rPr>
         <w:t>GeoSphere</w:t>
       </w:r>
       <w:proofErr w:type="spellEnd"/>
       <w:r>
         <w:rPr>
-          <w:lang w:val="en-US"/>
-        </w:rPr>
-        <w:t xml:space="preserve"> Austria</w:t>
-      </w:r>
-    </w:p>
-    <w:p>
-      <w:pPr>
-        <w:pStyle w:val="ListParagraph"/>
-        <w:numPr>
-          <w:ilvl w:val="1"/>
-          <w:numId w:val="1"/>
-        </w:numPr>
-        <w:rPr>
-          <w:lang w:val="en-US"/>
-        </w:rPr>
-      </w:pPr>
-      <w:r>
-        <w:rPr>
-          <w:lang w:val="en-US"/>
-        </w:rPr>
-        <w:t>Attribution to ENSEMBLE weather data:</w:t>
-      </w:r>
-      <w:r>
-        <w:rPr>
-          <w:lang w:val="en-US"/>
-        </w:rPr>
-        <w:br/>
-      </w:r>
-      <w:r>
-        <w:rPr>
-          <w:lang w:val="en-US"/>
-        </w:rPr>
-        <w:t xml:space="preserve">METEO FRANCE, </w:t>
+          <w:lang w:val="en-AT"/>
+        </w:rPr>
+        <w:t xml:space="preserve"> Austria, Copernicus Atmosphere Monitoring Service, or other public services should be credited clearly. This improves transparency and ensures that licensing requirements are respected.</w:t>
+      </w:r>
+    </w:p>
+    <w:p>
+      <w:pPr>
+        <w:rPr>
+          <w:lang w:val="en-AT"/>
+        </w:rPr>
+      </w:pPr>
+    </w:p>
+    <w:p>
+      <w:pPr>
+        <w:pStyle w:val="Heading2"/>
+      </w:pPr>
+      <w:r>
+        <w:t xml:space="preserve">Development </w:t>
+      </w:r>
+      <w:r>
+        <w:t>p</w:t>
+      </w:r>
+      <w:r>
+        <w:t>lan</w:t>
+      </w:r>
+    </w:p>
+    <w:p>
+      <w:pPr>
+        <w:rPr>
+          <w:lang w:val="en-AT"/>
+        </w:rPr>
+      </w:pPr>
+      <w:r>
+        <w:rPr>
+          <w:lang w:val="en-AT"/>
+        </w:rPr>
+        <w:t xml:space="preserve">The workplan is divided into several major phases. The first phase is </w:t>
+      </w:r>
+      <w:r>
+        <w:rPr>
+          <w:b/>
+          <w:bCs/>
+          <w:lang w:val="en-AT"/>
+        </w:rPr>
+        <w:t>requirements and research</w:t>
+      </w:r>
+      <w:r>
+        <w:rPr>
+          <w:lang w:val="en-AT"/>
+        </w:rPr>
+        <w:t>. This includes identifying the target users, researching disaster preparedness needs in Austria, deciding which external APIs are viable, and defining the main app features.</w:t>
+      </w:r>
+    </w:p>
+    <w:p>
+      <w:pPr>
+        <w:rPr>
+          <w:lang w:val="en-AT"/>
+        </w:rPr>
+      </w:pPr>
+      <w:r>
+        <w:rPr>
+          <w:lang w:val="en-AT"/>
+        </w:rPr>
+        <w:t xml:space="preserve">The second phase is </w:t>
+      </w:r>
+      <w:r>
+        <w:rPr>
+          <w:b/>
+          <w:bCs/>
+          <w:lang w:val="en-AT"/>
+        </w:rPr>
+        <w:t>UI and UX design</w:t>
+      </w:r>
+      <w:r>
+        <w:rPr>
+          <w:lang w:val="en-AT"/>
+        </w:rPr>
+        <w:t xml:space="preserve">. This includes designing the dashboard, bottom navigation, learning mode, emergency tab, national overview, and settings screen. Wireframes or </w:t>
       </w:r>
       <w:proofErr w:type="spellStart"/>
       <w:r>
         <w:rPr>
-          <w:lang w:val="en-US"/>
-        </w:rPr>
-        <w:t>Institut</w:t>
+          <w:lang w:val="en-AT"/>
+        </w:rPr>
+        <w:t>mockups</w:t>
       </w:r>
       <w:proofErr w:type="spellEnd"/>
       <w:r>
         <w:rPr>
-          <w:lang w:val="en-US"/>
-        </w:rPr>
-        <w:t xml:space="preserve"> national de </w:t>
-      </w:r>
-      <w:proofErr w:type="spellStart"/>
-      <w:r>
-        <w:rPr>
-          <w:lang w:val="en-US"/>
-        </w:rPr>
-        <w:t>l'environnement</w:t>
-      </w:r>
-      <w:proofErr w:type="spellEnd"/>
-      <w:r>
-        <w:rPr>
-          <w:lang w:val="en-US"/>
+          <w:lang w:val="en-AT"/>
         </w:rPr>
         <w:t xml:space="preserve"> </w:t>
       </w:r>
-      <w:proofErr w:type="spellStart"/>
-      <w:r>
-        <w:rPr>
-          <w:lang w:val="en-US"/>
-        </w:rPr>
-        <w:t>industriel</w:t>
-      </w:r>
-      <w:proofErr w:type="spellEnd"/>
-      <w:r>
-        <w:rPr>
-          <w:lang w:val="en-US"/>
-        </w:rPr>
-        <w:t xml:space="preserve"> et des </w:t>
-      </w:r>
-      <w:proofErr w:type="spellStart"/>
-      <w:r>
-        <w:rPr>
-          <w:lang w:val="en-US"/>
-        </w:rPr>
-        <w:t>risques</w:t>
-      </w:r>
-      <w:proofErr w:type="spellEnd"/>
-      <w:r>
-        <w:rPr>
-          <w:lang w:val="en-US"/>
-        </w:rPr>
-        <w:t xml:space="preserve"> (</w:t>
-      </w:r>
-      <w:proofErr w:type="spellStart"/>
-      <w:r>
-        <w:rPr>
-          <w:lang w:val="en-US"/>
-        </w:rPr>
-        <w:t>Ineris</w:t>
-      </w:r>
-      <w:proofErr w:type="spellEnd"/>
-      <w:r>
-        <w:rPr>
-          <w:lang w:val="en-US"/>
-        </w:rPr>
-        <w:t xml:space="preserve">), Aarhus University, Norwegian Meteorological Institute (MET Norway), Jülich </w:t>
-      </w:r>
-      <w:proofErr w:type="spellStart"/>
-      <w:r>
-        <w:rPr>
-          <w:lang w:val="en-US"/>
-        </w:rPr>
-        <w:t>Institut</w:t>
-      </w:r>
-      <w:proofErr w:type="spellEnd"/>
-      <w:r>
-        <w:rPr>
-          <w:lang w:val="en-US"/>
-        </w:rPr>
-        <w:t xml:space="preserve"> für Energie- und </w:t>
-      </w:r>
-      <w:proofErr w:type="spellStart"/>
-      <w:r>
-        <w:rPr>
-          <w:lang w:val="en-US"/>
-        </w:rPr>
-        <w:t>Klimaforschung</w:t>
-      </w:r>
-      <w:proofErr w:type="spellEnd"/>
-      <w:r>
-        <w:rPr>
-          <w:lang w:val="en-US"/>
-        </w:rPr>
-        <w:t xml:space="preserve"> (IEK), Institute of Environmental Protection – National Research Institute (IEP-NRI), </w:t>
-      </w:r>
-      <w:proofErr w:type="spellStart"/>
-      <w:r>
-        <w:rPr>
-          <w:lang w:val="en-US"/>
-        </w:rPr>
-        <w:t>Koninklijk</w:t>
-      </w:r>
-      <w:proofErr w:type="spellEnd"/>
-      <w:r>
-        <w:rPr>
-          <w:lang w:val="en-US"/>
-        </w:rPr>
-        <w:t xml:space="preserve"> </w:t>
-      </w:r>
-      <w:proofErr w:type="spellStart"/>
-      <w:r>
-        <w:rPr>
-          <w:lang w:val="en-US"/>
-        </w:rPr>
-        <w:t>Nederlands</w:t>
-      </w:r>
-      <w:proofErr w:type="spellEnd"/>
-      <w:r>
-        <w:rPr>
-          <w:lang w:val="en-US"/>
-        </w:rPr>
-        <w:t xml:space="preserve"> </w:t>
-      </w:r>
-      <w:proofErr w:type="spellStart"/>
-      <w:r>
-        <w:rPr>
-          <w:lang w:val="en-US"/>
-        </w:rPr>
-        <w:t>Meteorologisch</w:t>
-      </w:r>
-      <w:proofErr w:type="spellEnd"/>
-      <w:r>
-        <w:rPr>
-          <w:lang w:val="en-US"/>
-        </w:rPr>
-        <w:t xml:space="preserve"> </w:t>
-      </w:r>
-      <w:proofErr w:type="spellStart"/>
-      <w:r>
-        <w:rPr>
-          <w:lang w:val="en-US"/>
-        </w:rPr>
-        <w:t>Instituut</w:t>
-      </w:r>
-      <w:proofErr w:type="spellEnd"/>
-      <w:r>
-        <w:rPr>
-          <w:lang w:val="en-US"/>
-        </w:rPr>
-        <w:t xml:space="preserve"> (KNMI), Nederlandse </w:t>
-      </w:r>
-      <w:proofErr w:type="spellStart"/>
-      <w:r>
-        <w:rPr>
-          <w:lang w:val="en-US"/>
-        </w:rPr>
-        <w:t>Organisatie</w:t>
-      </w:r>
-      <w:proofErr w:type="spellEnd"/>
-      <w:r>
-        <w:rPr>
-          <w:lang w:val="en-US"/>
-        </w:rPr>
-        <w:t xml:space="preserve"> </w:t>
-      </w:r>
-      <w:proofErr w:type="spellStart"/>
-      <w:r>
-        <w:rPr>
-          <w:lang w:val="en-US"/>
-        </w:rPr>
-        <w:t>voor</w:t>
-      </w:r>
-      <w:proofErr w:type="spellEnd"/>
-      <w:r>
-        <w:rPr>
-          <w:lang w:val="en-US"/>
-        </w:rPr>
-        <w:t xml:space="preserve"> </w:t>
-      </w:r>
-      <w:proofErr w:type="spellStart"/>
-      <w:r>
-        <w:rPr>
-          <w:lang w:val="en-US"/>
-        </w:rPr>
-        <w:t>toegepast-natuurwetenschappelijk</w:t>
-      </w:r>
-      <w:proofErr w:type="spellEnd"/>
-      <w:r>
-        <w:rPr>
-          <w:lang w:val="en-US"/>
-        </w:rPr>
-        <w:t xml:space="preserve"> </w:t>
-      </w:r>
-      <w:proofErr w:type="spellStart"/>
-      <w:r>
-        <w:rPr>
-          <w:lang w:val="en-US"/>
-        </w:rPr>
-        <w:t>onderzoek</w:t>
-      </w:r>
-      <w:proofErr w:type="spellEnd"/>
-      <w:r>
-        <w:rPr>
-          <w:lang w:val="en-US"/>
-        </w:rPr>
-        <w:t xml:space="preserve"> (TNO), Swedish Meteorological and Hydrological Institute (SMHI), Finnish Meteorological Institute (FMI), Italian National Agency for New Technologies, Energy and Sustainable Economic Development (ENEA) and Barcelona Supercomputing Center (BSC) (2022): CAMS European air quality forecasts, ENSEMBLE data. Copernicus Atmosphere Monitoring Service (CAMS) Atmosphere Data Store (ADS).</w:t>
-      </w:r>
+      <w:r>
+        <w:rPr>
+          <w:lang w:val="en-AT"/>
+        </w:rPr>
+        <w:t>will</w:t>
+      </w:r>
+      <w:r>
+        <w:rPr>
+          <w:lang w:val="en-AT"/>
+        </w:rPr>
+        <w:t xml:space="preserve"> be created before implementation.</w:t>
+      </w:r>
+    </w:p>
+    <w:p>
+      <w:pPr>
+        <w:rPr>
+          <w:lang w:val="en-AT"/>
+        </w:rPr>
+      </w:pPr>
+      <w:r>
+        <w:rPr>
+          <w:lang w:val="en-AT"/>
+        </w:rPr>
+        <w:lastRenderedPageBreak/>
+        <w:t xml:space="preserve">The third phase is </w:t>
+      </w:r>
+      <w:r>
+        <w:rPr>
+          <w:b/>
+          <w:bCs/>
+          <w:lang w:val="en-AT"/>
+        </w:rPr>
+        <w:t>core app setup</w:t>
+      </w:r>
+      <w:r>
+        <w:rPr>
+          <w:lang w:val="en-AT"/>
+        </w:rPr>
+        <w:t>. This includes setting up the Expo React Native project, navigation structure, dark mode styling, basic reusable components, and the local SQLite database.</w:t>
+      </w:r>
+    </w:p>
+    <w:p>
+      <w:pPr>
+        <w:rPr>
+          <w:lang w:val="en-AT"/>
+        </w:rPr>
+      </w:pPr>
+      <w:r>
+        <w:rPr>
+          <w:lang w:val="en-AT"/>
+        </w:rPr>
+        <w:t xml:space="preserve">The fourth phase is </w:t>
+      </w:r>
+      <w:r>
+        <w:rPr>
+          <w:b/>
+          <w:bCs/>
+          <w:lang w:val="en-AT"/>
+        </w:rPr>
+        <w:t>real-time data integration</w:t>
+      </w:r>
+      <w:r>
+        <w:rPr>
+          <w:lang w:val="en-AT"/>
+        </w:rPr>
+        <w:t>. This includes implementing GPS access, current location handling, custom location selection, REST API calls, weather data, alerts, air quality, and radiation information.</w:t>
+      </w:r>
+    </w:p>
+    <w:p>
+      <w:pPr>
+        <w:rPr>
+          <w:lang w:val="en-AT"/>
+        </w:rPr>
+      </w:pPr>
+      <w:r>
+        <w:rPr>
+          <w:lang w:val="en-AT"/>
+        </w:rPr>
+        <w:t xml:space="preserve">The fifth phase is </w:t>
+      </w:r>
+      <w:r>
+        <w:rPr>
+          <w:b/>
+          <w:bCs/>
+          <w:lang w:val="en-AT"/>
+        </w:rPr>
+        <w:t>learning mode and gamification</w:t>
+      </w:r>
+      <w:r>
+        <w:rPr>
+          <w:lang w:val="en-AT"/>
+        </w:rPr>
+        <w:t>. This includes preparedness topics, checklists, reading pages, quizzes, badge logic, and the three-month expiry system.</w:t>
+      </w:r>
+    </w:p>
+    <w:p>
+      <w:pPr>
+        <w:rPr>
+          <w:lang w:val="en-AT"/>
+        </w:rPr>
+      </w:pPr>
+      <w:r>
+        <w:rPr>
+          <w:lang w:val="en-AT"/>
+        </w:rPr>
+        <w:t xml:space="preserve">The sixth phase is </w:t>
+      </w:r>
+      <w:r>
+        <w:rPr>
+          <w:b/>
+          <w:bCs/>
+          <w:lang w:val="en-AT"/>
+        </w:rPr>
+        <w:t>notifications and background sync</w:t>
+      </w:r>
+      <w:r>
+        <w:rPr>
+          <w:lang w:val="en-AT"/>
+        </w:rPr>
+        <w:t>. This includes local notifications for preparedness expiry and alert notifications for selected locations. Background fetching should be tested carefully because mobile operating systems can limit background tasks.</w:t>
+      </w:r>
+    </w:p>
+    <w:p>
+      <w:pPr>
+        <w:rPr>
+          <w:lang w:val="en-AT"/>
+        </w:rPr>
+      </w:pPr>
+      <w:r>
+        <w:rPr>
+          <w:lang w:val="en-AT"/>
+        </w:rPr>
+        <w:t xml:space="preserve">The seventh phase is </w:t>
+      </w:r>
+      <w:r>
+        <w:rPr>
+          <w:b/>
+          <w:bCs/>
+          <w:lang w:val="en-AT"/>
+        </w:rPr>
+        <w:t>testing and evaluation</w:t>
+      </w:r>
+      <w:r>
+        <w:rPr>
+          <w:lang w:val="en-AT"/>
+        </w:rPr>
+        <w:t>. This includes functional testing, usability testing, user feedback collection, and checking whether the project achieved its goals.</w:t>
+      </w:r>
+    </w:p>
+    <w:p>
+      <w:pPr>
+        <w:rPr>
+          <w:lang w:val="en-AT"/>
+        </w:rPr>
+      </w:pPr>
+      <w:r>
+        <w:rPr>
+          <w:lang w:val="en-AT"/>
+        </w:rPr>
+        <w:t>A possible Gantt chart structure could include:</w:t>
+      </w:r>
+    </w:p>
+    <w:p>
+      <w:pPr>
+        <w:rPr>
+          <w:lang w:val="en-AT"/>
+        </w:rPr>
+      </w:pPr>
+      <w:r>
+        <w:rPr>
+          <w:lang w:val="en-AT"/>
+        </w:rPr>
+        <w:t>Week 1: Requirements, research, API investigation</w:t>
+      </w:r>
+      <w:r>
+        <w:rPr>
+          <w:lang w:val="en-AT"/>
+        </w:rPr>
+        <w:br/>
+        <w:t>Week 2: UI/UX design and app structure planning</w:t>
+      </w:r>
+      <w:r>
+        <w:rPr>
+          <w:lang w:val="en-AT"/>
+        </w:rPr>
+        <w:br/>
+        <w:t>Week 3: Expo project setup, navigation, database setup</w:t>
+      </w:r>
+      <w:r>
+        <w:rPr>
+          <w:lang w:val="en-AT"/>
+        </w:rPr>
+        <w:br/>
+        <w:t>Week 4: Dashboard implementation and GPS integration</w:t>
+      </w:r>
+      <w:r>
+        <w:rPr>
+          <w:lang w:val="en-AT"/>
+        </w:rPr>
+        <w:br/>
+        <w:t>Week 5: Weather, alerts, air quality, and radiation API integration</w:t>
+      </w:r>
+      <w:r>
+        <w:rPr>
+          <w:lang w:val="en-AT"/>
+        </w:rPr>
+        <w:br/>
+        <w:t>Week 6: National overview and emergency resources tab</w:t>
+      </w:r>
+      <w:r>
+        <w:rPr>
+          <w:lang w:val="en-AT"/>
+        </w:rPr>
+        <w:br/>
+        <w:t>Week 7: Learning mode, checklists, quizzes, badges</w:t>
+      </w:r>
+      <w:r>
+        <w:rPr>
+          <w:lang w:val="en-AT"/>
+        </w:rPr>
+        <w:br/>
+        <w:t>Week 8: Notifications, background sync, settings, credits</w:t>
+      </w:r>
+      <w:r>
+        <w:rPr>
+          <w:lang w:val="en-AT"/>
+        </w:rPr>
+        <w:br/>
+        <w:t>Week 9: Testing, feedback collection, bug fixing</w:t>
+      </w:r>
+      <w:r>
+        <w:rPr>
+          <w:lang w:val="en-AT"/>
+        </w:rPr>
+        <w:br/>
+        <w:t>Week 10: Final report, evaluation, contingency documentation</w:t>
+      </w:r>
+    </w:p>
+    <w:p>
+      <w:pPr>
+        <w:rPr>
+          <w:lang w:val="en-AT"/>
+        </w:rPr>
+      </w:pPr>
+      <w:r>
+        <w:rPr>
+          <w:lang w:val="en-AT"/>
+        </w:rPr>
+        <w:t>This workplan is feasible because the project is split into clear deliverables. The most complex features, such as background sync and external API integration, are planned before final testing so there is time to adjust the scope if needed.</w:t>
+      </w:r>
+    </w:p>
+    <w:p>
+      <w:pPr>
+        <w:pStyle w:val="Heading2"/>
+      </w:pPr>
+      <w:r>
+        <w:t>Contingency Plan</w:t>
+      </w:r>
+    </w:p>
+    <w:p>
+      <w:pPr>
+        <w:rPr>
+          <w:lang w:val="en-AT"/>
+        </w:rPr>
+      </w:pPr>
+      <w:r>
+        <w:rPr>
+          <w:lang w:val="en-AT"/>
+        </w:rPr>
+        <w:t>Some project risks are expected. External APIs may be unavailable, difficult to use, or limited by licensing restrictions. As a contingency, the app can use mock data or reduce the number of live data sources. For example, if radiation data is not easily available, the app can still function with weather, alerts, and air quality data.</w:t>
+      </w:r>
+    </w:p>
+    <w:p>
+      <w:pPr>
+        <w:rPr>
+          <w:lang w:val="en-AT"/>
+        </w:rPr>
+      </w:pPr>
+      <w:r>
+        <w:rPr>
+          <w:lang w:val="en-AT"/>
+        </w:rPr>
+        <w:t>Background sync may also be limited by Android or Expo restrictions. If reliable background fetching is not possible within the project scope, the app can still support manual refresh and local notifications for preparedness expiry.</w:t>
+      </w:r>
+    </w:p>
+    <w:p>
+      <w:pPr>
+        <w:rPr>
+          <w:lang w:val="en-AT"/>
+        </w:rPr>
+      </w:pPr>
+      <w:r>
+        <w:rPr>
+          <w:lang w:val="en-AT"/>
+        </w:rPr>
+        <w:t>Another risk is that the learning mode may become too large. If there is not enough time to implement all preparedness topics, the project can focus on three complete topics instead of many incomplete ones. A smaller but polished learning mode is better than a larger unfinished one.</w:t>
+      </w:r>
+    </w:p>
+    <w:p>
+      <w:pPr>
+        <w:rPr>
+          <w:lang w:val="en-AT"/>
+        </w:rPr>
+      </w:pPr>
+      <w:r>
+        <w:rPr>
+          <w:lang w:val="en-AT"/>
+        </w:rPr>
+        <w:t>Possible fallback options</w:t>
+      </w:r>
+      <w:r>
+        <w:rPr>
+          <w:lang w:val="en-AT"/>
+        </w:rPr>
+        <w:t xml:space="preserve"> for the first prototype</w:t>
+      </w:r>
+      <w:r>
+        <w:rPr>
+          <w:lang w:val="en-AT"/>
+        </w:rPr>
+        <w:t xml:space="preserve"> include:</w:t>
+      </w:r>
+    </w:p>
+    <w:p>
+      <w:pPr>
+        <w:rPr>
+          <w:lang w:val="en-AT"/>
+        </w:rPr>
+      </w:pPr>
+      <w:r>
+        <w:rPr>
+          <w:lang w:val="en-AT"/>
+        </w:rPr>
+        <w:lastRenderedPageBreak/>
+        <w:t>Use mock data for unavailable APIs</w:t>
+      </w:r>
+      <w:r>
+        <w:rPr>
+          <w:lang w:val="en-AT"/>
+        </w:rPr>
+        <w:t xml:space="preserve"> for a working prototype.</w:t>
+      </w:r>
+      <w:r>
+        <w:rPr>
+          <w:lang w:val="en-AT"/>
+        </w:rPr>
+        <w:br/>
+        <w:t>Reduce the number of preparedness topics</w:t>
+      </w:r>
+      <w:r>
+        <w:rPr>
+          <w:lang w:val="en-AT"/>
+        </w:rPr>
+        <w:br/>
+        <w:t>Limit background sync and focus on manual refresh</w:t>
+      </w:r>
+      <w:r>
+        <w:rPr>
+          <w:lang w:val="en-AT"/>
+        </w:rPr>
+        <w:br/>
+        <w:t>Implement a simplified national overview without a fully interactive map</w:t>
+      </w:r>
+    </w:p>
+    <w:p>
+      <w:pPr>
+        <w:rPr>
+          <w:lang w:val="en-AT"/>
+        </w:rPr>
+      </w:pPr>
+      <w:r>
+        <w:rPr>
+          <w:lang w:val="en-AT"/>
+        </w:rPr>
+        <w:t>These contingency plans keep the project realistic while preserving the main concept.</w:t>
+      </w:r>
+    </w:p>
+    <w:p>
+      <w:pPr>
+        <w:pStyle w:val="Heading2"/>
+      </w:pPr>
+      <w:r>
+        <w:t xml:space="preserve">Test and </w:t>
+      </w:r>
+      <w:r>
+        <w:t>e</w:t>
+      </w:r>
+      <w:r>
+        <w:t xml:space="preserve">valuation </w:t>
+      </w:r>
+      <w:r>
+        <w:t>p</w:t>
+      </w:r>
+      <w:r>
+        <w:t>lan</w:t>
+      </w:r>
+    </w:p>
+    <w:p>
+      <w:pPr>
+        <w:rPr>
+          <w:lang w:val="en-AT"/>
+        </w:rPr>
+      </w:pPr>
+      <w:r>
+        <w:rPr>
+          <w:lang w:val="en-AT"/>
+        </w:rPr>
+        <w:t>The evaluation will check whether the app achieved its planned goals: providing useful local disaster information, supporting preparedness learning, and offering a clear and usable mobile experience.</w:t>
+      </w:r>
+    </w:p>
+    <w:p>
+      <w:pPr>
+        <w:rPr>
+          <w:lang w:val="en-AT"/>
+        </w:rPr>
+      </w:pPr>
+      <w:r>
+        <w:rPr>
+          <w:lang w:val="en-AT"/>
+        </w:rPr>
+        <w:t>The testing approach includes functional testing, usability testing, and feedback collection.</w:t>
+      </w:r>
+    </w:p>
+    <w:p>
+      <w:pPr>
+        <w:rPr>
+          <w:lang w:val="en-AT"/>
+        </w:rPr>
+      </w:pPr>
+      <w:r>
+        <w:rPr>
+          <w:lang w:val="en-AT"/>
+        </w:rPr>
+        <w:t>Functional testing checks whether the app features work as expected. This includes:</w:t>
+      </w:r>
+    </w:p>
+    <w:p>
+      <w:pPr>
+        <w:rPr>
+          <w:lang w:val="en-AT"/>
+        </w:rPr>
+      </w:pPr>
+      <w:r>
+        <w:rPr>
+          <w:lang w:val="en-AT"/>
+        </w:rPr>
+        <w:t>GPS location is detected correctly</w:t>
+      </w:r>
+      <w:r>
+        <w:rPr>
+          <w:lang w:val="en-AT"/>
+        </w:rPr>
+        <w:br/>
+        <w:t>Custom location changes dashboard data</w:t>
+      </w:r>
+      <w:r>
+        <w:rPr>
+          <w:lang w:val="en-AT"/>
+        </w:rPr>
+        <w:br/>
+        <w:t>Weather and alert API data is displayed correctly</w:t>
+      </w:r>
+      <w:r>
+        <w:rPr>
+          <w:lang w:val="en-AT"/>
+        </w:rPr>
+        <w:br/>
+        <w:t>SQLite stores user progress and selected locations</w:t>
+      </w:r>
+      <w:r>
+        <w:rPr>
+          <w:lang w:val="en-AT"/>
+        </w:rPr>
+        <w:br/>
+        <w:t>Notifications are scheduled correctly</w:t>
+      </w:r>
+      <w:r>
+        <w:rPr>
+          <w:lang w:val="en-AT"/>
+        </w:rPr>
+        <w:br/>
+        <w:t>Preparedness badges are granted after completing checklists and quizzes</w:t>
+      </w:r>
+      <w:r>
+        <w:rPr>
+          <w:lang w:val="en-AT"/>
+        </w:rPr>
+        <w:br/>
+        <w:t>Preparedness status expires after the expected time</w:t>
+      </w:r>
+      <w:r>
+        <w:rPr>
+          <w:lang w:val="en-AT"/>
+        </w:rPr>
+        <w:br/>
+        <w:t>Emergency resources are easy to access</w:t>
+      </w:r>
+    </w:p>
+    <w:p>
+      <w:pPr>
+        <w:rPr>
+          <w:lang w:val="en-AT"/>
+        </w:rPr>
+      </w:pPr>
+      <w:r>
+        <w:rPr>
+          <w:lang w:val="en-AT"/>
+        </w:rPr>
+        <w:t>Usability testing checks whether users can understand and use the app. Test users can be asked to complete tasks such as:</w:t>
+      </w:r>
+    </w:p>
+    <w:p>
+      <w:pPr>
+        <w:rPr>
+          <w:lang w:val="en-AT"/>
+        </w:rPr>
+      </w:pPr>
+      <w:r>
+        <w:rPr>
+          <w:lang w:val="en-AT"/>
+        </w:rPr>
+        <w:t>Check the current weather and alert status for their location</w:t>
+      </w:r>
+      <w:r>
+        <w:rPr>
+          <w:lang w:val="en-AT"/>
+        </w:rPr>
+        <w:br/>
+        <w:t>Switch to a custom location</w:t>
+      </w:r>
+      <w:r>
+        <w:rPr>
+          <w:lang w:val="en-AT"/>
+        </w:rPr>
+        <w:br/>
+        <w:t>Find an emergency number</w:t>
+      </w:r>
+      <w:r>
+        <w:rPr>
+          <w:lang w:val="en-AT"/>
+        </w:rPr>
+        <w:br/>
+        <w:t>Complete a preparedness checklist</w:t>
+      </w:r>
+      <w:r>
+        <w:rPr>
+          <w:lang w:val="en-AT"/>
+        </w:rPr>
+        <w:br/>
+        <w:t>Take a quiz and receive a badge</w:t>
+      </w:r>
+      <w:r>
+        <w:rPr>
+          <w:lang w:val="en-AT"/>
+        </w:rPr>
+        <w:br/>
+        <w:t>Find the license and credits section</w:t>
+      </w:r>
+    </w:p>
+    <w:p>
+      <w:pPr>
+        <w:rPr>
+          <w:lang w:val="en-AT"/>
+        </w:rPr>
+      </w:pPr>
+      <w:r>
+        <w:rPr>
+          <w:lang w:val="en-AT"/>
+        </w:rPr>
+        <w:t>Feedback can be collected using Google Forms. The form should include both rating questions and open text questions. Example evaluation questions include:</w:t>
+      </w:r>
+    </w:p>
+    <w:p>
+      <w:pPr>
+        <w:rPr>
+          <w:lang w:val="en-AT"/>
+        </w:rPr>
+      </w:pPr>
+      <w:r>
+        <w:rPr>
+          <w:lang w:val="en-AT"/>
+        </w:rPr>
+        <w:t>Was the dashboard easy to understand?</w:t>
+      </w:r>
+      <w:r>
+        <w:rPr>
+          <w:lang w:val="en-AT"/>
+        </w:rPr>
+        <w:br/>
+        <w:t>Could you find emergency numbers quickly?</w:t>
+      </w:r>
+      <w:r>
+        <w:rPr>
+          <w:lang w:val="en-AT"/>
+        </w:rPr>
+        <w:br/>
+        <w:t>Did the learning mode help you understand how to prepare?</w:t>
+      </w:r>
+      <w:r>
+        <w:rPr>
+          <w:lang w:val="en-AT"/>
+        </w:rPr>
+        <w:br/>
+        <w:t>Was the app navigation clear?</w:t>
+      </w:r>
+      <w:r>
+        <w:rPr>
+          <w:lang w:val="en-AT"/>
+        </w:rPr>
+        <w:br/>
+        <w:t>Which feature felt most useful?</w:t>
+      </w:r>
+      <w:r>
+        <w:rPr>
+          <w:lang w:val="en-AT"/>
+        </w:rPr>
+        <w:br/>
+        <w:t>Which part was confusing or unnecessary?</w:t>
+      </w:r>
+      <w:r>
+        <w:rPr>
+          <w:lang w:val="en-AT"/>
+        </w:rPr>
+        <w:br/>
+        <w:t>Would you use this app during a real weather or disaster situation?</w:t>
+      </w:r>
+    </w:p>
+    <w:p>
+      <w:pPr>
+        <w:rPr>
+          <w:lang w:val="en-AT"/>
+        </w:rPr>
+      </w:pPr>
+      <w:r>
+        <w:rPr>
+          <w:lang w:val="en-AT"/>
+        </w:rPr>
+        <w:t>The evaluation strategy is appropriate because the app is both functional and educational. Therefore, it is not enough to test only whether the code works. The project also needs to test whether users understand the information, can navigate the app quickly, and feel that the preparedness features are useful.</w:t>
+      </w:r>
+    </w:p>
+    <w:p>
+      <w:pPr>
+        <w:rPr>
+          <w:lang w:val="en-AT"/>
+        </w:rPr>
+      </w:pPr>
+      <w:r>
+        <w:rPr>
+          <w:lang w:val="en-AT"/>
+        </w:rPr>
+        <w:t>Success can be measured using the following criteria:</w:t>
+      </w:r>
+    </w:p>
+    <w:p>
+      <w:pPr>
+        <w:rPr>
+          <w:lang w:val="en-AT"/>
+        </w:rPr>
+      </w:pPr>
+      <w:r>
+        <w:rPr>
+          <w:lang w:val="en-AT"/>
+        </w:rPr>
+        <w:lastRenderedPageBreak/>
+        <w:t>Users can complete the main test tasks without major confusion</w:t>
+      </w:r>
+      <w:r>
+        <w:rPr>
+          <w:lang w:val="en-AT"/>
+        </w:rPr>
+        <w:br/>
+        <w:t>The dashboard displays relevant local information</w:t>
+      </w:r>
+      <w:r>
+        <w:rPr>
+          <w:lang w:val="en-AT"/>
+        </w:rPr>
+        <w:br/>
+        <w:t>The learning mode successfully stores progress and grants badges</w:t>
+      </w:r>
+      <w:r>
+        <w:rPr>
+          <w:lang w:val="en-AT"/>
+        </w:rPr>
+        <w:br/>
+        <w:t>Notifications work for preparedness reminders and selected alerts</w:t>
+      </w:r>
+      <w:r>
+        <w:rPr>
+          <w:lang w:val="en-AT"/>
+        </w:rPr>
+        <w:br/>
+        <w:t>Feedback shows that users find the app useful and understandable</w:t>
+      </w:r>
+    </w:p>
+    <w:p>
+      <w:pPr>
+        <w:rPr>
+          <w:lang w:val="en-AT"/>
+        </w:rPr>
+      </w:pPr>
+      <w:r>
+        <w:rPr>
+          <w:lang w:val="en-AT"/>
+        </w:rPr>
+        <w:t>This evaluation approach is comprehensive enough for the project because it covers technical correctness, user experience, and the educational goal of improving preparedness.</w:t>
+      </w:r>
+    </w:p>
+    <w:p>
+      <w:pPr>
+        <w:rPr>
+          <w:lang w:val="en-AT"/>
+        </w:rPr>
+      </w:pPr>
+    </w:p>
+    <w:p>
+      <w:pPr>
+        <w:rPr>
+          <w:lang w:val="en-AT"/>
+        </w:rPr>
+      </w:pPr>
+    </w:p>
+    <w:p>
+      <w:pPr>
+        <w:rPr>
+          <w:lang w:val="en-AT"/>
+        </w:rPr>
+      </w:pPr>
     </w:p>
     <w:sectPr>
       <w:pgSz w:w="11906" w:h="16838"/>
@@ -379,6 +1937,118 @@
         <w:rFonts w:ascii="Courier New" w:hAnsi="Courier New" w:cs="Courier New" w:hint="default"/>
       </w:rPr>
     </w:lvl>
+    <w:lvl w:ilvl="2" w:tplc="20000005">
+      <w:start w:val="1"/>
+      <w:numFmt w:val="bullet"/>
+      <w:lvlText w:val=""/>
+      <w:lvlJc w:val="left"/>
+      <w:pPr>
+        <w:ind w:left="2160" w:hanging="360"/>
+      </w:pPr>
+      <w:rPr>
+        <w:rFonts w:ascii="Wingdings" w:hAnsi="Wingdings" w:hint="default"/>
+      </w:rPr>
+    </w:lvl>
+    <w:lvl w:ilvl="3" w:tplc="20000001">
+      <w:start w:val="1"/>
+      <w:numFmt w:val="bullet"/>
+      <w:lvlText w:val=""/>
+      <w:lvlJc w:val="left"/>
+      <w:pPr>
+        <w:ind w:left="2880" w:hanging="360"/>
+      </w:pPr>
+      <w:rPr>
+        <w:rFonts w:ascii="Symbol" w:hAnsi="Symbol" w:hint="default"/>
+      </w:rPr>
+    </w:lvl>
+    <w:lvl w:ilvl="4" w:tplc="20000003">
+      <w:start w:val="1"/>
+      <w:numFmt w:val="bullet"/>
+      <w:lvlText w:val="o"/>
+      <w:lvlJc w:val="left"/>
+      <w:pPr>
+        <w:ind w:left="3600" w:hanging="360"/>
+      </w:pPr>
+      <w:rPr>
+        <w:rFonts w:ascii="Courier New" w:hAnsi="Courier New" w:cs="Courier New" w:hint="default"/>
+      </w:rPr>
+    </w:lvl>
+    <w:lvl w:ilvl="5" w:tplc="20000005" w:tentative="1">
+      <w:start w:val="1"/>
+      <w:numFmt w:val="bullet"/>
+      <w:lvlText w:val=""/>
+      <w:lvlJc w:val="left"/>
+      <w:pPr>
+        <w:ind w:left="4320" w:hanging="360"/>
+      </w:pPr>
+      <w:rPr>
+        <w:rFonts w:ascii="Wingdings" w:hAnsi="Wingdings" w:hint="default"/>
+      </w:rPr>
+    </w:lvl>
+    <w:lvl w:ilvl="6" w:tplc="20000001" w:tentative="1">
+      <w:start w:val="1"/>
+      <w:numFmt w:val="bullet"/>
+      <w:lvlText w:val=""/>
+      <w:lvlJc w:val="left"/>
+      <w:pPr>
+        <w:ind w:left="5040" w:hanging="360"/>
+      </w:pPr>
+      <w:rPr>
+        <w:rFonts w:ascii="Symbol" w:hAnsi="Symbol" w:hint="default"/>
+      </w:rPr>
+    </w:lvl>
+    <w:lvl w:ilvl="7" w:tplc="20000003" w:tentative="1">
+      <w:start w:val="1"/>
+      <w:numFmt w:val="bullet"/>
+      <w:lvlText w:val="o"/>
+      <w:lvlJc w:val="left"/>
+      <w:pPr>
+        <w:ind w:left="5760" w:hanging="360"/>
+      </w:pPr>
+      <w:rPr>
+        <w:rFonts w:ascii="Courier New" w:hAnsi="Courier New" w:cs="Courier New" w:hint="default"/>
+      </w:rPr>
+    </w:lvl>
+    <w:lvl w:ilvl="8" w:tplc="20000005" w:tentative="1">
+      <w:start w:val="1"/>
+      <w:numFmt w:val="bullet"/>
+      <w:lvlText w:val=""/>
+      <w:lvlJc w:val="left"/>
+      <w:pPr>
+        <w:ind w:left="6480" w:hanging="360"/>
+      </w:pPr>
+      <w:rPr>
+        <w:rFonts w:ascii="Wingdings" w:hAnsi="Wingdings" w:hint="default"/>
+      </w:rPr>
+    </w:lvl>
+  </w:abstractNum>
+  <w:abstractNum w:abstractNumId="1" w15:restartNumberingAfterBreak="0">
+    <w:nsid w:val="2C0863B1"/>
+    <w:multiLevelType w:val="hybridMultilevel"/>
+    <w:tmpl w:val="C010E208"/>
+    <w:lvl w:ilvl="0" w:tplc="A684BAB2">
+      <w:numFmt w:val="bullet"/>
+      <w:lvlText w:val=""/>
+      <w:lvlJc w:val="left"/>
+      <w:pPr>
+        <w:ind w:left="720" w:hanging="360"/>
+      </w:pPr>
+      <w:rPr>
+        <w:rFonts w:ascii="Symbol" w:eastAsiaTheme="minorEastAsia" w:hAnsi="Symbol" w:cstheme="minorBidi" w:hint="default"/>
+      </w:rPr>
+    </w:lvl>
+    <w:lvl w:ilvl="1" w:tplc="20000003" w:tentative="1">
+      <w:start w:val="1"/>
+      <w:numFmt w:val="bullet"/>
+      <w:lvlText w:val="o"/>
+      <w:lvlJc w:val="left"/>
+      <w:pPr>
+        <w:ind w:left="1440" w:hanging="360"/>
+      </w:pPr>
+      <w:rPr>
+        <w:rFonts w:ascii="Courier New" w:hAnsi="Courier New" w:cs="Courier New" w:hint="default"/>
+      </w:rPr>
+    </w:lvl>
     <w:lvl w:ilvl="2" w:tplc="20000005" w:tentative="1">
       <w:start w:val="1"/>
       <w:numFmt w:val="bullet"/>
@@ -464,8 +2134,242 @@
       </w:rPr>
     </w:lvl>
   </w:abstractNum>
+  <w:abstractNum w:abstractNumId="2" w15:restartNumberingAfterBreak="0">
+    <w:nsid w:val="5C7B1F0A"/>
+    <w:multiLevelType w:val="hybridMultilevel"/>
+    <w:tmpl w:val="E5EAECFC"/>
+    <w:lvl w:ilvl="0" w:tplc="97B4618E">
+      <w:numFmt w:val="bullet"/>
+      <w:lvlText w:val=""/>
+      <w:lvlJc w:val="left"/>
+      <w:pPr>
+        <w:ind w:left="720" w:hanging="360"/>
+      </w:pPr>
+      <w:rPr>
+        <w:rFonts w:ascii="Symbol" w:eastAsiaTheme="minorEastAsia" w:hAnsi="Symbol" w:cstheme="minorBidi" w:hint="default"/>
+      </w:rPr>
+    </w:lvl>
+    <w:lvl w:ilvl="1" w:tplc="20000003">
+      <w:start w:val="1"/>
+      <w:numFmt w:val="bullet"/>
+      <w:lvlText w:val="o"/>
+      <w:lvlJc w:val="left"/>
+      <w:pPr>
+        <w:ind w:left="1440" w:hanging="360"/>
+      </w:pPr>
+      <w:rPr>
+        <w:rFonts w:ascii="Courier New" w:hAnsi="Courier New" w:cs="Courier New" w:hint="default"/>
+      </w:rPr>
+    </w:lvl>
+    <w:lvl w:ilvl="2" w:tplc="20000005">
+      <w:start w:val="1"/>
+      <w:numFmt w:val="bullet"/>
+      <w:lvlText w:val=""/>
+      <w:lvlJc w:val="left"/>
+      <w:pPr>
+        <w:ind w:left="2160" w:hanging="360"/>
+      </w:pPr>
+      <w:rPr>
+        <w:rFonts w:ascii="Wingdings" w:hAnsi="Wingdings" w:hint="default"/>
+      </w:rPr>
+    </w:lvl>
+    <w:lvl w:ilvl="3" w:tplc="20000001">
+      <w:start w:val="1"/>
+      <w:numFmt w:val="bullet"/>
+      <w:lvlText w:val=""/>
+      <w:lvlJc w:val="left"/>
+      <w:pPr>
+        <w:ind w:left="2880" w:hanging="360"/>
+      </w:pPr>
+      <w:rPr>
+        <w:rFonts w:ascii="Symbol" w:hAnsi="Symbol" w:hint="default"/>
+      </w:rPr>
+    </w:lvl>
+    <w:lvl w:ilvl="4" w:tplc="20000003" w:tentative="1">
+      <w:start w:val="1"/>
+      <w:numFmt w:val="bullet"/>
+      <w:lvlText w:val="o"/>
+      <w:lvlJc w:val="left"/>
+      <w:pPr>
+        <w:ind w:left="3600" w:hanging="360"/>
+      </w:pPr>
+      <w:rPr>
+        <w:rFonts w:ascii="Courier New" w:hAnsi="Courier New" w:cs="Courier New" w:hint="default"/>
+      </w:rPr>
+    </w:lvl>
+    <w:lvl w:ilvl="5" w:tplc="20000005" w:tentative="1">
+      <w:start w:val="1"/>
+      <w:numFmt w:val="bullet"/>
+      <w:lvlText w:val=""/>
+      <w:lvlJc w:val="left"/>
+      <w:pPr>
+        <w:ind w:left="4320" w:hanging="360"/>
+      </w:pPr>
+      <w:rPr>
+        <w:rFonts w:ascii="Wingdings" w:hAnsi="Wingdings" w:hint="default"/>
+      </w:rPr>
+    </w:lvl>
+    <w:lvl w:ilvl="6" w:tplc="20000001" w:tentative="1">
+      <w:start w:val="1"/>
+      <w:numFmt w:val="bullet"/>
+      <w:lvlText w:val=""/>
+      <w:lvlJc w:val="left"/>
+      <w:pPr>
+        <w:ind w:left="5040" w:hanging="360"/>
+      </w:pPr>
+      <w:rPr>
+        <w:rFonts w:ascii="Symbol" w:hAnsi="Symbol" w:hint="default"/>
+      </w:rPr>
+    </w:lvl>
+    <w:lvl w:ilvl="7" w:tplc="20000003" w:tentative="1">
+      <w:start w:val="1"/>
+      <w:numFmt w:val="bullet"/>
+      <w:lvlText w:val="o"/>
+      <w:lvlJc w:val="left"/>
+      <w:pPr>
+        <w:ind w:left="5760" w:hanging="360"/>
+      </w:pPr>
+      <w:rPr>
+        <w:rFonts w:ascii="Courier New" w:hAnsi="Courier New" w:cs="Courier New" w:hint="default"/>
+      </w:rPr>
+    </w:lvl>
+    <w:lvl w:ilvl="8" w:tplc="20000005" w:tentative="1">
+      <w:start w:val="1"/>
+      <w:numFmt w:val="bullet"/>
+      <w:lvlText w:val=""/>
+      <w:lvlJc w:val="left"/>
+      <w:pPr>
+        <w:ind w:left="6480" w:hanging="360"/>
+      </w:pPr>
+      <w:rPr>
+        <w:rFonts w:ascii="Wingdings" w:hAnsi="Wingdings" w:hint="default"/>
+      </w:rPr>
+    </w:lvl>
+  </w:abstractNum>
+  <w:abstractNum w:abstractNumId="3" w15:restartNumberingAfterBreak="0">
+    <w:nsid w:val="6A1877F4"/>
+    <w:multiLevelType w:val="multilevel"/>
+    <w:tmpl w:val="2E1AF01C"/>
+    <w:lvl w:ilvl="0">
+      <w:start w:val="1"/>
+      <w:numFmt w:val="decimal"/>
+      <w:lvlText w:val="%1."/>
+      <w:lvlJc w:val="left"/>
+      <w:pPr>
+        <w:tabs>
+          <w:tab w:val="num" w:pos="720"/>
+        </w:tabs>
+        <w:ind w:left="720" w:hanging="360"/>
+      </w:pPr>
+    </w:lvl>
+    <w:lvl w:ilvl="1" w:tentative="1">
+      <w:start w:val="1"/>
+      <w:numFmt w:val="decimal"/>
+      <w:lvlText w:val="%2."/>
+      <w:lvlJc w:val="left"/>
+      <w:pPr>
+        <w:tabs>
+          <w:tab w:val="num" w:pos="1440"/>
+        </w:tabs>
+        <w:ind w:left="1440" w:hanging="360"/>
+      </w:pPr>
+    </w:lvl>
+    <w:lvl w:ilvl="2" w:tentative="1">
+      <w:start w:val="1"/>
+      <w:numFmt w:val="decimal"/>
+      <w:lvlText w:val="%3."/>
+      <w:lvlJc w:val="left"/>
+      <w:pPr>
+        <w:tabs>
+          <w:tab w:val="num" w:pos="2160"/>
+        </w:tabs>
+        <w:ind w:left="2160" w:hanging="360"/>
+      </w:pPr>
+    </w:lvl>
+    <w:lvl w:ilvl="3" w:tentative="1">
+      <w:start w:val="1"/>
+      <w:numFmt w:val="decimal"/>
+      <w:lvlText w:val="%4."/>
+      <w:lvlJc w:val="left"/>
+      <w:pPr>
+        <w:tabs>
+          <w:tab w:val="num" w:pos="2880"/>
+        </w:tabs>
+        <w:ind w:left="2880" w:hanging="360"/>
+      </w:pPr>
+    </w:lvl>
+    <w:lvl w:ilvl="4" w:tentative="1">
+      <w:start w:val="1"/>
+      <w:numFmt w:val="decimal"/>
+      <w:lvlText w:val="%5."/>
+      <w:lvlJc w:val="left"/>
+      <w:pPr>
+        <w:tabs>
+          <w:tab w:val="num" w:pos="3600"/>
+        </w:tabs>
+        <w:ind w:left="3600" w:hanging="360"/>
+      </w:pPr>
+    </w:lvl>
+    <w:lvl w:ilvl="5" w:tentative="1">
+      <w:start w:val="1"/>
+      <w:numFmt w:val="decimal"/>
+      <w:lvlText w:val="%6."/>
+      <w:lvlJc w:val="left"/>
+      <w:pPr>
+        <w:tabs>
+          <w:tab w:val="num" w:pos="4320"/>
+        </w:tabs>
+        <w:ind w:left="4320" w:hanging="360"/>
+      </w:pPr>
+    </w:lvl>
+    <w:lvl w:ilvl="6" w:tentative="1">
+      <w:start w:val="1"/>
+      <w:numFmt w:val="decimal"/>
+      <w:lvlText w:val="%7."/>
+      <w:lvlJc w:val="left"/>
+      <w:pPr>
+        <w:tabs>
+          <w:tab w:val="num" w:pos="5040"/>
+        </w:tabs>
+        <w:ind w:left="5040" w:hanging="360"/>
+      </w:pPr>
+    </w:lvl>
+    <w:lvl w:ilvl="7" w:tentative="1">
+      <w:start w:val="1"/>
+      <w:numFmt w:val="decimal"/>
+      <w:lvlText w:val="%8."/>
+      <w:lvlJc w:val="left"/>
+      <w:pPr>
+        <w:tabs>
+          <w:tab w:val="num" w:pos="5760"/>
+        </w:tabs>
+        <w:ind w:left="5760" w:hanging="360"/>
+      </w:pPr>
+    </w:lvl>
+    <w:lvl w:ilvl="8" w:tentative="1">
+      <w:start w:val="1"/>
+      <w:numFmt w:val="decimal"/>
+      <w:lvlText w:val="%9."/>
+      <w:lvlJc w:val="left"/>
+      <w:pPr>
+        <w:tabs>
+          <w:tab w:val="num" w:pos="6480"/>
+        </w:tabs>
+        <w:ind w:left="6480" w:hanging="360"/>
+      </w:pPr>
+    </w:lvl>
+  </w:abstractNum>
   <w:num w:numId="1" w16cid:durableId="1349604953">
     <w:abstractNumId w:val="0"/>
+  </w:num>
+  <w:num w:numId="2" w16cid:durableId="401874423">
+    <w:abstractNumId w:val="2"/>
+  </w:num>
+  <w:num w:numId="3" w16cid:durableId="1783963027">
+    <w:abstractNumId w:val="1"/>
+  </w:num>
+  <w:num w:numId="4" w16cid:durableId="2068141763">
+    <w:abstractNumId w:val="3"/>
   </w:num>
 </w:numbering>
 </file>
@@ -1400,7 +3304,610 @@
       <w:spacing w:val="5"/>
     </w:rPr>
   </w:style>
+  <w:style w:type="character" w:styleId="PlaceholderText">
+    <w:name w:val="Placeholder Text"/>
+    <w:basedOn w:val="DefaultParagraphFont"/>
+    <w:uiPriority w:val="99"/>
+    <w:semiHidden/>
+    <w:rsid w:val="005F732D"/>
+    <w:rPr>
+      <w:color w:val="666666"/>
+    </w:rPr>
+  </w:style>
 </w:styles>
+</file>
+
+<file path=word/glossary/document.xml><?xml version="1.0" encoding="utf-8"?>
+<w:glossaryDocument xmlns:wpc="http://schemas.microsoft.com/office/word/2010/wordprocessingCanvas" xmlns:cx="http://schemas.microsoft.com/office/drawing/2014/chartex" xmlns:cx1="http://schemas.microsoft.com/office/drawing/2015/9/8/chartex" xmlns:cx2="http://schemas.microsoft.com/office/drawing/2015/10/21/chartex" xmlns:cx3="http://schemas.microsoft.com/office/drawing/2016/5/9/chartex" xmlns:cx4="http://schemas.microsoft.com/office/drawing/2016/5/10/chartex" xmlns:cx5="http://schemas.microsoft.com/office/drawing/2016/5/11/chartex" xmlns:cx6="http://schemas.microsoft.com/office/drawing/2016/5/12/chartex" xmlns:cx7="http://schemas.microsoft.com/office/drawing/2016/5/13/chartex" xmlns:cx8="http://schemas.microsoft.com/office/drawing/2016/5/14/chartex" xmlns:mc="http://schemas.openxmlformats.org/markup-compatibility/2006" xmlns:aink="http://schemas.microsoft.com/office/drawing/2016/ink" xmlns:am3d="http://schemas.microsoft.com/office/drawing/2017/model3d" xmlns:o="urn:schemas-microsoft-com:office:office" xmlns:oel="http://schemas.microsoft.com/office/2019/extlst" xmlns:r="http://schemas.openxmlformats.org/officeDocument/2006/relationships" xmlns:m="http://schemas.openxmlformats.org/officeDocument/2006/math" xmlns:v="urn:schemas-microsoft-com:vml" xmlns:wp14="http://schemas.microsoft.com/office/word/2010/wordprocessingDrawing" xmlns:wp="http://schemas.openxmlformats.org/drawingml/2006/wordprocessingDrawing" xmlns:w10="urn:schemas-microsoft-com:office:word" xmlns:w="http://schemas.openxmlformats.org/wordprocessingml/2006/main" xmlns:w14="http://schemas.microsoft.com/office/word/2010/wordml" xmlns:w15="http://schemas.microsoft.com/office/word/2012/wordml" xmlns:w16cex="http://schemas.microsoft.com/office/word/2018/wordml/cex" xmlns:w16cid="http://schemas.microsoft.com/office/word/2016/wordml/cid" xmlns:w16="http://schemas.microsoft.com/office/word/2018/wordml" xmlns:w16du="http://schemas.microsoft.com/office/word/2023/wordml/word16du" xmlns:w16sdtdh="http://schemas.microsoft.com/office/word/2020/wordml/sdtdatahash" xmlns:w16sdtfl="http://schemas.microsoft.com/office/word/2024/wordml/sdtformatlock" xmlns:w16se="http://schemas.microsoft.com/office/word/2015/wordml/symex" xmlns:wpg="http://schemas.microsoft.com/office/word/2010/wordprocessingGroup" xmlns:wpi="http://schemas.microsoft.com/office/word/2010/wordprocessingInk" xmlns:wne="http://schemas.microsoft.com/office/word/2006/wordml" xmlns:wps="http://schemas.microsoft.com/office/word/2010/wordprocessingShape" mc:Ignorable="w14 w15 w16se w16cid w16 w16cex w16sdtdh w16sdtfl w16du wp14">
+  <w:docParts>
+    <w:docPart>
+      <w:docPartPr>
+        <w:name w:val="DefaultPlaceholder_-1854013440"/>
+        <w:category>
+          <w:name w:val="General"/>
+          <w:gallery w:val="placeholder"/>
+        </w:category>
+        <w:types>
+          <w:type w:val="bbPlcHdr"/>
+        </w:types>
+        <w:behaviors>
+          <w:behavior w:val="content"/>
+        </w:behaviors>
+        <w:guid w:val="{8D0D9172-8A4D-4360-8BED-40AE65B3B92A}"/>
+      </w:docPartPr>
+      <w:docPartBody>
+        <w:p>
+          <w:r>
+            <w:rPr>
+              <w:rStyle w:val="PlaceholderText"/>
+              <w:lang w:val="en-AT"/>
+            </w:rPr>
+            <w:t>Click or tap here to enter text.</w:t>
+          </w:r>
+        </w:p>
+      </w:docPartBody>
+    </w:docPart>
+  </w:docParts>
+</w:glossaryDocument>
+</file>
+
+<file path=word/glossary/fontTable.xml><?xml version="1.0" encoding="utf-8"?>
+<w:fonts xmlns:mc="http://schemas.openxmlformats.org/markup-compatibility/2006" xmlns:r="http://schemas.openxmlformats.org/officeDocument/2006/relationships" xmlns:w="http://schemas.openxmlformats.org/wordprocessingml/2006/main" xmlns:w14="http://schemas.microsoft.com/office/word/2010/wordml" xmlns:w15="http://schemas.microsoft.com/office/word/2012/wordml" xmlns:w16cex="http://schemas.microsoft.com/office/word/2018/wordml/cex" xmlns:w16cid="http://schemas.microsoft.com/office/word/2016/wordml/cid" xmlns:w16="http://schemas.microsoft.com/office/word/2018/wordml" xmlns:w16du="http://schemas.microsoft.com/office/word/2023/wordml/word16du" xmlns:w16sdtdh="http://schemas.microsoft.com/office/word/2020/wordml/sdtdatahash" xmlns:w16sdtfl="http://schemas.microsoft.com/office/word/2024/wordml/sdtformatlock" xmlns:w16se="http://schemas.microsoft.com/office/word/2015/wordml/symex" mc:Ignorable="w14 w15 w16se w16cid w16 w16cex w16sdtdh w16sdtfl w16du">
+  <w:font w:name="Aptos">
+    <w:charset w:val="00"/>
+    <w:family w:val="swiss"/>
+    <w:pitch w:val="variable"/>
+    <w:sig w:usb0="20000287" w:usb1="00000003" w:usb2="00000000" w:usb3="00000000" w:csb0="0000019F" w:csb1="00000000"/>
+  </w:font>
+  <w:font w:name="Yu Gothic">
+    <w:altName w:val="游ゴシック"/>
+    <w:panose1 w:val="020B0400000000000000"/>
+    <w:charset w:val="80"/>
+    <w:family w:val="swiss"/>
+    <w:pitch w:val="variable"/>
+    <w:sig w:usb0="E00002FF" w:usb1="2AC7FDFF" w:usb2="00000016" w:usb3="00000000" w:csb0="0002009F" w:csb1="00000000"/>
+  </w:font>
+  <w:font w:name="Times New Roman">
+    <w:panose1 w:val="02020603050405020304"/>
+    <w:charset w:val="00"/>
+    <w:family w:val="roman"/>
+    <w:pitch w:val="variable"/>
+    <w:sig w:usb0="E0002EFF" w:usb1="C000785B" w:usb2="00000009" w:usb3="00000000" w:csb0="000001FF" w:csb1="00000000"/>
+  </w:font>
+  <w:font w:name="Courier New">
+    <w:panose1 w:val="02070309020205020404"/>
+    <w:charset w:val="00"/>
+    <w:family w:val="modern"/>
+    <w:pitch w:val="fixed"/>
+    <w:sig w:usb0="E0002EFF" w:usb1="C0007843" w:usb2="00000009" w:usb3="00000000" w:csb0="000001FF" w:csb1="00000000"/>
+  </w:font>
+  <w:font w:name="Wingdings">
+    <w:panose1 w:val="05000000000000000000"/>
+    <w:charset w:val="02"/>
+    <w:family w:val="auto"/>
+    <w:pitch w:val="variable"/>
+    <w:sig w:usb0="00000000" w:usb1="10000000" w:usb2="00000000" w:usb3="00000000" w:csb0="80000000" w:csb1="00000000"/>
+  </w:font>
+  <w:font w:name="Symbol">
+    <w:panose1 w:val="05050102010706020507"/>
+    <w:charset w:val="02"/>
+    <w:family w:val="roman"/>
+    <w:pitch w:val="variable"/>
+    <w:sig w:usb0="00000000" w:usb1="10000000" w:usb2="00000000" w:usb3="00000000" w:csb0="80000000" w:csb1="00000000"/>
+  </w:font>
+  <w:font w:name="Aptos Display">
+    <w:charset w:val="00"/>
+    <w:family w:val="swiss"/>
+    <w:pitch w:val="variable"/>
+    <w:sig w:usb0="20000287" w:usb1="00000003" w:usb2="00000000" w:usb3="00000000" w:csb0="0000019F" w:csb1="00000000"/>
+  </w:font>
+  <w:font w:name="Yu Gothic Light">
+    <w:altName w:val="游ゴシック Light"/>
+    <w:panose1 w:val="020B0300000000000000"/>
+    <w:charset w:val="80"/>
+    <w:family w:val="swiss"/>
+    <w:pitch w:val="variable"/>
+    <w:sig w:usb0="E00002FF" w:usb1="2AC7FDFF" w:usb2="00000016" w:usb3="00000000" w:csb0="0002009F" w:csb1="00000000"/>
+  </w:font>
+  <w:font w:name="Yu Mincho">
+    <w:altName w:val="游明朝"/>
+    <w:panose1 w:val="02020400000000000000"/>
+    <w:charset w:val="80"/>
+    <w:family w:val="roman"/>
+    <w:pitch w:val="variable"/>
+    <w:sig w:usb0="800002E7" w:usb1="2AC7FCFF" w:usb2="00000012" w:usb3="00000000" w:csb0="0002009F" w:csb1="00000000"/>
+  </w:font>
+</w:fonts>
+</file>
+
+<file path=word/glossary/settings.xml><?xml version="1.0" encoding="utf-8"?>
+<w:settings xmlns:mc="http://schemas.openxmlformats.org/markup-compatibility/2006" xmlns:o="urn:schemas-microsoft-com:office:office" xmlns:r="http://schemas.openxmlformats.org/officeDocument/2006/relationships" xmlns:m="http://schemas.openxmlformats.org/officeDocument/2006/math" xmlns:v="urn:schemas-microsoft-com:vml" xmlns:w10="urn:schemas-microsoft-com:office:word" xmlns:w="http://schemas.openxmlformats.org/wordprocessingml/2006/main" xmlns:w14="http://schemas.microsoft.com/office/word/2010/wordml" xmlns:w15="http://schemas.microsoft.com/office/word/2012/wordml" xmlns:w16cex="http://schemas.microsoft.com/office/word/2018/wordml/cex" xmlns:w16cid="http://schemas.microsoft.com/office/word/2016/wordml/cid" xmlns:w16="http://schemas.microsoft.com/office/word/2018/wordml" xmlns:w16du="http://schemas.microsoft.com/office/word/2023/wordml/word16du" xmlns:w16sdtdh="http://schemas.microsoft.com/office/word/2020/wordml/sdtdatahash" xmlns:w16sdtfl="http://schemas.microsoft.com/office/word/2024/wordml/sdtformatlock" xmlns:w16se="http://schemas.microsoft.com/office/word/2015/wordml/symex" xmlns:sl="http://schemas.openxmlformats.org/schemaLibrary/2006/main" mc:Ignorable="w14 w15 w16se w16cid w16 w16cex w16sdtdh w16sdtfl w16du">
+  <w:view w:val="normal"/>
+  <w:defaultTabStop w:val="720"/>
+  <w:characterSpacingControl w:val="doNotCompress"/>
+  <w:compat>
+    <w:applyBreakingRules/>
+    <w:useFELayout/>
+    <w:compatSetting w:name="compatibilityMode" w:uri="http://schemas.microsoft.com/office/word" w:val="15"/>
+    <w:compatSetting w:name="overrideTableStyleFontSizeAndJustification" w:uri="http://schemas.microsoft.com/office/word" w:val="1"/>
+    <w:compatSetting w:name="enableOpenTypeFeatures" w:uri="http://schemas.microsoft.com/office/word" w:val="1"/>
+    <w:compatSetting w:name="doNotFlipMirrorIndents" w:uri="http://schemas.microsoft.com/office/word" w:val="1"/>
+    <w:compatSetting w:name="differentiateMultirowTableHeaders" w:uri="http://schemas.microsoft.com/office/word" w:val="1"/>
+    <w:compatSetting w:name="useWord2013TrackBottomHyphenation" w:uri="http://schemas.microsoft.com/office/word" w:val="0"/>
+  </w:compat>
+  <w:rsids>
+    <w:rsidRoot w:val="0084204F"/>
+    <w:rsid w:val="002E7A38"/>
+    <w:rsid w:val="00766FDD"/>
+    <w:rsid w:val="0084204F"/>
+  </w:rsids>
+  <m:mathPr>
+    <m:mathFont m:val="Cambria Math"/>
+    <m:brkBin m:val="before"/>
+    <m:brkBinSub m:val="--"/>
+    <m:smallFrac m:val="0"/>
+    <m:dispDef/>
+    <m:lMargin m:val="0"/>
+    <m:rMargin m:val="0"/>
+    <m:defJc m:val="centerGroup"/>
+    <m:wrapIndent m:val="1440"/>
+    <m:intLim m:val="subSup"/>
+    <m:naryLim m:val="undOvr"/>
+  </m:mathPr>
+  <w:themeFontLang w:val="en-AT" w:eastAsia="ja-JP"/>
+  <w:clrSchemeMapping w:bg1="light1" w:t1="dark1" w:bg2="light2" w:t2="dark2" w:accent1="accent1" w:accent2="accent2" w:accent3="accent3" w:accent4="accent4" w:accent5="accent5" w:accent6="accent6" w:hyperlink="hyperlink" w:followedHyperlink="followedHyperlink"/>
+  <w:decimalSymbol w:val="."/>
+  <w:listSeparator w:val=","/>
+  <w15:chartTrackingRefBased/>
+</w:settings>
+</file>
+
+<file path=word/glossary/styles.xml><?xml version="1.0" encoding="utf-8"?>
+<w:styles xmlns:mc="http://schemas.openxmlformats.org/markup-compatibility/2006" xmlns:r="http://schemas.openxmlformats.org/officeDocument/2006/relationships" xmlns:w="http://schemas.openxmlformats.org/wordprocessingml/2006/main" xmlns:w14="http://schemas.microsoft.com/office/word/2010/wordml" xmlns:w15="http://schemas.microsoft.com/office/word/2012/wordml" xmlns:w16cex="http://schemas.microsoft.com/office/word/2018/wordml/cex" xmlns:w16cid="http://schemas.microsoft.com/office/word/2016/wordml/cid" xmlns:w16="http://schemas.microsoft.com/office/word/2018/wordml" xmlns:w16du="http://schemas.microsoft.com/office/word/2023/wordml/word16du" xmlns:w16sdtdh="http://schemas.microsoft.com/office/word/2020/wordml/sdtdatahash" xmlns:w16sdtfl="http://schemas.microsoft.com/office/word/2024/wordml/sdtformatlock" xmlns:w16se="http://schemas.microsoft.com/office/word/2015/wordml/symex" mc:Ignorable="w14 w15 w16se w16cid w16 w16cex w16sdtdh w16sdtfl w16du">
+  <w:docDefaults>
+    <w:rPrDefault>
+      <w:rPr>
+        <w:rFonts w:asciiTheme="minorHAnsi" w:eastAsiaTheme="minorEastAsia" w:hAnsiTheme="minorHAnsi" w:cstheme="minorBidi"/>
+        <w:kern w:val="2"/>
+        <w:sz w:val="24"/>
+        <w:szCs w:val="24"/>
+        <w:lang w:val="en-AT" w:eastAsia="ja-JP" w:bidi="ar-SA"/>
+        <w14:ligatures w14:val="standardContextual"/>
+      </w:rPr>
+    </w:rPrDefault>
+    <w:pPrDefault>
+      <w:pPr>
+        <w:spacing w:after="160" w:line="278" w:lineRule="auto"/>
+      </w:pPr>
+    </w:pPrDefault>
+  </w:docDefaults>
+  <w:latentStyles w:defLockedState="0" w:defUIPriority="99" w:defSemiHidden="0" w:defUnhideWhenUsed="0" w:defQFormat="0" w:count="376">
+    <w:lsdException w:name="Normal" w:uiPriority="0" w:qFormat="1"/>
+    <w:lsdException w:name="heading 1" w:uiPriority="9" w:qFormat="1"/>
+    <w:lsdException w:name="heading 2" w:semiHidden="1" w:uiPriority="9" w:unhideWhenUsed="1" w:qFormat="1"/>
+    <w:lsdException w:name="heading 3" w:semiHidden="1" w:uiPriority="9" w:unhideWhenUsed="1" w:qFormat="1"/>
+    <w:lsdException w:name="heading 4" w:semiHidden="1" w:uiPriority="9" w:unhideWhenUsed="1" w:qFormat="1"/>
+    <w:lsdException w:name="heading 5" w:semiHidden="1" w:uiPriority="9" w:unhideWhenUsed="1" w:qFormat="1"/>
+    <w:lsdException w:name="heading 6" w:semiHidden="1" w:uiPriority="9" w:unhideWhenUsed="1" w:qFormat="1"/>
+    <w:lsdException w:name="heading 7" w:semiHidden="1" w:uiPriority="9" w:unhideWhenUsed="1" w:qFormat="1"/>
+    <w:lsdException w:name="heading 8" w:semiHidden="1" w:uiPriority="9" w:unhideWhenUsed="1" w:qFormat="1"/>
+    <w:lsdException w:name="heading 9" w:semiHidden="1" w:uiPriority="9" w:unhideWhenUsed="1" w:qFormat="1"/>
+    <w:lsdException w:name="index 1" w:semiHidden="1" w:unhideWhenUsed="1"/>
+    <w:lsdException w:name="index 2" w:semiHidden="1" w:unhideWhenUsed="1"/>
+    <w:lsdException w:name="index 3" w:semiHidden="1" w:unhideWhenUsed="1"/>
+    <w:lsdException w:name="index 4" w:semiHidden="1" w:unhideWhenUsed="1"/>
+    <w:lsdException w:name="index 5" w:semiHidden="1" w:unhideWhenUsed="1"/>
+    <w:lsdException w:name="index 6" w:semiHidden="1" w:unhideWhenUsed="1"/>
+    <w:lsdException w:name="index 7" w:semiHidden="1" w:unhideWhenUsed="1"/>
+    <w:lsdException w:name="index 8" w:semiHidden="1" w:unhideWhenUsed="1"/>
+    <w:lsdException w:name="index 9" w:semiHidden="1" w:unhideWhenUsed="1"/>
+    <w:lsdException w:name="toc 1" w:semiHidden="1" w:uiPriority="39" w:unhideWhenUsed="1"/>
+    <w:lsdException w:name="toc 2" w:semiHidden="1" w:uiPriority="39" w:unhideWhenUsed="1"/>
+    <w:lsdException w:name="toc 3" w:semiHidden="1" w:uiPriority="39" w:unhideWhenUsed="1"/>
+    <w:lsdException w:name="toc 4" w:semiHidden="1" w:uiPriority="39" w:unhideWhenUsed="1"/>
+    <w:lsdException w:name="toc 5" w:semiHidden="1" w:uiPriority="39" w:unhideWhenUsed="1"/>
+    <w:lsdException w:name="toc 6" w:semiHidden="1" w:uiPriority="39" w:unhideWhenUsed="1"/>
+    <w:lsdException w:name="toc 7" w:semiHidden="1" w:uiPriority="39" w:unhideWhenUsed="1"/>
+    <w:lsdException w:name="toc 8" w:semiHidden="1" w:uiPriority="39" w:unhideWhenUsed="1"/>
+    <w:lsdException w:name="toc 9" w:semiHidden="1" w:uiPriority="39" w:unhideWhenUsed="1"/>
+    <w:lsdException w:name="Normal Indent" w:semiHidden="1" w:unhideWhenUsed="1"/>
+    <w:lsdException w:name="footnote text" w:semiHidden="1" w:unhideWhenUsed="1"/>
+    <w:lsdException w:name="annotation text" w:semiHidden="1" w:unhideWhenUsed="1"/>
+    <w:lsdException w:name="header" w:semiHidden="1" w:unhideWhenUsed="1"/>
+    <w:lsdException w:name="footer" w:semiHidden="1" w:unhideWhenUsed="1"/>
+    <w:lsdException w:name="index heading" w:semiHidden="1" w:unhideWhenUsed="1"/>
+    <w:lsdException w:name="caption" w:semiHidden="1" w:uiPriority="35" w:unhideWhenUsed="1" w:qFormat="1"/>
+    <w:lsdException w:name="table of figures" w:semiHidden="1" w:unhideWhenUsed="1"/>
+    <w:lsdException w:name="envelope address" w:semiHidden="1" w:unhideWhenUsed="1"/>
+    <w:lsdException w:name="envelope return" w:semiHidden="1" w:unhideWhenUsed="1"/>
+    <w:lsdException w:name="footnote reference" w:semiHidden="1" w:unhideWhenUsed="1"/>
+    <w:lsdException w:name="annotation reference" w:semiHidden="1" w:unhideWhenUsed="1"/>
+    <w:lsdException w:name="line number" w:semiHidden="1" w:unhideWhenUsed="1"/>
+    <w:lsdException w:name="page number" w:semiHidden="1" w:unhideWhenUsed="1"/>
+    <w:lsdException w:name="endnote reference" w:semiHidden="1" w:unhideWhenUsed="1"/>
+    <w:lsdException w:name="endnote text" w:semiHidden="1" w:unhideWhenUsed="1"/>
+    <w:lsdException w:name="table of authorities" w:semiHidden="1" w:unhideWhenUsed="1"/>
+    <w:lsdException w:name="macro" w:semiHidden="1" w:unhideWhenUsed="1"/>
+    <w:lsdException w:name="toa heading" w:semiHidden="1" w:unhideWhenUsed="1"/>
+    <w:lsdException w:name="List" w:semiHidden="1" w:unhideWhenUsed="1"/>
+    <w:lsdException w:name="List Bullet" w:semiHidden="1" w:unhideWhenUsed="1"/>
+    <w:lsdException w:name="List Number" w:semiHidden="1" w:unhideWhenUsed="1"/>
+    <w:lsdException w:name="List 2" w:semiHidden="1" w:unhideWhenUsed="1"/>
+    <w:lsdException w:name="List 3" w:semiHidden="1" w:unhideWhenUsed="1"/>
+    <w:lsdException w:name="List 4" w:semiHidden="1" w:unhideWhenUsed="1"/>
+    <w:lsdException w:name="List 5" w:semiHidden="1" w:unhideWhenUsed="1"/>
+    <w:lsdException w:name="List Bullet 2" w:semiHidden="1" w:unhideWhenUsed="1"/>
+    <w:lsdException w:name="List Bullet 3" w:semiHidden="1" w:unhideWhenUsed="1"/>
+    <w:lsdException w:name="List Bullet 4" w:semiHidden="1" w:unhideWhenUsed="1"/>
+    <w:lsdException w:name="List Bullet 5" w:semiHidden="1" w:unhideWhenUsed="1"/>
+    <w:lsdException w:name="List Number 2" w:semiHidden="1" w:unhideWhenUsed="1"/>
+    <w:lsdException w:name="List Number 3" w:semiHidden="1" w:unhideWhenUsed="1"/>
+    <w:lsdException w:name="List Number 4" w:semiHidden="1" w:unhideWhenUsed="1"/>
+    <w:lsdException w:name="List Number 5" w:semiHidden="1" w:unhideWhenUsed="1"/>
+    <w:lsdException w:name="Title" w:uiPriority="10" w:qFormat="1"/>
+    <w:lsdException w:name="Closing" w:semiHidden="1" w:unhideWhenUsed="1"/>
+    <w:lsdException w:name="Signature" w:semiHidden="1" w:unhideWhenUsed="1"/>
+    <w:lsdException w:name="Default Paragraph Font" w:semiHidden="1" w:uiPriority="1" w:unhideWhenUsed="1"/>
+    <w:lsdException w:name="Body Text" w:semiHidden="1" w:unhideWhenUsed="1"/>
+    <w:lsdException w:name="Body Text Indent" w:semiHidden="1" w:unhideWhenUsed="1"/>
+    <w:lsdException w:name="List Continue" w:semiHidden="1" w:unhideWhenUsed="1"/>
+    <w:lsdException w:name="List Continue 2" w:semiHidden="1" w:unhideWhenUsed="1"/>
+    <w:lsdException w:name="List Continue 3" w:semiHidden="1" w:unhideWhenUsed="1"/>
+    <w:lsdException w:name="List Continue 4" w:semiHidden="1" w:unhideWhenUsed="1"/>
+    <w:lsdException w:name="List Continue 5" w:semiHidden="1" w:unhideWhenUsed="1"/>
+    <w:lsdException w:name="Message Header" w:semiHidden="1" w:unhideWhenUsed="1"/>
+    <w:lsdException w:name="Subtitle" w:uiPriority="11" w:qFormat="1"/>
+    <w:lsdException w:name="Salutation" w:semiHidden="1" w:unhideWhenUsed="1"/>
+    <w:lsdException w:name="Date" w:semiHidden="1" w:unhideWhenUsed="1"/>
+    <w:lsdException w:name="Body Text First Indent" w:semiHidden="1" w:unhideWhenUsed="1"/>
+    <w:lsdException w:name="Body Text First Indent 2" w:semiHidden="1" w:unhideWhenUsed="1"/>
+    <w:lsdException w:name="Note Heading" w:semiHidden="1" w:unhideWhenUsed="1"/>
+    <w:lsdException w:name="Body Text 2" w:semiHidden="1" w:unhideWhenUsed="1"/>
+    <w:lsdException w:name="Body Text 3" w:semiHidden="1" w:unhideWhenUsed="1"/>
+    <w:lsdException w:name="Body Text Indent 2" w:semiHidden="1" w:unhideWhenUsed="1"/>
+    <w:lsdException w:name="Body Text Indent 3" w:semiHidden="1" w:unhideWhenUsed="1"/>
+    <w:lsdException w:name="Block Text" w:semiHidden="1" w:unhideWhenUsed="1"/>
+    <w:lsdException w:name="Hyperlink" w:semiHidden="1" w:unhideWhenUsed="1"/>
+    <w:lsdException w:name="FollowedHyperlink" w:semiHidden="1" w:unhideWhenUsed="1"/>
+    <w:lsdException w:name="Strong" w:uiPriority="22" w:qFormat="1"/>
+    <w:lsdException w:name="Emphasis" w:uiPriority="20" w:qFormat="1"/>
+    <w:lsdException w:name="Document Map" w:semiHidden="1" w:unhideWhenUsed="1"/>
+    <w:lsdException w:name="Plain Text" w:semiHidden="1" w:unhideWhenUsed="1"/>
+    <w:lsdException w:name="E-mail Signature" w:semiHidden="1" w:unhideWhenUsed="1"/>
+    <w:lsdException w:name="HTML Top of Form" w:semiHidden="1" w:unhideWhenUsed="1"/>
+    <w:lsdException w:name="HTML Bottom of Form" w:semiHidden="1" w:unhideWhenUsed="1"/>
+    <w:lsdException w:name="Normal (Web)" w:semiHidden="1" w:unhideWhenUsed="1"/>
+    <w:lsdException w:name="HTML Acronym" w:semiHidden="1" w:unhideWhenUsed="1"/>
+    <w:lsdException w:name="HTML Address" w:semiHidden="1" w:unhideWhenUsed="1"/>
+    <w:lsdException w:name="HTML Cite" w:semiHidden="1" w:unhideWhenUsed="1"/>
+    <w:lsdException w:name="HTML Code" w:semiHidden="1" w:unhideWhenUsed="1"/>
+    <w:lsdException w:name="HTML Definition" w:semiHidden="1" w:unhideWhenUsed="1"/>
+    <w:lsdException w:name="HTML Keyboard" w:semiHidden="1" w:unhideWhenUsed="1"/>
+    <w:lsdException w:name="HTML Preformatted" w:semiHidden="1" w:unhideWhenUsed="1"/>
+    <w:lsdException w:name="HTML Sample" w:semiHidden="1" w:unhideWhenUsed="1"/>
+    <w:lsdException w:name="HTML Typewriter" w:semiHidden="1" w:unhideWhenUsed="1"/>
+    <w:lsdException w:name="HTML Variable" w:semiHidden="1" w:unhideWhenUsed="1"/>
+    <w:lsdException w:name="Normal Table" w:semiHidden="1" w:unhideWhenUsed="1"/>
+    <w:lsdException w:name="annotation subject" w:semiHidden="1" w:unhideWhenUsed="1"/>
+    <w:lsdException w:name="No List" w:semiHidden="1" w:unhideWhenUsed="1"/>
+    <w:lsdException w:name="Outline List 1" w:semiHidden="1" w:unhideWhenUsed="1"/>
+    <w:lsdException w:name="Outline List 2" w:semiHidden="1" w:unhideWhenUsed="1"/>
+    <w:lsdException w:name="Outline List 3" w:semiHidden="1" w:unhideWhenUsed="1"/>
+    <w:lsdException w:name="Table Simple 1" w:semiHidden="1" w:unhideWhenUsed="1"/>
+    <w:lsdException w:name="Table Simple 2" w:semiHidden="1" w:unhideWhenUsed="1"/>
+    <w:lsdException w:name="Table Simple 3" w:semiHidden="1" w:unhideWhenUsed="1"/>
+    <w:lsdException w:name="Table Classic 1" w:semiHidden="1" w:unhideWhenUsed="1"/>
+    <w:lsdException w:name="Table Classic 2" w:semiHidden="1" w:unhideWhenUsed="1"/>
+    <w:lsdException w:name="Table Classic 3" w:semiHidden="1" w:unhideWhenUsed="1"/>
+    <w:lsdException w:name="Table Classic 4" w:semiHidden="1" w:unhideWhenUsed="1"/>
+    <w:lsdException w:name="Table Colorful 1" w:semiHidden="1" w:unhideWhenUsed="1"/>
+    <w:lsdException w:name="Table Colorful 2" w:semiHidden="1" w:unhideWhenUsed="1"/>
+    <w:lsdException w:name="Table Colorful 3" w:semiHidden="1" w:unhideWhenUsed="1"/>
+    <w:lsdException w:name="Table Columns 1" w:semiHidden="1" w:unhideWhenUsed="1"/>
+    <w:lsdException w:name="Table Columns 2" w:semiHidden="1" w:unhideWhenUsed="1"/>
+    <w:lsdException w:name="Table Columns 3" w:semiHidden="1" w:unhideWhenUsed="1"/>
+    <w:lsdException w:name="Table Columns 4" w:semiHidden="1" w:unhideWhenUsed="1"/>
+    <w:lsdException w:name="Table Columns 5" w:semiHidden="1" w:unhideWhenUsed="1"/>
+    <w:lsdException w:name="Table Grid 1" w:semiHidden="1" w:unhideWhenUsed="1"/>
+    <w:lsdException w:name="Table Grid 2" w:semiHidden="1" w:unhideWhenUsed="1"/>
+    <w:lsdException w:name="Table Grid 3" w:semiHidden="1" w:unhideWhenUsed="1"/>
+    <w:lsdException w:name="Table Grid 4" w:semiHidden="1" w:unhideWhenUsed="1"/>
+    <w:lsdException w:name="Table Grid 5" w:semiHidden="1" w:unhideWhenUsed="1"/>
+    <w:lsdException w:name="Table Grid 6" w:semiHidden="1" w:unhideWhenUsed="1"/>
+    <w:lsdException w:name="Table Grid 7" w:semiHidden="1" w:unhideWhenUsed="1"/>
+    <w:lsdException w:name="Table Grid 8" w:semiHidden="1" w:unhideWhenUsed="1"/>
+    <w:lsdException w:name="Table List 1" w:semiHidden="1" w:unhideWhenUsed="1"/>
+    <w:lsdException w:name="Table List 2" w:semiHidden="1" w:unhideWhenUsed="1"/>
+    <w:lsdException w:name="Table List 3" w:semiHidden="1" w:unhideWhenUsed="1"/>
+    <w:lsdException w:name="Table List 4" w:semiHidden="1" w:unhideWhenUsed="1"/>
+    <w:lsdException w:name="Table List 5" w:semiHidden="1" w:unhideWhenUsed="1"/>
+    <w:lsdException w:name="Table List 6" w:semiHidden="1" w:unhideWhenUsed="1"/>
+    <w:lsdException w:name="Table List 7" w:semiHidden="1" w:unhideWhenUsed="1"/>
+    <w:lsdException w:name="Table List 8" w:semiHidden="1" w:unhideWhenUsed="1"/>
+    <w:lsdException w:name="Table 3D effects 1" w:semiHidden="1" w:unhideWhenUsed="1"/>
+    <w:lsdException w:name="Table 3D effects 2" w:semiHidden="1" w:unhideWhenUsed="1"/>
+    <w:lsdException w:name="Table 3D effects 3" w:semiHidden="1" w:unhideWhenUsed="1"/>
+    <w:lsdException w:name="Table Contemporary" w:semiHidden="1" w:unhideWhenUsed="1"/>
+    <w:lsdException w:name="Table Elegant" w:semiHidden="1" w:unhideWhenUsed="1"/>
+    <w:lsdException w:name="Table Professional" w:semiHidden="1" w:unhideWhenUsed="1"/>
+    <w:lsdException w:name="Table Subtle 1" w:semiHidden="1" w:unhideWhenUsed="1"/>
+    <w:lsdException w:name="Table Subtle 2" w:semiHidden="1" w:unhideWhenUsed="1"/>
+    <w:lsdException w:name="Table Web 1" w:semiHidden="1" w:unhideWhenUsed="1"/>
+    <w:lsdException w:name="Table Web 2" w:semiHidden="1" w:unhideWhenUsed="1"/>
+    <w:lsdException w:name="Table Web 3" w:semiHidden="1" w:unhideWhenUsed="1"/>
+    <w:lsdException w:name="Balloon Text" w:semiHidden="1" w:unhideWhenUsed="1"/>
+    <w:lsdException w:name="Table Grid" w:uiPriority="39"/>
+    <w:lsdException w:name="Table Theme" w:semiHidden="1" w:unhideWhenUsed="1"/>
+    <w:lsdException w:name="Placeholder Text" w:semiHidden="1"/>
+    <w:lsdException w:name="No Spacing" w:uiPriority="1" w:qFormat="1"/>
+    <w:lsdException w:name="Light Shading" w:uiPriority="60"/>
+    <w:lsdException w:name="Light List" w:uiPriority="61"/>
+    <w:lsdException w:name="Light Grid" w:uiPriority="62"/>
+    <w:lsdException w:name="Medium Shading 1" w:uiPriority="63"/>
+    <w:lsdException w:name="Medium Shading 2" w:uiPriority="64"/>
+    <w:lsdException w:name="Medium List 1" w:uiPriority="65"/>
+    <w:lsdException w:name="Medium List 2" w:uiPriority="66"/>
+    <w:lsdException w:name="Medium Grid 1" w:uiPriority="67"/>
+    <w:lsdException w:name="Medium Grid 2" w:uiPriority="68"/>
+    <w:lsdException w:name="Medium Grid 3" w:uiPriority="69"/>
+    <w:lsdException w:name="Dark List" w:uiPriority="70"/>
+    <w:lsdException w:name="Colorful Shading" w:uiPriority="71"/>
+    <w:lsdException w:name="Colorful List" w:uiPriority="72"/>
+    <w:lsdException w:name="Colorful Grid" w:uiPriority="73"/>
+    <w:lsdException w:name="Light Shading Accent 1" w:uiPriority="60"/>
+    <w:lsdException w:name="Light List Accent 1" w:uiPriority="61"/>
+    <w:lsdException w:name="Light Grid Accent 1" w:uiPriority="62"/>
+    <w:lsdException w:name="Medium Shading 1 Accent 1" w:uiPriority="63"/>
+    <w:lsdException w:name="Medium Shading 2 Accent 1" w:uiPriority="64"/>
+    <w:lsdException w:name="Medium List 1 Accent 1" w:uiPriority="65"/>
+    <w:lsdException w:name="Revision" w:semiHidden="1"/>
+    <w:lsdException w:name="List Paragraph" w:uiPriority="34" w:qFormat="1"/>
+    <w:lsdException w:name="Quote" w:uiPriority="29" w:qFormat="1"/>
+    <w:lsdException w:name="Intense Quote" w:uiPriority="30" w:qFormat="1"/>
+    <w:lsdException w:name="Medium List 2 Accent 1" w:uiPriority="66"/>
+    <w:lsdException w:name="Medium Grid 1 Accent 1" w:uiPriority="67"/>
+    <w:lsdException w:name="Medium Grid 2 Accent 1" w:uiPriority="68"/>
+    <w:lsdException w:name="Medium Grid 3 Accent 1" w:uiPriority="69"/>
+    <w:lsdException w:name="Dark List Accent 1" w:uiPriority="70"/>
+    <w:lsdException w:name="Colorful Shading Accent 1" w:uiPriority="71"/>
+    <w:lsdException w:name="Colorful List Accent 1" w:uiPriority="72"/>
+    <w:lsdException w:name="Colorful Grid Accent 1" w:uiPriority="73"/>
+    <w:lsdException w:name="Light Shading Accent 2" w:uiPriority="60"/>
+    <w:lsdException w:name="Light List Accent 2" w:uiPriority="61"/>
+    <w:lsdException w:name="Light Grid Accent 2" w:uiPriority="62"/>
+    <w:lsdException w:name="Medium Shading 1 Accent 2" w:uiPriority="63"/>
+    <w:lsdException w:name="Medium Shading 2 Accent 2" w:uiPriority="64"/>
+    <w:lsdException w:name="Medium List 1 Accent 2" w:uiPriority="65"/>
+    <w:lsdException w:name="Medium List 2 Accent 2" w:uiPriority="66"/>
+    <w:lsdException w:name="Medium Grid 1 Accent 2" w:uiPriority="67"/>
+    <w:lsdException w:name="Medium Grid 2 Accent 2" w:uiPriority="68"/>
+    <w:lsdException w:name="Medium Grid 3 Accent 2" w:uiPriority="69"/>
+    <w:lsdException w:name="Dark List Accent 2" w:uiPriority="70"/>
+    <w:lsdException w:name="Colorful Shading Accent 2" w:uiPriority="71"/>
+    <w:lsdException w:name="Colorful List Accent 2" w:uiPriority="72"/>
+    <w:lsdException w:name="Colorful Grid Accent 2" w:uiPriority="73"/>
+    <w:lsdException w:name="Light Shading Accent 3" w:uiPriority="60"/>
+    <w:lsdException w:name="Light List Accent 3" w:uiPriority="61"/>
+    <w:lsdException w:name="Light Grid Accent 3" w:uiPriority="62"/>
+    <w:lsdException w:name="Medium Shading 1 Accent 3" w:uiPriority="63"/>
+    <w:lsdException w:name="Medium Shading 2 Accent 3" w:uiPriority="64"/>
+    <w:lsdException w:name="Medium List 1 Accent 3" w:uiPriority="65"/>
+    <w:lsdException w:name="Medium List 2 Accent 3" w:uiPriority="66"/>
+    <w:lsdException w:name="Medium Grid 1 Accent 3" w:uiPriority="67"/>
+    <w:lsdException w:name="Medium Grid 2 Accent 3" w:uiPriority="68"/>
+    <w:lsdException w:name="Medium Grid 3 Accent 3" w:uiPriority="69"/>
+    <w:lsdException w:name="Dark List Accent 3" w:uiPriority="70"/>
+    <w:lsdException w:name="Colorful Shading Accent 3" w:uiPriority="71"/>
+    <w:lsdException w:name="Colorful List Accent 3" w:uiPriority="72"/>
+    <w:lsdException w:name="Colorful Grid Accent 3" w:uiPriority="73"/>
+    <w:lsdException w:name="Light Shading Accent 4" w:uiPriority="60"/>
+    <w:lsdException w:name="Light List Accent 4" w:uiPriority="61"/>
+    <w:lsdException w:name="Light Grid Accent 4" w:uiPriority="62"/>
+    <w:lsdException w:name="Medium Shading 1 Accent 4" w:uiPriority="63"/>
+    <w:lsdException w:name="Medium Shading 2 Accent 4" w:uiPriority="64"/>
+    <w:lsdException w:name="Medium List 1 Accent 4" w:uiPriority="65"/>
+    <w:lsdException w:name="Medium List 2 Accent 4" w:uiPriority="66"/>
+    <w:lsdException w:name="Medium Grid 1 Accent 4" w:uiPriority="67"/>
+    <w:lsdException w:name="Medium Grid 2 Accent 4" w:uiPriority="68"/>
+    <w:lsdException w:name="Medium Grid 3 Accent 4" w:uiPriority="69"/>
+    <w:lsdException w:name="Dark List Accent 4" w:uiPriority="70"/>
+    <w:lsdException w:name="Colorful Shading Accent 4" w:uiPriority="71"/>
+    <w:lsdException w:name="Colorful List Accent 4" w:uiPriority="72"/>
+    <w:lsdException w:name="Colorful Grid Accent 4" w:uiPriority="73"/>
+    <w:lsdException w:name="Light Shading Accent 5" w:uiPriority="60"/>
+    <w:lsdException w:name="Light List Accent 5" w:uiPriority="61"/>
+    <w:lsdException w:name="Light Grid Accent 5" w:uiPriority="62"/>
+    <w:lsdException w:name="Medium Shading 1 Accent 5" w:uiPriority="63"/>
+    <w:lsdException w:name="Medium Shading 2 Accent 5" w:uiPriority="64"/>
+    <w:lsdException w:name="Medium List 1 Accent 5" w:uiPriority="65"/>
+    <w:lsdException w:name="Medium List 2 Accent 5" w:uiPriority="66"/>
+    <w:lsdException w:name="Medium Grid 1 Accent 5" w:uiPriority="67"/>
+    <w:lsdException w:name="Medium Grid 2 Accent 5" w:uiPriority="68"/>
+    <w:lsdException w:name="Medium Grid 3 Accent 5" w:uiPriority="69"/>
+    <w:lsdException w:name="Dark List Accent 5" w:uiPriority="70"/>
+    <w:lsdException w:name="Colorful Shading Accent 5" w:uiPriority="71"/>
+    <w:lsdException w:name="Colorful List Accent 5" w:uiPriority="72"/>
+    <w:lsdException w:name="Colorful Grid Accent 5" w:uiPriority="73"/>
+    <w:lsdException w:name="Light Shading Accent 6" w:uiPriority="60"/>
+    <w:lsdException w:name="Light List Accent 6" w:uiPriority="61"/>
+    <w:lsdException w:name="Light Grid Accent 6" w:uiPriority="62"/>
+    <w:lsdException w:name="Medium Shading 1 Accent 6" w:uiPriority="63"/>
+    <w:lsdException w:name="Medium Shading 2 Accent 6" w:uiPriority="64"/>
+    <w:lsdException w:name="Medium List 1 Accent 6" w:uiPriority="65"/>
+    <w:lsdException w:name="Medium List 2 Accent 6" w:uiPriority="66"/>
+    <w:lsdException w:name="Medium Grid 1 Accent 6" w:uiPriority="67"/>
+    <w:lsdException w:name="Medium Grid 2 Accent 6" w:uiPriority="68"/>
+    <w:lsdException w:name="Medium Grid 3 Accent 6" w:uiPriority="69"/>
+    <w:lsdException w:name="Dark List Accent 6" w:uiPriority="70"/>
+    <w:lsdException w:name="Colorful Shading Accent 6" w:uiPriority="71"/>
+    <w:lsdException w:name="Colorful List Accent 6" w:uiPriority="72"/>
+    <w:lsdException w:name="Colorful Grid Accent 6" w:uiPriority="73"/>
+    <w:lsdException w:name="Subtle Emphasis" w:uiPriority="19" w:qFormat="1"/>
+    <w:lsdException w:name="Intense Emphasis" w:uiPriority="21" w:qFormat="1"/>
+    <w:lsdException w:name="Subtle Reference" w:uiPriority="31" w:qFormat="1"/>
+    <w:lsdException w:name="Intense Reference" w:uiPriority="32" w:qFormat="1"/>
+    <w:lsdException w:name="Book Title" w:uiPriority="33" w:qFormat="1"/>
+    <w:lsdException w:name="Bibliography" w:semiHidden="1" w:uiPriority="37" w:unhideWhenUsed="1"/>
+    <w:lsdException w:name="TOC Heading" w:semiHidden="1" w:uiPriority="39" w:unhideWhenUsed="1" w:qFormat="1"/>
+    <w:lsdException w:name="Plain Table 1" w:uiPriority="41"/>
+    <w:lsdException w:name="Plain Table 2" w:uiPriority="42"/>
+    <w:lsdException w:name="Plain Table 3" w:uiPriority="43"/>
+    <w:lsdException w:name="Plain Table 4" w:uiPriority="44"/>
+    <w:lsdException w:name="Plain Table 5" w:uiPriority="45"/>
+    <w:lsdException w:name="Grid Table Light" w:uiPriority="40"/>
+    <w:lsdException w:name="Grid Table 1 Light" w:uiPriority="46"/>
+    <w:lsdException w:name="Grid Table 2" w:uiPriority="47"/>
+    <w:lsdException w:name="Grid Table 3" w:uiPriority="48"/>
+    <w:lsdException w:name="Grid Table 4" w:uiPriority="49"/>
+    <w:lsdException w:name="Grid Table 5 Dark" w:uiPriority="50"/>
+    <w:lsdException w:name="Grid Table 6 Colorful" w:uiPriority="51"/>
+    <w:lsdException w:name="Grid Table 7 Colorful" w:uiPriority="52"/>
+    <w:lsdException w:name="Grid Table 1 Light Accent 1" w:uiPriority="46"/>
+    <w:lsdException w:name="Grid Table 2 Accent 1" w:uiPriority="47"/>
+    <w:lsdException w:name="Grid Table 3 Accent 1" w:uiPriority="48"/>
+    <w:lsdException w:name="Grid Table 4 Accent 1" w:uiPriority="49"/>
+    <w:lsdException w:name="Grid Table 5 Dark Accent 1" w:uiPriority="50"/>
+    <w:lsdException w:name="Grid Table 6 Colorful Accent 1" w:uiPriority="51"/>
+    <w:lsdException w:name="Grid Table 7 Colorful Accent 1" w:uiPriority="52"/>
+    <w:lsdException w:name="Grid Table 1 Light Accent 2" w:uiPriority="46"/>
+    <w:lsdException w:name="Grid Table 2 Accent 2" w:uiPriority="47"/>
+    <w:lsdException w:name="Grid Table 3 Accent 2" w:uiPriority="48"/>
+    <w:lsdException w:name="Grid Table 4 Accent 2" w:uiPriority="49"/>
+    <w:lsdException w:name="Grid Table 5 Dark Accent 2" w:uiPriority="50"/>
+    <w:lsdException w:name="Grid Table 6 Colorful Accent 2" w:uiPriority="51"/>
+    <w:lsdException w:name="Grid Table 7 Colorful Accent 2" w:uiPriority="52"/>
+    <w:lsdException w:name="Grid Table 1 Light Accent 3" w:uiPriority="46"/>
+    <w:lsdException w:name="Grid Table 2 Accent 3" w:uiPriority="47"/>
+    <w:lsdException w:name="Grid Table 3 Accent 3" w:uiPriority="48"/>
+    <w:lsdException w:name="Grid Table 4 Accent 3" w:uiPriority="49"/>
+    <w:lsdException w:name="Grid Table 5 Dark Accent 3" w:uiPriority="50"/>
+    <w:lsdException w:name="Grid Table 6 Colorful Accent 3" w:uiPriority="51"/>
+    <w:lsdException w:name="Grid Table 7 Colorful Accent 3" w:uiPriority="52"/>
+    <w:lsdException w:name="Grid Table 1 Light Accent 4" w:uiPriority="46"/>
+    <w:lsdException w:name="Grid Table 2 Accent 4" w:uiPriority="47"/>
+    <w:lsdException w:name="Grid Table 3 Accent 4" w:uiPriority="48"/>
+    <w:lsdException w:name="Grid Table 4 Accent 4" w:uiPriority="49"/>
+    <w:lsdException w:name="Grid Table 5 Dark Accent 4" w:uiPriority="50"/>
+    <w:lsdException w:name="Grid Table 6 Colorful Accent 4" w:uiPriority="51"/>
+    <w:lsdException w:name="Grid Table 7 Colorful Accent 4" w:uiPriority="52"/>
+    <w:lsdException w:name="Grid Table 1 Light Accent 5" w:uiPriority="46"/>
+    <w:lsdException w:name="Grid Table 2 Accent 5" w:uiPriority="47"/>
+    <w:lsdException w:name="Grid Table 3 Accent 5" w:uiPriority="48"/>
+    <w:lsdException w:name="Grid Table 4 Accent 5" w:uiPriority="49"/>
+    <w:lsdException w:name="Grid Table 5 Dark Accent 5" w:uiPriority="50"/>
+    <w:lsdException w:name="Grid Table 6 Colorful Accent 5" w:uiPriority="51"/>
+    <w:lsdException w:name="Grid Table 7 Colorful Accent 5" w:uiPriority="52"/>
+    <w:lsdException w:name="Grid Table 1 Light Accent 6" w:uiPriority="46"/>
+    <w:lsdException w:name="Grid Table 2 Accent 6" w:uiPriority="47"/>
+    <w:lsdException w:name="Grid Table 3 Accent 6" w:uiPriority="48"/>
+    <w:lsdException w:name="Grid Table 4 Accent 6" w:uiPriority="49"/>
+    <w:lsdException w:name="Grid Table 5 Dark Accent 6" w:uiPriority="50"/>
+    <w:lsdException w:name="Grid Table 6 Colorful Accent 6" w:uiPriority="51"/>
+    <w:lsdException w:name="Grid Table 7 Colorful Accent 6" w:uiPriority="52"/>
+    <w:lsdException w:name="List Table 1 Light" w:uiPriority="46"/>
+    <w:lsdException w:name="List Table 2" w:uiPriority="47"/>
+    <w:lsdException w:name="List Table 3" w:uiPriority="48"/>
+    <w:lsdException w:name="List Table 4" w:uiPriority="49"/>
+    <w:lsdException w:name="List Table 5 Dark" w:uiPriority="50"/>
+    <w:lsdException w:name="List Table 6 Colorful" w:uiPriority="51"/>
+    <w:lsdException w:name="List Table 7 Colorful" w:uiPriority="52"/>
+    <w:lsdException w:name="List Table 1 Light Accent 1" w:uiPriority="46"/>
+    <w:lsdException w:name="List Table 2 Accent 1" w:uiPriority="47"/>
+    <w:lsdException w:name="List Table 3 Accent 1" w:uiPriority="48"/>
+    <w:lsdException w:name="List Table 4 Accent 1" w:uiPriority="49"/>
+    <w:lsdException w:name="List Table 5 Dark Accent 1" w:uiPriority="50"/>
+    <w:lsdException w:name="List Table 6 Colorful Accent 1" w:uiPriority="51"/>
+    <w:lsdException w:name="List Table 7 Colorful Accent 1" w:uiPriority="52"/>
+    <w:lsdException w:name="List Table 1 Light Accent 2" w:uiPriority="46"/>
+    <w:lsdException w:name="List Table 2 Accent 2" w:uiPriority="47"/>
+    <w:lsdException w:name="List Table 3 Accent 2" w:uiPriority="48"/>
+    <w:lsdException w:name="List Table 4 Accent 2" w:uiPriority="49"/>
+    <w:lsdException w:name="List Table 5 Dark Accent 2" w:uiPriority="50"/>
+    <w:lsdException w:name="List Table 6 Colorful Accent 2" w:uiPriority="51"/>
+    <w:lsdException w:name="List Table 7 Colorful Accent 2" w:uiPriority="52"/>
+    <w:lsdException w:name="List Table 1 Light Accent 3" w:uiPriority="46"/>
+    <w:lsdException w:name="List Table 2 Accent 3" w:uiPriority="47"/>
+    <w:lsdException w:name="List Table 3 Accent 3" w:uiPriority="48"/>
+    <w:lsdException w:name="List Table 4 Accent 3" w:uiPriority="49"/>
+    <w:lsdException w:name="List Table 5 Dark Accent 3" w:uiPriority="50"/>
+    <w:lsdException w:name="List Table 6 Colorful Accent 3" w:uiPriority="51"/>
+    <w:lsdException w:name="List Table 7 Colorful Accent 3" w:uiPriority="52"/>
+    <w:lsdException w:name="List Table 1 Light Accent 4" w:uiPriority="46"/>
+    <w:lsdException w:name="List Table 2 Accent 4" w:uiPriority="47"/>
+    <w:lsdException w:name="List Table 3 Accent 4" w:uiPriority="48"/>
+    <w:lsdException w:name="List Table 4 Accent 4" w:uiPriority="49"/>
+    <w:lsdException w:name="List Table 5 Dark Accent 4" w:uiPriority="50"/>
+    <w:lsdException w:name="List Table 6 Colorful Accent 4" w:uiPriority="51"/>
+    <w:lsdException w:name="List Table 7 Colorful Accent 4" w:uiPriority="52"/>
+    <w:lsdException w:name="List Table 1 Light Accent 5" w:uiPriority="46"/>
+    <w:lsdException w:name="List Table 2 Accent 5" w:uiPriority="47"/>
+    <w:lsdException w:name="List Table 3 Accent 5" w:uiPriority="48"/>
+    <w:lsdException w:name="List Table 4 Accent 5" w:uiPriority="49"/>
+    <w:lsdException w:name="List Table 5 Dark Accent 5" w:uiPriority="50"/>
+    <w:lsdException w:name="List Table 6 Colorful Accent 5" w:uiPriority="51"/>
+    <w:lsdException w:name="List Table 7 Colorful Accent 5" w:uiPriority="52"/>
+    <w:lsdException w:name="List Table 1 Light Accent 6" w:uiPriority="46"/>
+    <w:lsdException w:name="List Table 2 Accent 6" w:uiPriority="47"/>
+    <w:lsdException w:name="List Table 3 Accent 6" w:uiPriority="48"/>
+    <w:lsdException w:name="List Table 4 Accent 6" w:uiPriority="49"/>
+    <w:lsdException w:name="List Table 5 Dark Accent 6" w:uiPriority="50"/>
+    <w:lsdException w:name="List Table 6 Colorful Accent 6" w:uiPriority="51"/>
+    <w:lsdException w:name="List Table 7 Colorful Accent 6" w:uiPriority="52"/>
+    <w:lsdException w:name="Mention" w:semiHidden="1" w:unhideWhenUsed="1"/>
+    <w:lsdException w:name="Smart Hyperlink" w:semiHidden="1" w:unhideWhenUsed="1"/>
+    <w:lsdException w:name="Hashtag" w:semiHidden="1" w:unhideWhenUsed="1"/>
+    <w:lsdException w:name="Unresolved Mention" w:semiHidden="1" w:unhideWhenUsed="1"/>
+    <w:lsdException w:name="Smart Link" w:semiHidden="1" w:unhideWhenUsed="1"/>
+  </w:latentStyles>
+  <w:style w:type="paragraph" w:default="1" w:styleId="Normal">
+    <w:name w:val="Normal"/>
+    <w:qFormat/>
+  </w:style>
+  <w:style w:type="character" w:default="1" w:styleId="DefaultParagraphFont">
+    <w:name w:val="Default Paragraph Font"/>
+    <w:uiPriority w:val="1"/>
+    <w:semiHidden/>
+    <w:unhideWhenUsed/>
+  </w:style>
+  <w:style w:type="table" w:default="1" w:styleId="TableNormal">
+    <w:name w:val="Normal Table"/>
+    <w:uiPriority w:val="99"/>
+    <w:semiHidden/>
+    <w:unhideWhenUsed/>
+    <w:tblPr>
+      <w:tblInd w:w="0" w:type="dxa"/>
+      <w:tblCellMar>
+        <w:top w:w="0" w:type="dxa"/>
+        <w:left w:w="108" w:type="dxa"/>
+        <w:bottom w:w="0" w:type="dxa"/>
+        <w:right w:w="108" w:type="dxa"/>
+      </w:tblCellMar>
+    </w:tblPr>
+  </w:style>
+  <w:style w:type="numbering" w:default="1" w:styleId="NoList">
+    <w:name w:val="No List"/>
+    <w:uiPriority w:val="99"/>
+    <w:semiHidden/>
+    <w:unhideWhenUsed/>
+  </w:style>
+  <w:style w:type="character" w:styleId="PlaceholderText">
+    <w:name w:val="Placeholder Text"/>
+    <w:basedOn w:val="DefaultParagraphFont"/>
+    <w:uiPriority w:val="99"/>
+    <w:semiHidden/>
+    <w:rsid w:val="0084204F"/>
+    <w:rPr>
+      <w:color w:val="666666"/>
+    </w:rPr>
+  </w:style>
+</w:styles>
+</file>
+
+<file path=word/glossary/webSettings.xml><?xml version="1.0" encoding="utf-8"?>
+<w:webSettings xmlns:mc="http://schemas.openxmlformats.org/markup-compatibility/2006" xmlns:r="http://schemas.openxmlformats.org/officeDocument/2006/relationships" xmlns:w="http://schemas.openxmlformats.org/wordprocessingml/2006/main" xmlns:w14="http://schemas.microsoft.com/office/word/2010/wordml" xmlns:w15="http://schemas.microsoft.com/office/word/2012/wordml" xmlns:w16cex="http://schemas.microsoft.com/office/word/2018/wordml/cex" xmlns:w16cid="http://schemas.microsoft.com/office/word/2016/wordml/cid" xmlns:w16="http://schemas.microsoft.com/office/word/2018/wordml" xmlns:w16du="http://schemas.microsoft.com/office/word/2023/wordml/word16du" xmlns:w16sdtdh="http://schemas.microsoft.com/office/word/2020/wordml/sdtdatahash" xmlns:w16sdtfl="http://schemas.microsoft.com/office/word/2024/wordml/sdtformatlock" xmlns:w16se="http://schemas.microsoft.com/office/word/2015/wordml/symex" mc:Ignorable="w14 w15 w16se w16cid w16 w16cex w16sdtdh w16sdtfl w16du">
+  <w:optimizeForBrowser/>
+  <w:allowPNG/>
+</w:webSettings>
 </file>
 
 <file path=word/theme/theme1.xml><?xml version="1.0" encoding="utf-8"?>
@@ -1696,4 +4203,29 @@
     </a:ext>
   </a:extLst>
 </a:theme>
+</file>
+
+<file path=word/webextensions/taskpanes.xml><?xml version="1.0" encoding="utf-8"?>
+<wetp:taskpanes xmlns:wetp="http://schemas.microsoft.com/office/webextensions/taskpanes/2010/11">
+  <wetp:taskpane dockstate="right" visibility="0" width="350" row="0">
+    <wetp:webextensionref xmlns:r="http://schemas.openxmlformats.org/officeDocument/2006/relationships" r:id="rId1"/>
+  </wetp:taskpane>
+</wetp:taskpanes>
+</file>
+
+<file path=word/webextensions/webextension1.xml><?xml version="1.0" encoding="utf-8"?>
+<we:webextension xmlns:we="http://schemas.microsoft.com/office/webextensions/webextension/2010/11" id="{10961AB6-C086-45C3-AC2A-7BFBBA714FC1}">
+  <we:reference id="wa104382081" version="1.55.1.0" store="en-US" storeType="OMEX"/>
+  <we:alternateReferences>
+    <we:reference id="WA104382081" version="1.55.1.0" store="WA104382081" storeType="OMEX"/>
+  </we:alternateReferences>
+  <we:properties>
+    <we:property name="MENDELEY_BIBLIOGRAPHY_IS_DIRTY" value="true"/>
+    <we:property name="MENDELEY_BIBLIOGRAPHY_LAST_MODIFIED" value="1778586340449"/>
+    <we:property name="MENDELEY_CITATIONS" value="[{&quot;citationID&quot;:&quot;MENDELEY_CITATION_2079b87b-67f9-4a66-b0db-ef8bb10146ab&quot;,&quot;properties&quot;:{&quot;noteIndex&quot;:0},&quot;isEdited&quot;:false,&quot;manualOverride&quot;:{&quot;isManuallyOverridden&quot;:false,&quot;citeprocText&quot;:&quot;(Gehirn Inc., 2026)&quot;,&quot;manualOverrideText&quot;:&quot;&quot;},&quot;citationTag&quot;:&quot;MENDELEY_CITATION_v3_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&quot;,&quot;citationItems&quot;:[{&quot;id&quot;:&quot;d433b857-53be-3bee-b10b-cee97cab9c7b&quot;,&quot;itemData&quot;:{&quot;type&quot;:&quot;article&quot;,&quot;id&quot;:&quot;d433b857-53be-3bee-b10b-cee97cab9c7b&quot;,&quot;title&quot;:&quot;NERV Disaster Prevention&quot;,&quot;author&quot;:[{&quot;family&quot;:&quot;Gehirn Inc.&quot;,&quot;given&quot;:&quot;&quot;,&quot;parse-names&quot;:false,&quot;dropping-particle&quot;:&quot;&quot;,&quot;non-dropping-particle&quot;:&quot;&quot;}],&quot;accessed&quot;:{&quot;date-parts&quot;:[[2026,5,11]]},&quot;URL&quot;:&quot;https://play.google.com/store/apps/details?id=app.nerv&amp;hl=en&quot;,&quot;issued&quot;:{&quot;date-parts&quot;:[[2026]]},&quot;container-title-short&quot;:&quot;&quot;},&quot;isTemporary&quot;:false}]}]"/>
+    <we:property name="MENDELEY_CITATIONS_STYLE" value="{&quot;id&quot;:&quot;https://www.zotero.org/styles/apa&quot;,&quot;title&quot;:&quot;APA Style 7th edition&quot;,&quot;format&quot;:&quot;author-date&quot;,&quot;defaultLocale&quot;:null,&quot;isLocaleCodeValid&quot;:true}"/>
+  </we:properties>
+  <we:bindings/>
+  <we:snapshot xmlns:r="http://schemas.openxmlformats.org/officeDocument/2006/relationships"/>
+</we:webextension>
 </file>
</xml_diff>

<commit_message>
Update system design doc
</commit_message>
<xml_diff>
--- a/System design.docx
+++ b/System design.docx
@@ -28,7 +28,7 @@
         <w:rPr>
           <w:lang w:val="en-AT"/>
         </w:rPr>
-        <w:t>The project is an Android mobile application for local disaster preparedness and response. The app combines real-time emergency information with gamified learning features to help users become better prepared for disasters in their local community. The core idea is to make preparedness more accessible, engaging, and practical by combining live information, emergency guidance, checklists, quizzes, badges, and local resources in one mobile application.</w:t>
+        <w:t>The project is an Android mobile application for local disaster preparedness and response. It combines real-time emergency information with gamified learning features to make disaster preparedness more accessible, engaging, and practical.</w:t>
       </w:r>
     </w:p>
     <w:p>
@@ -49,32 +49,7 @@
           <w:bCs/>
           <w:lang w:val="en-AT"/>
         </w:rPr>
-        <w:t>“Developing a Mobile App for Local Disaster Preparedness and Response.”</w:t>
-      </w:r>
-      <w:r>
-        <w:rPr>
-          <w:lang w:val="en-AT"/>
-        </w:rPr>
-        <w:t xml:space="preserve"> The target users are young to middle-aged adults in Austria who want quick access to information about disasters, weather risks, local alerts, emergency numbers, and preparedness guidance. </w:t>
-      </w:r>
-      <w:r>
-        <w:rPr>
-          <w:lang w:val="en-AT"/>
-        </w:rPr>
-        <w:t xml:space="preserve">This thought is supported by the fact that this age group would normally have younger children at home, which could motivate the reasons for preparedness and learning. </w:t>
-      </w:r>
-    </w:p>
-    <w:p>
-      <w:pPr>
-        <w:rPr>
-          <w:lang w:val="en-AT"/>
-        </w:rPr>
-      </w:pPr>
-      <w:r>
-        <w:rPr>
-          <w:lang w:val="en-AT"/>
-        </w:rPr>
-        <w:t xml:space="preserve">The domain of the project is </w:t>
+        <w:t>“Developing a Mobile App for Local Disaster Preparedness and Response”</w:t>
       </w:r>
       <w:r>
         <w:rPr>
@@ -82,27 +57,26 @@
           <w:bCs/>
           <w:lang w:val="en-AT"/>
         </w:rPr>
-        <w:t>local disaster preparedness and response</w:t>
-      </w:r>
-      <w:r>
-        <w:rPr>
-          <w:lang w:val="en-AT"/>
-        </w:rPr>
-        <w:t xml:space="preserve">, implemented as a </w:t>
-      </w:r>
-      <w:r>
-        <w:rPr>
-          <w:b/>
-          <w:bCs/>
-          <w:lang w:val="en-AT"/>
-        </w:rPr>
-        <w:t>React Native Android mobile app</w:t>
-      </w:r>
-      <w:r>
-        <w:rPr>
-          <w:lang w:val="en-AT"/>
-        </w:rPr>
-        <w:t>. The app is designed around two main needs of the domain:</w:t>
+        <w:t>.</w:t>
+      </w:r>
+      <w:r>
+        <w:rPr>
+          <w:lang w:val="en-AT"/>
+        </w:rPr>
+        <w:t xml:space="preserve"> Its target users are young to middle-aged adults in Austria who want quick access to disaster information, weather risks, local alerts, emergency numbers, and preparedness guidance. This group may often have young children at home, which can increase the motivation to prepare and learn.</w:t>
+      </w:r>
+    </w:p>
+    <w:p>
+      <w:pPr>
+        <w:rPr>
+          <w:lang w:val="en-AT"/>
+        </w:rPr>
+      </w:pPr>
+      <w:r>
+        <w:rPr>
+          <w:lang w:val="en-AT"/>
+        </w:rPr>
+        <w:t>The project domain is local disaster preparedness and response, implemented as a React Native Android app. The app addresses two main needs:</w:t>
       </w:r>
     </w:p>
     <w:p>
@@ -110,7 +84,7 @@
         <w:pStyle w:val="ListParagraph"/>
         <w:numPr>
           <w:ilvl w:val="0"/>
-          <w:numId w:val="2"/>
+          <w:numId w:val="6"/>
         </w:numPr>
         <w:rPr>
           <w:lang w:val="en-AT"/>
@@ -120,7 +94,7 @@
         <w:rPr>
           <w:lang w:val="en-AT"/>
         </w:rPr>
-        <w:t>First, users need reliable and location-relevant information during potential emergencies. This includes weather conditions, alerts, air quality, radiation data, and access to emergency numbers or local resources.</w:t>
+        <w:t>Users need reliable, location-relevant emergency information, including weather conditions, alerts, air quality, radiation data, emergency numbers, and local resources.</w:t>
       </w:r>
     </w:p>
     <w:p>
@@ -128,7 +102,7 @@
         <w:pStyle w:val="ListParagraph"/>
         <w:numPr>
           <w:ilvl w:val="0"/>
-          <w:numId w:val="2"/>
+          <w:numId w:val="6"/>
         </w:numPr>
         <w:rPr>
           <w:lang w:val="en-AT"/>
@@ -138,7 +112,7 @@
         <w:rPr>
           <w:lang w:val="en-AT"/>
         </w:rPr>
-        <w:t>Second, users need to build preparedness before an emergency happens. This is supported through a learning mode with checklists, short reading material, quizzes, and preparedness badges.</w:t>
+        <w:t>Users need to build preparedness before emergencies through checklists, short learning content, quizzes, and preparedness badges.</w:t>
       </w:r>
     </w:p>
     <w:p>
@@ -171,341 +145,165 @@
         <w:rPr>
           <w:lang w:val="en-US"/>
         </w:rPr>
-        <w:t>The application follows a mobile-first architecture based on React Native and Expo. This choice supports efficient Android app development while still allowing access to important mobile features such as GPS location, device notifications, local storage, and background activity.</w:t>
-      </w:r>
-    </w:p>
-    <w:p>
-      <w:pPr>
+        <w:t>The application follows a mobile-first architecture based on React Native and Expo. This supports efficient Android development and access to mobile features such as GPS, notifications, local storage, and background activity. Although the stack also supports iOS, development is limited to Android because no iOS device is available.</w:t>
+      </w:r>
+    </w:p>
+    <w:p>
+      <w:pPr>
+        <w:keepNext/>
+      </w:pPr>
+      <w:r>
         <w:rPr>
           <w:lang w:val="en-US"/>
         </w:rPr>
-      </w:pPr>
+        <w:t>The app is structured around the mobile frontend, local device services, local data storage, and external public APIs. The React Native frontend handles the user interface, navigation, app</w:t>
+      </w:r>
       <w:r>
         <w:rPr>
           <w:lang w:val="en-US"/>
         </w:rPr>
-        <w:t>The app is structured around the mobile frontend, local device services, local data storage, and external public APIs. The React Native frontend handles the user interface, navigation, app state, and interaction logic. Expo is used to simplify development, testing, and access to device features.</w:t>
-      </w:r>
-    </w:p>
-    <w:p>
-      <w:pPr>
-        <w:rPr>
-          <w:lang w:val="en-AT"/>
-        </w:rPr>
-      </w:pPr>
-      <w:r>
-        <w:rPr>
-          <w:lang w:val="en-AT"/>
-        </w:rPr>
-        <w:t xml:space="preserve">The overall structure can be described as </w:t>
-      </w:r>
-      <w:r>
-        <w:rPr>
-          <w:lang w:val="en-AT"/>
-        </w:rPr>
-        <w:t>in Figure 1.</w:t>
-      </w:r>
-    </w:p>
-    <w:p>
-      <w:pPr>
-        <w:rPr>
-          <w:lang w:val="en-AT"/>
-        </w:rPr>
-      </w:pPr>
-      <w:r>
-        <w:rPr>
-          <w:highlight w:val="darkCyan"/>
-          <w:lang w:val="en-AT"/>
-        </w:rPr>
-        <w:t>User</w:t>
-      </w:r>
-      <w:r>
-        <w:rPr>
-          <w:highlight w:val="darkCyan"/>
-          <w:lang w:val="en-AT"/>
-        </w:rPr>
-        <w:br/>
-        <w:t xml:space="preserve"> ↓</w:t>
-      </w:r>
-      <w:r>
-        <w:rPr>
-          <w:highlight w:val="darkCyan"/>
-          <w:lang w:val="en-AT"/>
-        </w:rPr>
-        <w:br/>
-        <w:t>React Native / Expo Android App</w:t>
-      </w:r>
-      <w:r>
-        <w:rPr>
-          <w:highlight w:val="darkCyan"/>
-          <w:lang w:val="en-AT"/>
-        </w:rPr>
-        <w:br/>
-        <w:t xml:space="preserve"> ↓</w:t>
-      </w:r>
-      <w:r>
-        <w:rPr>
-          <w:highlight w:val="darkCyan"/>
-          <w:lang w:val="en-AT"/>
-        </w:rPr>
-        <w:br/>
-        <w:t>UI Screens, Navigation, Local State</w:t>
-      </w:r>
-      <w:r>
-        <w:rPr>
-          <w:highlight w:val="darkCyan"/>
-          <w:lang w:val="en-AT"/>
-        </w:rPr>
-        <w:br/>
-        <w:t xml:space="preserve"> ↓</w:t>
-      </w:r>
-      <w:r>
-        <w:rPr>
-          <w:highlight w:val="darkCyan"/>
-          <w:lang w:val="en-AT"/>
-        </w:rPr>
-        <w:br/>
-        <w:t>Device Services</w:t>
-      </w:r>
-      <w:r>
-        <w:rPr>
-          <w:highlight w:val="darkCyan"/>
-          <w:lang w:val="en-AT"/>
-        </w:rPr>
-        <w:br/>
-        <w:t>- GPS location</w:t>
-      </w:r>
-      <w:r>
-        <w:rPr>
-          <w:highlight w:val="darkCyan"/>
-          <w:lang w:val="en-AT"/>
-        </w:rPr>
-        <w:br/>
-      </w:r>
-      <w:r>
-        <w:rPr>
-          <w:highlight w:val="darkCyan"/>
+        <w:t xml:space="preserve"> </w:t>
+      </w:r>
+      <w:r>
+        <w:rPr>
+          <w:lang w:val="en-US"/>
+        </w:rPr>
+        <w:t>state, and interaction logic, while Expo simplifies development, testing, and access to device features. The overall structure is shown in Figure 1.</w:t>
+      </w:r>
+      <w:r>
+        <w:rPr>
+          <w:lang w:val="en-AT"/>
+        </w:rPr>
+        <w:drawing>
+          <wp:inline distT="0" distB="0" distL="0" distR="0" wp14:anchorId="6C8CE050" wp14:editId="48E0DD37">
+            <wp:extent cx="5374915" cy="2890520"/>
+            <wp:effectExtent l="0" t="0" r="0" b="0"/>
+            <wp:docPr id="1531177476" name="Picture 1"/>
+            <wp:cNvGraphicFramePr>
+              <a:graphicFrameLocks xmlns:a="http://schemas.openxmlformats.org/drawingml/2006/main" noChangeAspect="1"/>
+            </wp:cNvGraphicFramePr>
+            <a:graphic xmlns:a="http://schemas.openxmlformats.org/drawingml/2006/main">
+              <a:graphicData uri="http://schemas.openxmlformats.org/drawingml/2006/picture">
+                <pic:pic xmlns:pic="http://schemas.openxmlformats.org/drawingml/2006/picture">
+                  <pic:nvPicPr>
+                    <pic:cNvPr id="1531177476" name=""/>
+                    <pic:cNvPicPr/>
+                  </pic:nvPicPr>
+                  <pic:blipFill>
+                    <a:blip r:embed="rId5"/>
+                    <a:stretch>
+                      <a:fillRect/>
+                    </a:stretch>
+                  </pic:blipFill>
+                  <pic:spPr>
+                    <a:xfrm>
+                      <a:off x="0" y="0"/>
+                      <a:ext cx="5389887" cy="2898572"/>
+                    </a:xfrm>
+                    <a:prstGeom prst="rect">
+                      <a:avLst/>
+                    </a:prstGeom>
+                  </pic:spPr>
+                </pic:pic>
+              </a:graphicData>
+            </a:graphic>
+          </wp:inline>
+        </w:drawing>
+      </w:r>
+    </w:p>
+    <w:p>
+      <w:pPr>
+        <w:pStyle w:val="Caption"/>
+        <w:rPr>
+          <w:lang w:val="en-AT"/>
+        </w:rPr>
+      </w:pPr>
+      <w:r>
+        <w:rPr>
+          <w:lang w:val="en-US"/>
+        </w:rPr>
+        <w:t xml:space="preserve">Figure </w:t>
+      </w:r>
+      <w:r>
+        <w:fldChar w:fldCharType="begin"/>
+      </w:r>
+      <w:r>
+        <w:rPr>
+          <w:lang w:val="en-US"/>
+        </w:rPr>
+        <w:instrText xml:space="preserve"> SEQ Figure \* ARABIC </w:instrText>
+      </w:r>
+      <w:r>
+        <w:fldChar w:fldCharType="separate"/>
+      </w:r>
+      <w:r>
+        <w:rPr>
+          <w:noProof/>
+          <w:lang w:val="en-US"/>
+        </w:rPr>
+        <w:t>1</w:t>
+      </w:r>
+      <w:r>
+        <w:fldChar w:fldCharType="end"/>
+      </w:r>
+      <w:r>
+        <w:rPr>
+          <w:lang w:val="en-US"/>
+        </w:rPr>
+        <w:t>: System architecture diagram</w:t>
+      </w:r>
+    </w:p>
+    <w:p>
+      <w:pPr>
+        <w:rPr>
+          <w:lang w:val="en-AT"/>
+        </w:rPr>
+      </w:pPr>
+      <w:r>
+        <w:rPr>
           <w:lang w:val="en-AT"/>
         </w:rPr>
         <w:lastRenderedPageBreak/>
-        <w:t>- Local notifications</w:t>
-      </w:r>
-      <w:r>
-        <w:rPr>
-          <w:highlight w:val="darkCyan"/>
-          <w:lang w:val="en-AT"/>
-        </w:rPr>
-        <w:br/>
-        <w:t>- Background sync</w:t>
-      </w:r>
-      <w:r>
-        <w:rPr>
-          <w:highlight w:val="darkCyan"/>
-          <w:lang w:val="en-AT"/>
-        </w:rPr>
-        <w:br/>
-      </w:r>
-      <w:r>
-        <w:rPr>
-          <w:highlight w:val="darkCyan"/>
-          <w:lang w:val="en-AT"/>
-        </w:rPr>
-        <w:br/>
-        <w:t xml:space="preserve"> ↓</w:t>
-      </w:r>
-      <w:r>
-        <w:rPr>
-          <w:highlight w:val="darkCyan"/>
-          <w:lang w:val="en-AT"/>
-        </w:rPr>
-        <w:br/>
-        <w:t>Local SQLite Database</w:t>
-      </w:r>
-      <w:r>
-        <w:rPr>
-          <w:highlight w:val="darkCyan"/>
-          <w:lang w:val="en-AT"/>
-        </w:rPr>
-        <w:br/>
-        <w:t>- Saved locations</w:t>
-      </w:r>
-      <w:r>
-        <w:rPr>
-          <w:highlight w:val="darkCyan"/>
-          <w:lang w:val="en-AT"/>
-        </w:rPr>
-        <w:br/>
-        <w:t>- Preparedness progress</w:t>
-      </w:r>
-      <w:r>
-        <w:rPr>
-          <w:highlight w:val="darkCyan"/>
-          <w:lang w:val="en-AT"/>
-        </w:rPr>
-        <w:br/>
-        <w:t>- Quiz results</w:t>
-      </w:r>
-      <w:r>
-        <w:rPr>
-          <w:highlight w:val="darkCyan"/>
-          <w:lang w:val="en-AT"/>
-        </w:rPr>
-        <w:br/>
-        <w:t>- Badge status</w:t>
-      </w:r>
-      <w:r>
-        <w:rPr>
-          <w:highlight w:val="darkCyan"/>
-          <w:lang w:val="en-AT"/>
-        </w:rPr>
-        <w:br/>
-        <w:t>- Cached alert/weather data</w:t>
-      </w:r>
-      <w:r>
-        <w:rPr>
-          <w:highlight w:val="darkCyan"/>
-          <w:lang w:val="en-AT"/>
-        </w:rPr>
-        <w:br/>
-      </w:r>
-      <w:r>
-        <w:rPr>
-          <w:highlight w:val="darkCyan"/>
-          <w:lang w:val="en-AT"/>
-        </w:rPr>
-        <w:br/>
-        <w:t xml:space="preserve"> ↓</w:t>
-      </w:r>
-      <w:r>
-        <w:rPr>
-          <w:highlight w:val="darkCyan"/>
-          <w:lang w:val="en-AT"/>
-        </w:rPr>
-        <w:br/>
-        <w:t>External REST APIs</w:t>
-      </w:r>
-      <w:r>
-        <w:rPr>
-          <w:highlight w:val="darkCyan"/>
-          <w:lang w:val="en-AT"/>
-        </w:rPr>
-        <w:br/>
-        <w:t>- Weather data</w:t>
-      </w:r>
-      <w:r>
-        <w:rPr>
-          <w:highlight w:val="darkCyan"/>
-          <w:lang w:val="en-AT"/>
-        </w:rPr>
-        <w:br/>
-        <w:t>- Disaster alerts</w:t>
-      </w:r>
-      <w:r>
-        <w:rPr>
-          <w:highlight w:val="darkCyan"/>
-          <w:lang w:val="en-AT"/>
-        </w:rPr>
-        <w:br/>
-        <w:t>- Air quality data</w:t>
-      </w:r>
-      <w:r>
-        <w:rPr>
-          <w:highlight w:val="darkCyan"/>
-          <w:lang w:val="en-AT"/>
-        </w:rPr>
-        <w:br/>
-        <w:t>- Radiation information</w:t>
-      </w:r>
-      <w:r>
-        <w:rPr>
-          <w:highlight w:val="darkCyan"/>
-          <w:lang w:val="en-AT"/>
-        </w:rPr>
-        <w:br/>
-        <w:t>- Local public resources</w:t>
-      </w:r>
-    </w:p>
-    <w:p>
-      <w:pPr>
-        <w:rPr>
-          <w:lang w:val="en-AT"/>
-        </w:rPr>
-      </w:pPr>
-    </w:p>
-    <w:p>
-      <w:pPr>
-        <w:rPr>
-          <w:lang w:val="en-AT"/>
-        </w:rPr>
-      </w:pPr>
-      <w:r>
-        <w:rPr>
-          <w:lang w:val="en-AT"/>
-        </w:rPr>
-        <w:t>The local SQLite database is used to store information that should remain available between app sessions. This includes saved custom locations, preparedness checklist progress, quiz results, badge status, cached dashboard data, and notification-related settings. Local storage is important for this domain because users may need access to previously loaded information even when the network connection is unstable.</w:t>
-      </w:r>
-    </w:p>
-    <w:p>
-      <w:pPr>
-        <w:rPr>
-          <w:lang w:val="en-AT"/>
-        </w:rPr>
-      </w:pPr>
-      <w:r>
-        <w:rPr>
-          <w:lang w:val="en-AT"/>
-        </w:rPr>
-        <w:t xml:space="preserve">The app uses GPS sensor data to provide location-based information. When the user selects the location </w:t>
-      </w:r>
-      <w:r>
-        <w:rPr>
-          <w:lang w:val="en-AT"/>
-        </w:rPr>
-        <w:t>(current or custom)</w:t>
-      </w:r>
-      <w:r>
-        <w:rPr>
-          <w:lang w:val="en-AT"/>
-        </w:rPr>
-        <w:t xml:space="preserve">, the app reads the device location and uses it to request relevant data from external REST APIs. </w:t>
-      </w:r>
-    </w:p>
-    <w:p>
-      <w:pPr>
-        <w:rPr>
-          <w:lang w:val="en-AT"/>
-        </w:rPr>
-      </w:pPr>
-      <w:r>
-        <w:rPr>
-          <w:lang w:val="en-AT"/>
-        </w:rPr>
-        <w:t>Device notifications are used for two main purposes: alert notifications and preparedness reminders. Alert notifications inform users when relevant weather or disaster alerts are detected for their selected area. Preparedness reminders notify users when their preparedness status has expired and should be reviewed again.</w:t>
-      </w:r>
-      <w:r>
-        <w:rPr>
-          <w:lang w:val="en-AT"/>
-        </w:rPr>
-        <w:t xml:space="preserve"> Notifications in the background </w:t>
-      </w:r>
-      <w:r>
-        <w:rPr>
-          <w:lang w:val="en-AT"/>
-        </w:rPr>
-        <w:t>support the goal of keeping users informed without requiring them to manually refresh the app. However, this functionality depends on mobile operating system restrictions and Expo capabilities, so it is treated as an important but potentially adjustable feature.</w:t>
-      </w:r>
-    </w:p>
-    <w:p>
-      <w:pPr>
-        <w:rPr>
-          <w:lang w:val="en-AT"/>
-        </w:rPr>
-      </w:pPr>
-      <w:r>
-        <w:rPr>
-          <w:lang w:val="en-AT"/>
-        </w:rPr>
-        <w:t xml:space="preserve">External REST APIs provide the real-time and public information used by the dashboard and national overview. These APIs may include weather data, local disaster alerts, air quality data, radiation information, and public emergency resources. Since the app depends on third-party data sources, the system also includes a license and credits section where providers such as </w:t>
+        <w:t>A local SQLite database stores data that should persist between sessions, including locations, preparedness progress, badge status, and cached dashboard data. This is important because users may need access to previously loaded information when the network connection is unstable.</w:t>
+      </w:r>
+    </w:p>
+    <w:p>
+      <w:pPr>
+        <w:rPr>
+          <w:lang w:val="en-AT"/>
+        </w:rPr>
+      </w:pPr>
+      <w:r>
+        <w:rPr>
+          <w:lang w:val="en-AT"/>
+        </w:rPr>
+        <w:t>GPS data is used to provide location-based information. When users choose their current or a custom location, the app uses that location to request relevant data from external REST APIs.</w:t>
+      </w:r>
+    </w:p>
+    <w:p>
+      <w:pPr>
+        <w:rPr>
+          <w:lang w:val="en-AT"/>
+        </w:rPr>
+      </w:pPr>
+      <w:r>
+        <w:rPr>
+          <w:lang w:val="en-AT"/>
+        </w:rPr>
+        <w:t>Device notifications are used for alerts and preparedness reminders. Alerts inform users about relevant weather or disaster events, while reminders notify them when their preparedness status has expired. Background notifications help users stay informed without manually refreshing the app, but this feature may be adjusted depending on mobile OS restrictions and Expo capabilities.</w:t>
+      </w:r>
+    </w:p>
+    <w:p>
+      <w:pPr>
+        <w:rPr>
+          <w:lang w:val="en-AT"/>
+        </w:rPr>
+      </w:pPr>
+      <w:r>
+        <w:rPr>
+          <w:lang w:val="en-AT"/>
+        </w:rPr>
+        <w:t xml:space="preserve">External REST APIs provide real-time public data such as weather, disaster alerts, air quality, and radiation information. Since the app uses third-party data sources, it includes a license and credits section for providers such as </w:t>
       </w:r>
       <w:proofErr w:type="spellStart"/>
       <w:r>
@@ -519,40 +317,20 @@
         <w:rPr>
           <w:lang w:val="en-AT"/>
         </w:rPr>
-        <w:t xml:space="preserve"> Austria or Copernicus Atmosphere Monitoring Service can be attributed.</w:t>
-      </w:r>
-    </w:p>
-    <w:p>
-      <w:pPr>
-        <w:rPr>
-          <w:lang w:val="en-AT"/>
-        </w:rPr>
-      </w:pPr>
-      <w:r>
-        <w:rPr>
-          <w:lang w:val="en-AT"/>
-        </w:rPr>
-        <w:t>Google Forms is used during evaluation to collect user testing feedback. Linear is used for task planning and project management. These tools are not part of the runtime architecture of the app, but they support the development and evaluation process.</w:t>
-      </w:r>
-    </w:p>
-    <w:p>
-      <w:pPr>
-        <w:rPr>
-          <w:lang w:val="en-AT"/>
-        </w:rPr>
-      </w:pPr>
-      <w:r>
-        <w:rPr>
-          <w:lang w:val="en-AT"/>
-        </w:rPr>
-        <w:t xml:space="preserve">The selected architecture is suitable for the project because it keeps the app lightweight and realistic for the project scope. React Native and Expo reduce development complexity, SQLite </w:t>
-      </w:r>
-      <w:r>
-        <w:rPr>
-          <w:lang w:val="en-AT"/>
-        </w:rPr>
-        <w:lastRenderedPageBreak/>
-        <w:t>supports local persistence, GPS and notifications enable location-based mobile features, and REST APIs provide the live data required for disaster preparedness and response.</w:t>
+        <w:t xml:space="preserve"> Austria and the Copernicus Atmosphere Monitoring Service.</w:t>
+      </w:r>
+    </w:p>
+    <w:p>
+      <w:pPr>
+        <w:rPr>
+          <w:lang w:val="en-AT"/>
+        </w:rPr>
+      </w:pPr>
+      <w:r>
+        <w:rPr>
+          <w:lang w:val="en-AT"/>
+        </w:rPr>
+        <w:t>This architecture fits the project scope because it keeps the app lightweight and realistic. React Native and Expo reduce development complexity, SQLite provides local persistence, GPS and notifications enable location-based mobile features, and REST APIs supply the live data needed for disaster preparedness and response.</w:t>
       </w:r>
     </w:p>
     <w:p>
@@ -563,15 +341,6 @@
         <w:t>User Interface</w:t>
       </w:r>
       <w:r>
-        <w:t xml:space="preserve">, </w:t>
-      </w:r>
-      <w:r>
-        <w:t>User Experience</w:t>
-      </w:r>
-      <w:r>
-        <w:t>,</w:t>
-      </w:r>
-      <w:r>
         <w:t xml:space="preserve"> </w:t>
       </w:r>
       <w:r>
@@ -619,19 +388,7 @@
         <w:rPr>
           <w:lang w:val="en-AT"/>
         </w:rPr>
-        <w:t xml:space="preserve">, and settings. This structure supports both immediate response and long-term preparedness. The dashboard focuses on live local information, while the learning </w:t>
-      </w:r>
-      <w:r>
-        <w:rPr>
-          <w:lang w:val="en-AT"/>
-        </w:rPr>
-        <w:t>centre</w:t>
-      </w:r>
-      <w:r>
-        <w:rPr>
-          <w:lang w:val="en-AT"/>
-        </w:rPr>
-        <w:t xml:space="preserve"> helps users prepare before an emergency occurs.</w:t>
+        <w:t xml:space="preserve">, and settings. This structure supports both immediate response and long-term preparedness. </w:t>
       </w:r>
     </w:p>
     <w:p>
@@ -733,44 +490,150 @@
         <w:pStyle w:val="Heading3"/>
       </w:pPr>
       <w:r>
-        <w:t xml:space="preserve">Background </w:t>
-      </w:r>
-      <w:r>
-        <w:t>a</w:t>
-      </w:r>
-      <w:r>
-        <w:t xml:space="preserve">lert </w:t>
-      </w:r>
-      <w:r>
-        <w:t>s</w:t>
-      </w:r>
-      <w:r>
-        <w:t>ync</w:t>
-      </w:r>
-    </w:p>
-    <w:p>
-      <w:pPr>
-        <w:rPr>
-          <w:lang w:val="en-AT"/>
-        </w:rPr>
-      </w:pPr>
-      <w:r>
-        <w:rPr>
-          <w:lang w:val="en-AT"/>
-        </w:rPr>
-        <w:t xml:space="preserve">The app includes background activity to </w:t>
-      </w:r>
-      <w:r>
-        <w:rPr>
-          <w:lang w:val="en-AT"/>
-        </w:rPr>
-        <w:t xml:space="preserve">periodically </w:t>
-      </w:r>
-      <w:r>
-        <w:rPr>
-          <w:lang w:val="en-AT"/>
-        </w:rPr>
-        <w:t>check for alerts in the extended region around the user, approximately within a 100 km radius. The purpose is to notify users about relevant local or regional alerts without requiring them to manually open the app.</w:t>
+        <w:t xml:space="preserve">National </w:t>
+      </w:r>
+      <w:r>
+        <w:t>i</w:t>
+      </w:r>
+      <w:r>
+        <w:t>nformation</w:t>
+      </w:r>
+    </w:p>
+    <w:p>
+      <w:pPr>
+        <w:rPr>
+          <w:lang w:val="en-AT"/>
+        </w:rPr>
+      </w:pPr>
+      <w:r>
+        <w:rPr>
+          <w:lang w:val="en-AT"/>
+        </w:rPr>
+        <w:t xml:space="preserve">The national information section gives users a broader overview of conditions across Austria. It shows weather conditions for the capital city of each Austrian state and includes a coloured map for </w:t>
+      </w:r>
+      <w:r>
+        <w:rPr>
+          <w:lang w:val="en-AT"/>
+        </w:rPr>
+        <w:t xml:space="preserve">visuals. </w:t>
+      </w:r>
+      <w:r>
+        <w:rPr>
+          <w:lang w:val="en-AT"/>
+        </w:rPr>
+        <w:t xml:space="preserve">This design </w:t>
+      </w:r>
+      <w:r>
+        <w:rPr>
+          <w:lang w:val="en-AT"/>
+        </w:rPr>
+        <w:t xml:space="preserve">idea was chosen </w:t>
+      </w:r>
+      <w:r>
+        <w:rPr>
+          <w:lang w:val="en-AT"/>
+        </w:rPr>
+        <w:t xml:space="preserve">because disasters and severe weather events </w:t>
+      </w:r>
+      <w:r>
+        <w:rPr>
+          <w:lang w:val="en-AT"/>
+        </w:rPr>
+        <w:lastRenderedPageBreak/>
+        <w:t>often affect larger regions, not only one city or district. A national overview helps users understand whether their local situation is isolated or part of a wider event.</w:t>
+      </w:r>
+    </w:p>
+    <w:p>
+      <w:pPr>
+        <w:pStyle w:val="Heading3"/>
+      </w:pPr>
+      <w:r>
+        <w:t xml:space="preserve">Emergency </w:t>
+      </w:r>
+      <w:r>
+        <w:t>r</w:t>
+      </w:r>
+      <w:r>
+        <w:t>esources</w:t>
+      </w:r>
+    </w:p>
+    <w:p>
+      <w:pPr>
+        <w:rPr>
+          <w:lang w:val="en-AT"/>
+        </w:rPr>
+      </w:pPr>
+      <w:r>
+        <w:rPr>
+          <w:lang w:val="en-AT"/>
+        </w:rPr>
+        <w:t>The emergency section provides quick access to important emergency numbers, official resources, and basic response guidance. This section is designed for speed and clarity</w:t>
+      </w:r>
+      <w:r>
+        <w:rPr>
+          <w:lang w:val="en-AT"/>
+        </w:rPr>
+        <w:t xml:space="preserve">, </w:t>
+      </w:r>
+      <w:r>
+        <w:rPr>
+          <w:lang w:val="en-AT"/>
+        </w:rPr>
+        <w:t xml:space="preserve">to find essential contact information without navigating through </w:t>
+      </w:r>
+      <w:r>
+        <w:rPr>
+          <w:lang w:val="en-AT"/>
+        </w:rPr>
+        <w:t>lots of</w:t>
+      </w:r>
+      <w:r>
+        <w:rPr>
+          <w:lang w:val="en-AT"/>
+        </w:rPr>
+        <w:t xml:space="preserve"> content</w:t>
+      </w:r>
+      <w:r>
+        <w:rPr>
+          <w:lang w:val="en-AT"/>
+        </w:rPr>
+        <w:t>.</w:t>
+      </w:r>
+    </w:p>
+    <w:p>
+      <w:pPr>
+        <w:pStyle w:val="Heading3"/>
+      </w:pPr>
+      <w:r>
+        <w:t xml:space="preserve">Learning </w:t>
+      </w:r>
+      <w:r>
+        <w:t>centre</w:t>
+      </w:r>
+    </w:p>
+    <w:p>
+      <w:pPr>
+        <w:rPr>
+          <w:lang w:val="en-AT"/>
+        </w:rPr>
+      </w:pPr>
+      <w:r>
+        <w:rPr>
+          <w:lang w:val="en-AT"/>
+        </w:rPr>
+        <w:t xml:space="preserve">The learning </w:t>
+      </w:r>
+      <w:r>
+        <w:rPr>
+          <w:lang w:val="en-AT"/>
+        </w:rPr>
+        <w:t>centre</w:t>
+      </w:r>
+      <w:r>
+        <w:rPr>
+          <w:lang w:val="en-AT"/>
+        </w:rPr>
+        <w:t xml:space="preserve"> supports long-term preparedness. It is not placed as one of the main emergency tabs because it is mainly used before an emergency, not during one. Instead, it is accessible as an additional preparedness feature.</w:t>
       </w:r>
       <w:r>
         <w:rPr>
@@ -782,19 +645,33 @@
         <w:rPr>
           <w:lang w:val="en-AT"/>
         </w:rPr>
-        <w:t xml:space="preserve">However, </w:t>
-      </w:r>
-      <w:r>
-        <w:rPr>
-          <w:lang w:val="en-AT"/>
-        </w:rPr>
-        <w:t>the app only</w:t>
-      </w:r>
-      <w:r>
-        <w:rPr>
-          <w:lang w:val="en-AT"/>
-        </w:rPr>
-        <w:t xml:space="preserve"> acts as a preparedness and awareness tool rather than as a replacement for official warning systems.</w:t>
+        <w:t>Users can choose a preparedness topic, read short guidance material, complete checklists, and answer quiz questions. After completing a topic, the app assesses the user’s preparedness level and grants a badge.</w:t>
+      </w:r>
+    </w:p>
+    <w:p>
+      <w:pPr>
+        <w:rPr>
+          <w:lang w:val="en-AT"/>
+        </w:rPr>
+      </w:pPr>
+      <w:r>
+        <w:rPr>
+          <w:lang w:val="en-AT"/>
+        </w:rPr>
+        <w:t>Possible learning topics include first aid, heatwave preparedness, storm and power outage preparedness, and emergency bag preparation.</w:t>
+      </w:r>
+    </w:p>
+    <w:p>
+      <w:pPr>
+        <w:rPr>
+          <w:lang w:val="en-AT"/>
+        </w:rPr>
+      </w:pPr>
+      <w:r>
+        <w:rPr>
+          <w:lang w:val="en-AT"/>
+        </w:rPr>
+        <w:t>The badge system is designed to encourage repeated engagement. Preparedness status decreases over time, and after three months the user receives a notification reminding them to recheck their preparedness. This reflects the idea that emergency knowledge and household readiness should be refreshed regularly.</w:t>
       </w:r>
     </w:p>
     <w:p>
@@ -802,219 +679,6 @@
         <w:pStyle w:val="Heading3"/>
       </w:pPr>
       <w:r>
-        <w:t xml:space="preserve">National </w:t>
-      </w:r>
-      <w:r>
-        <w:t>i</w:t>
-      </w:r>
-      <w:r>
-        <w:t>nformation</w:t>
-      </w:r>
-    </w:p>
-    <w:p>
-      <w:pPr>
-        <w:rPr>
-          <w:lang w:val="en-AT"/>
-        </w:rPr>
-      </w:pPr>
-      <w:r>
-        <w:rPr>
-          <w:lang w:val="en-AT"/>
-        </w:rPr>
-        <w:t>The national information section gives users a broader overview of conditions across Austria. It shows weather conditions for the capital city of each Austrian state and includes a coloured map for visual comparison.</w:t>
-      </w:r>
-    </w:p>
-    <w:p>
-      <w:pPr>
-        <w:rPr>
-          <w:lang w:val="en-AT"/>
-        </w:rPr>
-      </w:pPr>
-      <w:r>
-        <w:rPr>
-          <w:lang w:val="en-AT"/>
-        </w:rPr>
-        <w:t xml:space="preserve">This design </w:t>
-      </w:r>
-      <w:r>
-        <w:rPr>
-          <w:lang w:val="en-AT"/>
-        </w:rPr>
-        <w:t xml:space="preserve">idea was chosen </w:t>
-      </w:r>
-      <w:r>
-        <w:rPr>
-          <w:lang w:val="en-AT"/>
-        </w:rPr>
-        <w:t>because disasters and severe weather events often affect larger regions, not only one city or district. A national overview helps users understand whether their local situation is isolated or part of a wider event.</w:t>
-      </w:r>
-    </w:p>
-    <w:p>
-      <w:pPr>
-        <w:pStyle w:val="Heading3"/>
-      </w:pPr>
-      <w:r>
-        <w:t xml:space="preserve">Emergency </w:t>
-      </w:r>
-      <w:r>
-        <w:t>r</w:t>
-      </w:r>
-      <w:r>
-        <w:t>esources</w:t>
-      </w:r>
-    </w:p>
-    <w:p>
-      <w:pPr>
-        <w:rPr>
-          <w:lang w:val="en-AT"/>
-        </w:rPr>
-      </w:pPr>
-      <w:r>
-        <w:rPr>
-          <w:lang w:val="en-AT"/>
-        </w:rPr>
-        <w:t>The emergency section provides quick access to important emergency numbers, official resources, and basic response guidance. This section is designed for speed and clarity. Users should be able to find essential contact information without navigating through long explanations or learning content.</w:t>
-      </w:r>
-      <w:r>
-        <w:rPr>
-          <w:lang w:val="en-AT"/>
-        </w:rPr>
-        <w:t xml:space="preserve"> </w:t>
-      </w:r>
-      <w:r>
-        <w:rPr>
-          <w:lang w:val="en-AT"/>
-        </w:rPr>
-        <w:t xml:space="preserve">Some content will </w:t>
-      </w:r>
-      <w:r>
-        <w:rPr>
-          <w:lang w:val="en-AT"/>
-        </w:rPr>
-        <w:t xml:space="preserve">include the European emergency number, </w:t>
-      </w:r>
-      <w:r>
-        <w:rPr>
-          <w:lang w:val="en-AT"/>
-        </w:rPr>
-        <w:lastRenderedPageBreak/>
-        <w:t>fire department, police, ambulance, poison control, civil protection links, and official Austrian emergency guidance.</w:t>
-      </w:r>
-    </w:p>
-    <w:p>
-      <w:pPr>
-        <w:pStyle w:val="Heading3"/>
-      </w:pPr>
-      <w:r>
-        <w:t xml:space="preserve">Learning </w:t>
-      </w:r>
-      <w:r>
-        <w:t>centre</w:t>
-      </w:r>
-    </w:p>
-    <w:p>
-      <w:pPr>
-        <w:rPr>
-          <w:lang w:val="en-AT"/>
-        </w:rPr>
-      </w:pPr>
-      <w:r>
-        <w:rPr>
-          <w:lang w:val="en-AT"/>
-        </w:rPr>
-        <w:t xml:space="preserve">The learning </w:t>
-      </w:r>
-      <w:r>
-        <w:rPr>
-          <w:lang w:val="en-AT"/>
-        </w:rPr>
-        <w:t>centre</w:t>
-      </w:r>
-      <w:r>
-        <w:rPr>
-          <w:lang w:val="en-AT"/>
-        </w:rPr>
-        <w:t xml:space="preserve"> supports long-term preparedness. It is not placed as one of the main emergency tabs because it is mainly used before an emergency, not during one. Instead, it is connected to the dashboard and accessible as an additional preparedness feature.</w:t>
-      </w:r>
-    </w:p>
-    <w:p>
-      <w:pPr>
-        <w:rPr>
-          <w:lang w:val="en-AT"/>
-        </w:rPr>
-      </w:pPr>
-      <w:r>
-        <w:rPr>
-          <w:lang w:val="en-AT"/>
-        </w:rPr>
-        <w:t>Users can choose a preparedness topic, read short guidance material, complete checklists, and answer quiz questions. After completing a topic, the app assesses the user’s preparedness level and grants a badge.</w:t>
-      </w:r>
-    </w:p>
-    <w:p>
-      <w:pPr>
-        <w:rPr>
-          <w:lang w:val="en-AT"/>
-        </w:rPr>
-      </w:pPr>
-      <w:r>
-        <w:rPr>
-          <w:lang w:val="en-AT"/>
-        </w:rPr>
-        <w:t>Possible learning topics include first aid, children’s safety at home, flood preparedness, heatwave preparedness, storm and power outage preparedness, and emergency bag preparation.</w:t>
-      </w:r>
-    </w:p>
-    <w:p>
-      <w:pPr>
-        <w:rPr>
-          <w:lang w:val="en-AT"/>
-        </w:rPr>
-      </w:pPr>
-      <w:r>
-        <w:rPr>
-          <w:lang w:val="en-AT"/>
-        </w:rPr>
-        <w:t>The badge system is designed to encourage repeated engagement. Preparedness status decreases over time, and after three months the user receives a notification reminding them to recheck their preparedness. This reflects the idea that emergency knowledge and household readiness should be refreshed regularly.</w:t>
-      </w:r>
-    </w:p>
-    <w:p>
-      <w:pPr>
-        <w:pStyle w:val="Heading3"/>
-      </w:pPr>
-      <w:r>
-        <w:t>Notifications</w:t>
-      </w:r>
-    </w:p>
-    <w:p>
-      <w:pPr>
-        <w:rPr>
-          <w:lang w:val="en-AT"/>
-        </w:rPr>
-      </w:pPr>
-      <w:r>
-        <w:rPr>
-          <w:lang w:val="en-AT"/>
-        </w:rPr>
-        <w:t>Notifications are used for two main purposes. The first is to inform users when weather or disaster alerts are detected for their selected area. The second is to remind users when their preparedness status has expired and should be reviewed.</w:t>
-      </w:r>
-    </w:p>
-    <w:p>
-      <w:pPr>
-        <w:rPr>
-          <w:lang w:val="en-AT"/>
-        </w:rPr>
-      </w:pPr>
-      <w:r>
-        <w:rPr>
-          <w:lang w:val="en-AT"/>
-        </w:rPr>
-        <w:t>This supports both immediate response and long-term preparedness. Alert notifications help users react to current risks, while preparedness reminders encourage users to keep their knowledge and supplies up to date.</w:t>
-      </w:r>
-    </w:p>
-    <w:p>
-      <w:pPr>
-        <w:pStyle w:val="Heading3"/>
-      </w:pPr>
-      <w:r>
         <w:t xml:space="preserve">Settings, </w:t>
       </w:r>
       <w:r>
@@ -1040,53 +704,20 @@
         <w:rPr>
           <w:lang w:val="en-AT"/>
         </w:rPr>
-        <w:t>The settings section includes general preferences, location settings, notification settings, and a license and credits area. The credits section is important because the app uses third-party public data sources and resources that require attribution</w:t>
-      </w:r>
-      <w:r>
-        <w:rPr>
-          <w:lang w:val="en-AT"/>
-        </w:rPr>
-        <w:t xml:space="preserve"> due to Creative Commons and legal reasons</w:t>
-      </w:r>
-      <w:r>
-        <w:rPr>
-          <w:lang w:val="en-AT"/>
-        </w:rPr>
-        <w:t>.</w:t>
-      </w:r>
-      <w:r>
-        <w:rPr>
-          <w:lang w:val="en-AT"/>
-        </w:rPr>
-        <w:t xml:space="preserve"> </w:t>
-      </w:r>
-      <w:r>
-        <w:rPr>
-          <w:lang w:val="en-AT"/>
-        </w:rPr>
-        <w:t xml:space="preserve">For example, data from </w:t>
-      </w:r>
-      <w:proofErr w:type="spellStart"/>
-      <w:r>
-        <w:rPr>
-          <w:lang w:val="en-AT"/>
-        </w:rPr>
-        <w:t>GeoSphere</w:t>
-      </w:r>
-      <w:proofErr w:type="spellEnd"/>
-      <w:r>
-        <w:rPr>
-          <w:lang w:val="en-AT"/>
-        </w:rPr>
-        <w:t xml:space="preserve"> Austria, Copernicus Atmosphere Monitoring Service, or other public services should be credited clearly. This improves transparency and ensures that licensing requirements are respected.</w:t>
-      </w:r>
-    </w:p>
-    <w:p>
-      <w:pPr>
-        <w:rPr>
-          <w:lang w:val="en-AT"/>
-        </w:rPr>
-      </w:pPr>
+        <w:t xml:space="preserve">The settings section includes general preferences, notification settings, and a license and credits area. The credits section is important </w:t>
+      </w:r>
+      <w:r>
+        <w:rPr>
+          <w:lang w:val="en-AT"/>
+        </w:rPr>
+        <w:t>t</w:t>
+      </w:r>
+      <w:r>
+        <w:rPr>
+          <w:lang w:val="en-AT"/>
+        </w:rPr>
+        <w:t>his improves transparency and ensures that licensing requirements are respected.</w:t>
+      </w:r>
     </w:p>
     <w:p>
       <w:pPr>
@@ -1112,34 +743,63 @@
         <w:rPr>
           <w:lang w:val="en-AT"/>
         </w:rPr>
-        <w:t xml:space="preserve">The workplan is divided into several major phases. The first phase is </w:t>
-      </w:r>
+        <w:t xml:space="preserve">The workplan is divided into several major phases. </w:t>
+      </w:r>
+      <w:r>
+        <w:rPr>
+          <w:lang w:val="en-AT"/>
+        </w:rPr>
+        <w:t>They follow a</w:t>
+      </w:r>
+      <w:r>
+        <w:rPr>
+          <w:lang w:val="en-AT"/>
+        </w:rPr>
+        <w:t xml:space="preserve"> sequential</w:t>
+      </w:r>
+      <w:r>
+        <w:rPr>
+          <w:lang w:val="en-AT"/>
+        </w:rPr>
+        <w:t xml:space="preserve"> order but at the same time, some processes such as report writing, </w:t>
+      </w:r>
+      <w:r>
+        <w:rPr>
+          <w:lang w:val="en-AT"/>
+        </w:rPr>
+        <w:t xml:space="preserve">and </w:t>
+      </w:r>
+      <w:r>
+        <w:rPr>
+          <w:lang w:val="en-AT"/>
+        </w:rPr>
+        <w:t xml:space="preserve">testing and iteration are continuous and go across the entire project. </w:t>
+      </w:r>
+      <w:r>
+        <w:rPr>
+          <w:lang w:val="en-AT"/>
+        </w:rPr>
+        <w:t>They are described as follows:</w:t>
+      </w:r>
+    </w:p>
+    <w:p>
+      <w:pPr>
+        <w:pStyle w:val="ListParagraph"/>
+        <w:numPr>
+          <w:ilvl w:val="0"/>
+          <w:numId w:val="5"/>
+        </w:numPr>
+        <w:rPr>
+          <w:lang w:val="en-AT"/>
+        </w:rPr>
+      </w:pPr>
       <w:r>
         <w:rPr>
           <w:b/>
           <w:bCs/>
           <w:lang w:val="en-AT"/>
         </w:rPr>
-        <w:t>requirements and research</w:t>
-      </w:r>
-      <w:r>
-        <w:rPr>
-          <w:lang w:val="en-AT"/>
-        </w:rPr>
-        <w:t>. This includes identifying the target users, researching disaster preparedness needs in Austria, deciding which external APIs are viable, and defining the main app features.</w:t>
-      </w:r>
-    </w:p>
-    <w:p>
-      <w:pPr>
-        <w:rPr>
-          <w:lang w:val="en-AT"/>
-        </w:rPr>
-      </w:pPr>
-      <w:r>
-        <w:rPr>
-          <w:lang w:val="en-AT"/>
-        </w:rPr>
-        <w:t xml:space="preserve">The second phase is </w:t>
+        <w:t>R</w:t>
       </w:r>
       <w:r>
         <w:rPr>
@@ -1147,53 +807,7 @@
           <w:bCs/>
           <w:lang w:val="en-AT"/>
         </w:rPr>
-        <w:t>UI and UX design</w:t>
-      </w:r>
-      <w:r>
-        <w:rPr>
-          <w:lang w:val="en-AT"/>
-        </w:rPr>
-        <w:t xml:space="preserve">. This includes designing the dashboard, bottom navigation, learning mode, emergency tab, national overview, and settings screen. Wireframes or </w:t>
-      </w:r>
-      <w:proofErr w:type="spellStart"/>
-      <w:r>
-        <w:rPr>
-          <w:lang w:val="en-AT"/>
-        </w:rPr>
-        <w:t>mockups</w:t>
-      </w:r>
-      <w:proofErr w:type="spellEnd"/>
-      <w:r>
-        <w:rPr>
-          <w:lang w:val="en-AT"/>
-        </w:rPr>
-        <w:t xml:space="preserve"> </w:t>
-      </w:r>
-      <w:r>
-        <w:rPr>
-          <w:lang w:val="en-AT"/>
-        </w:rPr>
-        <w:t>will</w:t>
-      </w:r>
-      <w:r>
-        <w:rPr>
-          <w:lang w:val="en-AT"/>
-        </w:rPr>
-        <w:t xml:space="preserve"> be created before implementation.</w:t>
-      </w:r>
-    </w:p>
-    <w:p>
-      <w:pPr>
-        <w:rPr>
-          <w:lang w:val="en-AT"/>
-        </w:rPr>
-      </w:pPr>
-      <w:r>
-        <w:rPr>
-          <w:lang w:val="en-AT"/>
-        </w:rPr>
-        <w:lastRenderedPageBreak/>
-        <w:t xml:space="preserve">The third phase is </w:t>
+        <w:t xml:space="preserve">equirements and </w:t>
       </w:r>
       <w:r>
         <w:rPr>
@@ -1201,26 +815,7 @@
           <w:bCs/>
           <w:lang w:val="en-AT"/>
         </w:rPr>
-        <w:t>core app setup</w:t>
-      </w:r>
-      <w:r>
-        <w:rPr>
-          <w:lang w:val="en-AT"/>
-        </w:rPr>
-        <w:t>. This includes setting up the Expo React Native project, navigation structure, dark mode styling, basic reusable components, and the local SQLite database.</w:t>
-      </w:r>
-    </w:p>
-    <w:p>
-      <w:pPr>
-        <w:rPr>
-          <w:lang w:val="en-AT"/>
-        </w:rPr>
-      </w:pPr>
-      <w:r>
-        <w:rPr>
-          <w:lang w:val="en-AT"/>
-        </w:rPr>
-        <w:t xml:space="preserve">The fourth phase is </w:t>
+        <w:t xml:space="preserve">market </w:t>
       </w:r>
       <w:r>
         <w:rPr>
@@ -1228,88 +823,432 @@
           <w:bCs/>
           <w:lang w:val="en-AT"/>
         </w:rPr>
-        <w:t>real-time data integration</w:t>
-      </w:r>
-      <w:r>
-        <w:rPr>
-          <w:lang w:val="en-AT"/>
-        </w:rPr>
-        <w:t>. This includes implementing GPS access, current location handling, custom location selection, REST API calls, weather data, alerts, air quality, and radiation information.</w:t>
-      </w:r>
-    </w:p>
-    <w:p>
-      <w:pPr>
-        <w:rPr>
-          <w:lang w:val="en-AT"/>
-        </w:rPr>
-      </w:pPr>
-      <w:r>
-        <w:rPr>
-          <w:lang w:val="en-AT"/>
-        </w:rPr>
-        <w:t xml:space="preserve">The fifth phase is </w:t>
-      </w:r>
+        <w:t>research</w:t>
+      </w:r>
+      <w:r>
+        <w:rPr>
+          <w:lang w:val="en-AT"/>
+        </w:rPr>
+        <w:t>. This includes</w:t>
+      </w:r>
+      <w:r>
+        <w:rPr>
+          <w:lang w:val="en-AT"/>
+        </w:rPr>
+        <w:t xml:space="preserve"> deciding the project template,</w:t>
+      </w:r>
+      <w:r>
+        <w:rPr>
+          <w:lang w:val="en-AT"/>
+        </w:rPr>
+        <w:t xml:space="preserve"> identifying the </w:t>
+      </w:r>
+      <w:r>
+        <w:rPr>
+          <w:lang w:val="en-AT"/>
+        </w:rPr>
+        <w:t>use cases</w:t>
+      </w:r>
+      <w:r>
+        <w:rPr>
+          <w:lang w:val="en-AT"/>
+        </w:rPr>
+        <w:t xml:space="preserve">, researching disaster preparedness needs in Austria, deciding which </w:t>
+      </w:r>
+      <w:r>
+        <w:rPr>
+          <w:lang w:val="en-AT"/>
+        </w:rPr>
+        <w:t xml:space="preserve">resources and </w:t>
+      </w:r>
+      <w:r>
+        <w:rPr>
+          <w:lang w:val="en-AT"/>
+        </w:rPr>
+        <w:t xml:space="preserve">external APIs are viable, and </w:t>
+      </w:r>
+      <w:r>
+        <w:rPr>
+          <w:lang w:val="en-AT"/>
+        </w:rPr>
+        <w:t>brainstorming</w:t>
+      </w:r>
+      <w:r>
+        <w:rPr>
+          <w:lang w:val="en-AT"/>
+        </w:rPr>
+        <w:t xml:space="preserve"> the main app features.</w:t>
+      </w:r>
+    </w:p>
+    <w:p>
+      <w:pPr>
+        <w:pStyle w:val="ListParagraph"/>
+        <w:numPr>
+          <w:ilvl w:val="0"/>
+          <w:numId w:val="5"/>
+        </w:numPr>
+        <w:rPr>
+          <w:lang w:val="en-AT"/>
+        </w:rPr>
+      </w:pPr>
       <w:r>
         <w:rPr>
           <w:b/>
           <w:bCs/>
           <w:lang w:val="en-AT"/>
         </w:rPr>
-        <w:t>learning mode and gamification</w:t>
-      </w:r>
-      <w:r>
-        <w:rPr>
-          <w:lang w:val="en-AT"/>
-        </w:rPr>
-        <w:t>. This includes preparedness topics, checklists, reading pages, quizzes, badge logic, and the three-month expiry system.</w:t>
-      </w:r>
-    </w:p>
-    <w:p>
-      <w:pPr>
-        <w:rPr>
-          <w:lang w:val="en-AT"/>
-        </w:rPr>
-      </w:pPr>
-      <w:r>
-        <w:rPr>
-          <w:lang w:val="en-AT"/>
-        </w:rPr>
-        <w:t xml:space="preserve">The sixth phase is </w:t>
-      </w:r>
+        <w:t>UI and UX design</w:t>
+      </w:r>
+      <w:r>
+        <w:rPr>
+          <w:lang w:val="en-AT"/>
+        </w:rPr>
+        <w:t xml:space="preserve">. This includes </w:t>
+      </w:r>
+      <w:r>
+        <w:rPr>
+          <w:lang w:val="en-AT"/>
+        </w:rPr>
+        <w:t xml:space="preserve">creating wireframes and </w:t>
+      </w:r>
+      <w:r>
+        <w:rPr>
+          <w:lang w:val="en-AT"/>
+        </w:rPr>
+        <w:t xml:space="preserve">designing </w:t>
+      </w:r>
+      <w:r>
+        <w:rPr>
+          <w:lang w:val="en-AT"/>
+        </w:rPr>
+        <w:t xml:space="preserve">a first draft of </w:t>
+      </w:r>
+      <w:r>
+        <w:rPr>
+          <w:lang w:val="en-AT"/>
+        </w:rPr>
+        <w:t>the dashboard, bottom navigation, learning mode, emergency tab, national overview, and settings screen.</w:t>
+      </w:r>
+    </w:p>
+    <w:p>
+      <w:pPr>
+        <w:pStyle w:val="ListParagraph"/>
+        <w:numPr>
+          <w:ilvl w:val="0"/>
+          <w:numId w:val="5"/>
+        </w:numPr>
+        <w:rPr>
+          <w:lang w:val="en-AT"/>
+        </w:rPr>
+      </w:pPr>
       <w:r>
         <w:rPr>
           <w:b/>
           <w:bCs/>
           <w:lang w:val="en-AT"/>
         </w:rPr>
-        <w:t>notifications and background sync</w:t>
-      </w:r>
-      <w:r>
-        <w:rPr>
-          <w:lang w:val="en-AT"/>
-        </w:rPr>
-        <w:t>. This includes local notifications for preparedness expiry and alert notifications for selected locations. Background fetching should be tested carefully because mobile operating systems can limit background tasks.</w:t>
-      </w:r>
-    </w:p>
-    <w:p>
-      <w:pPr>
-        <w:rPr>
-          <w:lang w:val="en-AT"/>
-        </w:rPr>
-      </w:pPr>
-      <w:r>
-        <w:rPr>
-          <w:lang w:val="en-AT"/>
-        </w:rPr>
-        <w:t xml:space="preserve">The seventh phase is </w:t>
-      </w:r>
+        <w:t>Report writing</w:t>
+      </w:r>
+      <w:r>
+        <w:rPr>
+          <w:lang w:val="en-AT"/>
+        </w:rPr>
+        <w:t>. Includes developing this report for both the preliminary submission and the final one.</w:t>
+      </w:r>
+    </w:p>
+    <w:p>
+      <w:pPr>
+        <w:pStyle w:val="ListParagraph"/>
+        <w:numPr>
+          <w:ilvl w:val="0"/>
+          <w:numId w:val="5"/>
+        </w:numPr>
+        <w:rPr>
+          <w:lang w:val="en-AT"/>
+        </w:rPr>
+      </w:pPr>
       <w:r>
         <w:rPr>
           <w:b/>
           <w:bCs/>
           <w:lang w:val="en-AT"/>
         </w:rPr>
-        <w:t>testing and evaluation</w:t>
+        <w:t>P</w:t>
+      </w:r>
+      <w:r>
+        <w:rPr>
+          <w:b/>
+          <w:bCs/>
+          <w:lang w:val="en-AT"/>
+        </w:rPr>
+        <w:t>rototype development</w:t>
+      </w:r>
+      <w:r>
+        <w:rPr>
+          <w:lang w:val="en-AT"/>
+        </w:rPr>
+        <w:t xml:space="preserve">. This includes setting up the Expo React Native project, </w:t>
+      </w:r>
+      <w:r>
+        <w:rPr>
+          <w:lang w:val="en-AT"/>
+        </w:rPr>
+        <w:t xml:space="preserve">basic </w:t>
+      </w:r>
+      <w:r>
+        <w:rPr>
+          <w:lang w:val="en-AT"/>
+        </w:rPr>
+        <w:t xml:space="preserve">navigation structure, dark mode styling, basic reusable components, </w:t>
+      </w:r>
+      <w:r>
+        <w:rPr>
+          <w:lang w:val="en-AT"/>
+        </w:rPr>
+        <w:t xml:space="preserve">and </w:t>
+      </w:r>
+      <w:r>
+        <w:rPr>
+          <w:lang w:val="en-AT"/>
+        </w:rPr>
+        <w:t>the Dashboard page as the</w:t>
+      </w:r>
+      <w:r>
+        <w:rPr>
+          <w:lang w:val="en-AT"/>
+        </w:rPr>
+        <w:t xml:space="preserve"> main feature that should work for the preliminary submission.</w:t>
+      </w:r>
+      <w:r>
+        <w:rPr>
+          <w:lang w:val="en-AT"/>
+        </w:rPr>
+        <w:t xml:space="preserve"> The UI frontend at this step may be in a draft version.</w:t>
+      </w:r>
+    </w:p>
+    <w:p>
+      <w:pPr>
+        <w:pStyle w:val="ListParagraph"/>
+        <w:numPr>
+          <w:ilvl w:val="0"/>
+          <w:numId w:val="5"/>
+        </w:numPr>
+        <w:rPr>
+          <w:lang w:val="en-AT"/>
+        </w:rPr>
+      </w:pPr>
+      <w:r>
+        <w:rPr>
+          <w:b/>
+          <w:bCs/>
+          <w:lang w:val="en-AT"/>
+        </w:rPr>
+        <w:t>APIs</w:t>
+      </w:r>
+      <w:r>
+        <w:rPr>
+          <w:b/>
+          <w:bCs/>
+          <w:lang w:val="en-AT"/>
+        </w:rPr>
+        <w:t xml:space="preserve"> integration</w:t>
+      </w:r>
+      <w:r>
+        <w:rPr>
+          <w:lang w:val="en-AT"/>
+        </w:rPr>
+        <w:t xml:space="preserve"> and </w:t>
+      </w:r>
+      <w:r>
+        <w:rPr>
+          <w:b/>
+          <w:bCs/>
+          <w:lang w:val="en-AT"/>
+        </w:rPr>
+        <w:t>UI components implementation</w:t>
+      </w:r>
+      <w:r>
+        <w:rPr>
+          <w:lang w:val="en-AT"/>
+        </w:rPr>
+        <w:t xml:space="preserve">. This includes implementing </w:t>
+      </w:r>
+      <w:r>
+        <w:rPr>
+          <w:lang w:val="en-AT"/>
+        </w:rPr>
+        <w:t xml:space="preserve">the business logic for </w:t>
+      </w:r>
+      <w:r>
+        <w:rPr>
+          <w:lang w:val="en-AT"/>
+        </w:rPr>
+        <w:t xml:space="preserve">GPS </w:t>
+      </w:r>
+      <w:r>
+        <w:rPr>
+          <w:lang w:val="en-AT"/>
+        </w:rPr>
+        <w:t xml:space="preserve">sensor </w:t>
+      </w:r>
+      <w:r>
+        <w:rPr>
+          <w:lang w:val="en-AT"/>
+        </w:rPr>
+        <w:t>access, current location handling, custom location selection,</w:t>
+      </w:r>
+      <w:r>
+        <w:rPr>
+          <w:lang w:val="en-AT"/>
+        </w:rPr>
+        <w:t xml:space="preserve"> and all</w:t>
+      </w:r>
+      <w:r>
+        <w:rPr>
+          <w:lang w:val="en-AT"/>
+        </w:rPr>
+        <w:t xml:space="preserve"> REST API calls</w:t>
+      </w:r>
+      <w:r>
+        <w:rPr>
+          <w:lang w:val="en-AT"/>
+        </w:rPr>
+        <w:t xml:space="preserve">, for both local and national view tabs. At the same time, </w:t>
+      </w:r>
+      <w:r>
+        <w:rPr>
+          <w:lang w:val="en-AT"/>
+        </w:rPr>
+        <w:lastRenderedPageBreak/>
+        <w:t>the frontend UI components to display the information must be implemented and refined to display all the information.</w:t>
+      </w:r>
+    </w:p>
+    <w:p>
+      <w:pPr>
+        <w:pStyle w:val="ListParagraph"/>
+        <w:numPr>
+          <w:ilvl w:val="0"/>
+          <w:numId w:val="5"/>
+        </w:numPr>
+        <w:rPr>
+          <w:lang w:val="en-AT"/>
+        </w:rPr>
+      </w:pPr>
+      <w:r>
+        <w:rPr>
+          <w:b/>
+          <w:bCs/>
+          <w:lang w:val="en-AT"/>
+        </w:rPr>
+        <w:t>L</w:t>
+      </w:r>
+      <w:r>
+        <w:rPr>
+          <w:b/>
+          <w:bCs/>
+          <w:lang w:val="en-AT"/>
+        </w:rPr>
+        <w:t xml:space="preserve">earning </w:t>
+      </w:r>
+      <w:r>
+        <w:rPr>
+          <w:b/>
+          <w:bCs/>
+          <w:lang w:val="en-AT"/>
+        </w:rPr>
+        <w:t>centre</w:t>
+      </w:r>
+      <w:r>
+        <w:rPr>
+          <w:b/>
+          <w:bCs/>
+          <w:lang w:val="en-AT"/>
+        </w:rPr>
+        <w:t xml:space="preserve"> and gamification</w:t>
+      </w:r>
+      <w:r>
+        <w:rPr>
+          <w:lang w:val="en-AT"/>
+        </w:rPr>
+        <w:t>. This includes preparedness topics, checklists, reading pages, quizzes, badge logic, and the three-month expiry system.</w:t>
+      </w:r>
+    </w:p>
+    <w:p>
+      <w:pPr>
+        <w:pStyle w:val="ListParagraph"/>
+        <w:numPr>
+          <w:ilvl w:val="0"/>
+          <w:numId w:val="5"/>
+        </w:numPr>
+        <w:rPr>
+          <w:lang w:val="en-AT"/>
+        </w:rPr>
+      </w:pPr>
+      <w:r>
+        <w:rPr>
+          <w:b/>
+          <w:bCs/>
+          <w:lang w:val="en-AT"/>
+        </w:rPr>
+        <w:t>N</w:t>
+      </w:r>
+      <w:r>
+        <w:rPr>
+          <w:b/>
+          <w:bCs/>
+          <w:lang w:val="en-AT"/>
+        </w:rPr>
+        <w:t>otifications and background sync</w:t>
+      </w:r>
+      <w:r>
+        <w:rPr>
+          <w:lang w:val="en-AT"/>
+        </w:rPr>
+        <w:t>. This includes local notifications for preparedness expiry and alert notifications for selected locations. Background fetching should be tested carefully because mobile operating systems can limit background tasks.</w:t>
+      </w:r>
+    </w:p>
+    <w:p>
+      <w:pPr>
+        <w:pStyle w:val="ListParagraph"/>
+        <w:numPr>
+          <w:ilvl w:val="0"/>
+          <w:numId w:val="5"/>
+        </w:numPr>
+        <w:rPr>
+          <w:lang w:val="en-AT"/>
+        </w:rPr>
+      </w:pPr>
+      <w:r>
+        <w:rPr>
+          <w:b/>
+          <w:bCs/>
+          <w:lang w:val="en-AT"/>
+        </w:rPr>
+        <w:t>T</w:t>
+      </w:r>
+      <w:r>
+        <w:rPr>
+          <w:b/>
+          <w:bCs/>
+          <w:lang w:val="en-AT"/>
+        </w:rPr>
+        <w:t>esting</w:t>
+      </w:r>
+      <w:r>
+        <w:rPr>
+          <w:b/>
+          <w:bCs/>
+          <w:lang w:val="en-AT"/>
+        </w:rPr>
+        <w:t xml:space="preserve">, iteration, and </w:t>
+      </w:r>
+      <w:r>
+        <w:rPr>
+          <w:b/>
+          <w:bCs/>
+          <w:lang w:val="en-AT"/>
+        </w:rPr>
+        <w:t>evaluation</w:t>
       </w:r>
       <w:r>
         <w:rPr>
@@ -1317,107 +1256,204 @@
         </w:rPr>
         <w:t>. This includes functional testing, usability testing, user feedback collection, and checking whether the project achieved its goals.</w:t>
       </w:r>
-    </w:p>
-    <w:p>
-      <w:pPr>
-        <w:rPr>
-          <w:lang w:val="en-AT"/>
-        </w:rPr>
-      </w:pPr>
-      <w:r>
-        <w:rPr>
-          <w:lang w:val="en-AT"/>
-        </w:rPr>
-        <w:t>A possible Gantt chart structure could include:</w:t>
-      </w:r>
-    </w:p>
-    <w:p>
-      <w:pPr>
-        <w:rPr>
-          <w:lang w:val="en-AT"/>
-        </w:rPr>
-      </w:pPr>
-      <w:r>
-        <w:rPr>
-          <w:lang w:val="en-AT"/>
-        </w:rPr>
-        <w:t>Week 1: Requirements, research, API investigation</w:t>
-      </w:r>
-      <w:r>
-        <w:rPr>
-          <w:lang w:val="en-AT"/>
-        </w:rPr>
-        <w:br/>
-        <w:t>Week 2: UI/UX design and app structure planning</w:t>
-      </w:r>
-      <w:r>
-        <w:rPr>
-          <w:lang w:val="en-AT"/>
-        </w:rPr>
-        <w:br/>
-        <w:t>Week 3: Expo project setup, navigation, database setup</w:t>
-      </w:r>
-      <w:r>
-        <w:rPr>
-          <w:lang w:val="en-AT"/>
-        </w:rPr>
-        <w:br/>
-        <w:t>Week 4: Dashboard implementation and GPS integration</w:t>
-      </w:r>
-      <w:r>
-        <w:rPr>
-          <w:lang w:val="en-AT"/>
-        </w:rPr>
-        <w:br/>
-        <w:t>Week 5: Weather, alerts, air quality, and radiation API integration</w:t>
-      </w:r>
-      <w:r>
-        <w:rPr>
-          <w:lang w:val="en-AT"/>
-        </w:rPr>
-        <w:br/>
-        <w:t>Week 6: National overview and emergency resources tab</w:t>
-      </w:r>
-      <w:r>
-        <w:rPr>
-          <w:lang w:val="en-AT"/>
-        </w:rPr>
-        <w:br/>
-        <w:t>Week 7: Learning mode, checklists, quizzes, badges</w:t>
-      </w:r>
-      <w:r>
-        <w:rPr>
-          <w:lang w:val="en-AT"/>
-        </w:rPr>
-        <w:br/>
-        <w:t>Week 8: Notifications, background sync, settings, credits</w:t>
-      </w:r>
-      <w:r>
-        <w:rPr>
-          <w:lang w:val="en-AT"/>
-        </w:rPr>
-        <w:br/>
-        <w:t>Week 9: Testing, feedback collection, bug fixing</w:t>
-      </w:r>
-      <w:r>
-        <w:rPr>
-          <w:lang w:val="en-AT"/>
-        </w:rPr>
-        <w:br/>
-        <w:t>Week 10: Final report, evaluation, contingency documentation</w:t>
-      </w:r>
-    </w:p>
-    <w:p>
-      <w:pPr>
-        <w:rPr>
-          <w:lang w:val="en-AT"/>
-        </w:rPr>
-      </w:pPr>
-      <w:r>
-        <w:rPr>
-          <w:lang w:val="en-AT"/>
-        </w:rPr>
-        <w:t>This workplan is feasible because the project is split into clear deliverables. The most complex features, such as background sync and external API integration, are planned before final testing so there is time to adjust the scope if needed.</w:t>
+      <w:r>
+        <w:rPr>
+          <w:lang w:val="en-AT"/>
+        </w:rPr>
+        <w:t xml:space="preserve"> T</w:t>
+      </w:r>
+      <w:r>
+        <w:rPr>
+          <w:lang w:val="en-AT"/>
+        </w:rPr>
+        <w:t>his includes adjusting features and UX based on collected feedback.</w:t>
+      </w:r>
+    </w:p>
+    <w:p>
+      <w:pPr>
+        <w:pStyle w:val="ListParagraph"/>
+        <w:numPr>
+          <w:ilvl w:val="0"/>
+          <w:numId w:val="5"/>
+        </w:numPr>
+        <w:rPr>
+          <w:lang w:val="en-AT"/>
+        </w:rPr>
+      </w:pPr>
+      <w:r>
+        <w:rPr>
+          <w:b/>
+          <w:bCs/>
+          <w:lang w:val="en-AT"/>
+        </w:rPr>
+        <w:t>Bug fixes and improvements</w:t>
+      </w:r>
+      <w:r>
+        <w:rPr>
+          <w:lang w:val="en-AT"/>
+        </w:rPr>
+        <w:t>.</w:t>
+      </w:r>
+      <w:r>
+        <w:rPr>
+          <w:lang w:val="en-AT"/>
+        </w:rPr>
+        <w:t xml:space="preserve"> Allocated time for bug fixing, any required contingency, and polishing the implementation for the final submission.</w:t>
+      </w:r>
+    </w:p>
+    <w:p>
+      <w:pPr>
+        <w:rPr>
+          <w:lang w:val="en-AT"/>
+        </w:rPr>
+      </w:pPr>
+      <w:r>
+        <w:rPr>
+          <w:lang w:val="en-AT"/>
+        </w:rPr>
+        <w:t xml:space="preserve">Google Forms </w:t>
+      </w:r>
+      <w:r>
+        <w:rPr>
+          <w:lang w:val="en-AT"/>
+        </w:rPr>
+        <w:t>will be</w:t>
+      </w:r>
+      <w:r>
+        <w:rPr>
+          <w:lang w:val="en-AT"/>
+        </w:rPr>
+        <w:t xml:space="preserve"> used during evaluation to collect user testing feedback. Linear is used for task planning and project management.</w:t>
+      </w:r>
+      <w:r>
+        <w:rPr>
+          <w:lang w:val="en-AT"/>
+        </w:rPr>
+        <w:t xml:space="preserve"> </w:t>
+      </w:r>
+      <w:r>
+        <w:rPr>
+          <w:lang w:val="en-AT"/>
+        </w:rPr>
+        <w:t>The development plan Linear, along with all the tasks within each “phase”</w:t>
+      </w:r>
+      <w:r>
+        <w:rPr>
+          <w:lang w:val="en-AT"/>
+        </w:rPr>
+        <w:t xml:space="preserve"> can be seen in Figure 2</w:t>
+      </w:r>
+      <w:r>
+        <w:rPr>
+          <w:lang w:val="en-AT"/>
+        </w:rPr>
+        <w:t>.</w:t>
+      </w:r>
+    </w:p>
+    <w:p>
+      <w:pPr>
+        <w:keepNext/>
+      </w:pPr>
+      <w:r>
+        <w:rPr>
+          <w:lang w:val="en-AT"/>
+        </w:rPr>
+        <w:drawing>
+          <wp:inline distT="0" distB="0" distL="0" distR="0" wp14:anchorId="25D61915" wp14:editId="7E7F6BD6">
+            <wp:extent cx="5731510" cy="3333750"/>
+            <wp:effectExtent l="0" t="0" r="2540" b="0"/>
+            <wp:docPr id="570350759" name="Picture 1"/>
+            <wp:cNvGraphicFramePr>
+              <a:graphicFrameLocks xmlns:a="http://schemas.openxmlformats.org/drawingml/2006/main" noChangeAspect="1"/>
+            </wp:cNvGraphicFramePr>
+            <a:graphic xmlns:a="http://schemas.openxmlformats.org/drawingml/2006/main">
+              <a:graphicData uri="http://schemas.openxmlformats.org/drawingml/2006/picture">
+                <pic:pic xmlns:pic="http://schemas.openxmlformats.org/drawingml/2006/picture">
+                  <pic:nvPicPr>
+                    <pic:cNvPr id="570350759" name=""/>
+                    <pic:cNvPicPr/>
+                  </pic:nvPicPr>
+                  <pic:blipFill>
+                    <a:blip r:embed="rId6"/>
+                    <a:stretch>
+                      <a:fillRect/>
+                    </a:stretch>
+                  </pic:blipFill>
+                  <pic:spPr>
+                    <a:xfrm>
+                      <a:off x="0" y="0"/>
+                      <a:ext cx="5731510" cy="3333750"/>
+                    </a:xfrm>
+                    <a:prstGeom prst="rect">
+                      <a:avLst/>
+                    </a:prstGeom>
+                  </pic:spPr>
+                </pic:pic>
+              </a:graphicData>
+            </a:graphic>
+          </wp:inline>
+        </w:drawing>
+      </w:r>
+    </w:p>
+    <w:p>
+      <w:pPr>
+        <w:pStyle w:val="Caption"/>
+        <w:rPr>
+          <w:lang w:val="en-US"/>
+        </w:rPr>
+      </w:pPr>
+      <w:r>
+        <w:rPr>
+          <w:lang w:val="en-US"/>
+        </w:rPr>
+        <w:t xml:space="preserve">Figure </w:t>
+      </w:r>
+      <w:r>
+        <w:fldChar w:fldCharType="begin"/>
+      </w:r>
+      <w:r>
+        <w:rPr>
+          <w:lang w:val="en-US"/>
+        </w:rPr>
+        <w:instrText xml:space="preserve"> SEQ Figure \* ARABIC </w:instrText>
+      </w:r>
+      <w:r>
+        <w:fldChar w:fldCharType="separate"/>
+      </w:r>
+      <w:r>
+        <w:rPr>
+          <w:noProof/>
+          <w:lang w:val="en-US"/>
+        </w:rPr>
+        <w:t>2</w:t>
+      </w:r>
+      <w:r>
+        <w:fldChar w:fldCharType="end"/>
+      </w:r>
+      <w:r>
+        <w:rPr>
+          <w:lang w:val="en-US"/>
+        </w:rPr>
+        <w:t>: Linear phases in Gantt chart view</w:t>
+      </w:r>
+    </w:p>
+    <w:p>
+      <w:pPr>
+        <w:rPr>
+          <w:lang w:val="en-AT"/>
+        </w:rPr>
+      </w:pPr>
+      <w:r>
+        <w:rPr>
+          <w:lang w:val="en-AT"/>
+        </w:rPr>
+        <w:t>This workplan is feasible because the project is split into clear deliverables</w:t>
+      </w:r>
+      <w:r>
+        <w:rPr>
+          <w:lang w:val="en-AT"/>
+        </w:rPr>
+        <w:t xml:space="preserve">, such as the prototype and reports, as well as the final project submission. </w:t>
       </w:r>
     </w:p>
     <w:p>
@@ -1425,71 +1461,87 @@
         <w:pStyle w:val="Heading2"/>
       </w:pPr>
       <w:r>
-        <w:t>Contingency Plan</w:t>
-      </w:r>
-    </w:p>
-    <w:p>
-      <w:pPr>
-        <w:rPr>
-          <w:lang w:val="en-AT"/>
-        </w:rPr>
-      </w:pPr>
-      <w:r>
-        <w:rPr>
-          <w:lang w:val="en-AT"/>
-        </w:rPr>
-        <w:t>Some project risks are expected. External APIs may be unavailable, difficult to use, or limited by licensing restrictions. As a contingency, the app can use mock data or reduce the number of live data sources. For example, if radiation data is not easily available, the app can still function with weather, alerts, and air quality data.</w:t>
-      </w:r>
-    </w:p>
-    <w:p>
-      <w:pPr>
-        <w:rPr>
-          <w:lang w:val="en-AT"/>
-        </w:rPr>
-      </w:pPr>
-      <w:r>
-        <w:rPr>
-          <w:lang w:val="en-AT"/>
-        </w:rPr>
-        <w:t>Background sync may also be limited by Android or Expo restrictions. If reliable background fetching is not possible within the project scope, the app can still support manual refresh and local notifications for preparedness expiry.</w:t>
-      </w:r>
-    </w:p>
-    <w:p>
-      <w:pPr>
-        <w:rPr>
-          <w:lang w:val="en-AT"/>
-        </w:rPr>
-      </w:pPr>
-      <w:r>
-        <w:rPr>
-          <w:lang w:val="en-AT"/>
-        </w:rPr>
-        <w:t>Another risk is that the learning mode may become too large. If there is not enough time to implement all preparedness topics, the project can focus on three complete topics instead of many incomplete ones. A smaller but polished learning mode is better than a larger unfinished one.</w:t>
-      </w:r>
-    </w:p>
-    <w:p>
-      <w:pPr>
-        <w:rPr>
-          <w:lang w:val="en-AT"/>
-        </w:rPr>
-      </w:pPr>
-      <w:r>
-        <w:rPr>
-          <w:lang w:val="en-AT"/>
-        </w:rPr>
-        <w:t>Possible fallback options</w:t>
-      </w:r>
-      <w:r>
-        <w:rPr>
-          <w:lang w:val="en-AT"/>
-        </w:rPr>
-        <w:t xml:space="preserve"> for the first prototype</w:t>
-      </w:r>
-      <w:r>
-        <w:rPr>
-          <w:lang w:val="en-AT"/>
-        </w:rPr>
-        <w:t xml:space="preserve"> include:</w:t>
+        <w:t xml:space="preserve">Contingency </w:t>
+      </w:r>
+      <w:r>
+        <w:t>p</w:t>
+      </w:r>
+      <w:r>
+        <w:t>lan</w:t>
+      </w:r>
+    </w:p>
+    <w:p>
+      <w:pPr>
+        <w:rPr>
+          <w:lang w:val="en-AT"/>
+        </w:rPr>
+      </w:pPr>
+      <w:r>
+        <w:rPr>
+          <w:lang w:val="en-AT"/>
+        </w:rPr>
+        <w:t>Some project risks are expected. External APIs may be unavailable</w:t>
+      </w:r>
+      <w:r>
+        <w:rPr>
+          <w:lang w:val="en-AT"/>
+        </w:rPr>
+        <w:t xml:space="preserve">, </w:t>
+      </w:r>
+      <w:r>
+        <w:rPr>
+          <w:lang w:val="en-AT"/>
+        </w:rPr>
+        <w:t>there may be network restrictions</w:t>
+      </w:r>
+      <w:r>
+        <w:rPr>
+          <w:lang w:val="en-AT"/>
+        </w:rPr>
+        <w:t>, or there could be some complexities during development that take longer than expected</w:t>
+      </w:r>
+      <w:r>
+        <w:rPr>
+          <w:lang w:val="en-AT"/>
+        </w:rPr>
+        <w:t xml:space="preserve">. As a contingency, the app can </w:t>
+      </w:r>
+      <w:r>
+        <w:rPr>
+          <w:lang w:val="en-AT"/>
+        </w:rPr>
+        <w:t xml:space="preserve">show placeholders when the data cannot be fetched </w:t>
+      </w:r>
+      <w:r>
+        <w:rPr>
+          <w:lang w:val="en-AT"/>
+        </w:rPr>
+        <w:t>or reduce the number of live data sources.</w:t>
+      </w:r>
+    </w:p>
+    <w:p>
+      <w:pPr>
+        <w:rPr>
+          <w:lang w:val="en-AT"/>
+        </w:rPr>
+      </w:pPr>
+      <w:r>
+        <w:rPr>
+          <w:lang w:val="en-AT"/>
+        </w:rPr>
+        <w:t xml:space="preserve">Background sync may also be limited by Android </w:t>
+      </w:r>
+      <w:r>
+        <w:rPr>
+          <w:lang w:val="en-AT"/>
+        </w:rPr>
+        <w:t>or</w:t>
+      </w:r>
+      <w:r>
+        <w:rPr>
+          <w:lang w:val="en-AT"/>
+        </w:rPr>
+        <w:t xml:space="preserve"> Expo. If reliable background fetching is not possible within the project scope, the app can still support manual refresh and local notifications for preparedness expiry.</w:t>
       </w:r>
     </w:p>
     <w:p>
@@ -1503,47 +1555,62 @@
           <w:lang w:val="en-AT"/>
         </w:rPr>
         <w:lastRenderedPageBreak/>
-        <w:t>Use mock data for unavailable APIs</w:t>
-      </w:r>
-      <w:r>
-        <w:rPr>
-          <w:lang w:val="en-AT"/>
-        </w:rPr>
-        <w:t xml:space="preserve"> for a working prototype.</w:t>
-      </w:r>
-      <w:r>
-        <w:rPr>
-          <w:lang w:val="en-AT"/>
-        </w:rPr>
-        <w:br/>
-        <w:t>Reduce the number of preparedness topics</w:t>
-      </w:r>
-      <w:r>
-        <w:rPr>
-          <w:lang w:val="en-AT"/>
-        </w:rPr>
-        <w:br/>
-        <w:t>Limit background sync and focus on manual refresh</w:t>
-      </w:r>
-      <w:r>
-        <w:rPr>
-          <w:lang w:val="en-AT"/>
-        </w:rPr>
-        <w:br/>
-        <w:t>Implement a simplified national overview without a fully interactive map</w:t>
-      </w:r>
-    </w:p>
-    <w:p>
-      <w:pPr>
-        <w:rPr>
-          <w:lang w:val="en-AT"/>
-        </w:rPr>
-      </w:pPr>
-      <w:r>
-        <w:rPr>
-          <w:lang w:val="en-AT"/>
-        </w:rPr>
-        <w:t>These contingency plans keep the project realistic while preserving the main concept.</w:t>
+        <w:t xml:space="preserve">Another risk is that the learning </w:t>
+      </w:r>
+      <w:r>
+        <w:rPr>
+          <w:lang w:val="en-AT"/>
+        </w:rPr>
+        <w:t>centre</w:t>
+      </w:r>
+      <w:r>
+        <w:rPr>
+          <w:lang w:val="en-AT"/>
+        </w:rPr>
+        <w:t xml:space="preserve"> may become too large. If there is not enough time to implement all preparedness topics, the project can focus on </w:t>
+      </w:r>
+      <w:r>
+        <w:rPr>
+          <w:lang w:val="en-AT"/>
+        </w:rPr>
+        <w:t>two</w:t>
+      </w:r>
+      <w:r>
+        <w:rPr>
+          <w:lang w:val="en-AT"/>
+        </w:rPr>
+        <w:t xml:space="preserve"> complete topics instead of many incomplete ones. A smaller but polished learning </w:t>
+      </w:r>
+      <w:r>
+        <w:rPr>
+          <w:lang w:val="en-AT"/>
+        </w:rPr>
+        <w:t>centre</w:t>
+      </w:r>
+      <w:r>
+        <w:rPr>
+          <w:lang w:val="en-AT"/>
+        </w:rPr>
+        <w:t xml:space="preserve"> is better than a larger unfinished one.</w:t>
+      </w:r>
+    </w:p>
+    <w:p>
+      <w:pPr>
+        <w:rPr>
+          <w:lang w:val="en-AT"/>
+        </w:rPr>
+      </w:pPr>
+      <w:r>
+        <w:rPr>
+          <w:lang w:val="en-AT"/>
+        </w:rPr>
+        <w:t xml:space="preserve">The last development phase reserved for bug fixes is also part of the contingency plan to </w:t>
+      </w:r>
+      <w:r>
+        <w:rPr>
+          <w:lang w:val="en-AT"/>
+        </w:rPr>
+        <w:t>keep the project realistic while preserving the main concept.</w:t>
       </w:r>
     </w:p>
     <w:p>
@@ -1576,7 +1643,61 @@
         <w:rPr>
           <w:lang w:val="en-AT"/>
         </w:rPr>
-        <w:t>The evaluation will check whether the app achieved its planned goals: providing useful local disaster information, supporting preparedness learning, and offering a clear and usable mobile experience.</w:t>
+        <w:t xml:space="preserve">The evaluation will check whether the app achieved its planned goals: </w:t>
+      </w:r>
+    </w:p>
+    <w:p>
+      <w:pPr>
+        <w:pStyle w:val="ListParagraph"/>
+        <w:numPr>
+          <w:ilvl w:val="0"/>
+          <w:numId w:val="2"/>
+        </w:numPr>
+        <w:rPr>
+          <w:lang w:val="en-AT"/>
+        </w:rPr>
+      </w:pPr>
+      <w:r>
+        <w:rPr>
+          <w:lang w:val="en-AT"/>
+        </w:rPr>
+        <w:t xml:space="preserve">providing useful local disaster information, </w:t>
+      </w:r>
+    </w:p>
+    <w:p>
+      <w:pPr>
+        <w:pStyle w:val="ListParagraph"/>
+        <w:numPr>
+          <w:ilvl w:val="0"/>
+          <w:numId w:val="2"/>
+        </w:numPr>
+        <w:rPr>
+          <w:lang w:val="en-AT"/>
+        </w:rPr>
+      </w:pPr>
+      <w:r>
+        <w:rPr>
+          <w:lang w:val="en-AT"/>
+        </w:rPr>
+        <w:t xml:space="preserve">supporting preparedness learning, and </w:t>
+      </w:r>
+    </w:p>
+    <w:p>
+      <w:pPr>
+        <w:pStyle w:val="ListParagraph"/>
+        <w:numPr>
+          <w:ilvl w:val="0"/>
+          <w:numId w:val="2"/>
+        </w:numPr>
+        <w:rPr>
+          <w:lang w:val="en-AT"/>
+        </w:rPr>
+      </w:pPr>
+      <w:r>
+        <w:rPr>
+          <w:lang w:val="en-AT"/>
+        </w:rPr>
+        <w:t>offering a clear and usable mobile experience.</w:t>
       </w:r>
     </w:p>
     <w:p>
@@ -1602,199 +1723,1691 @@
         <w:rPr>
           <w:lang w:val="en-AT"/>
         </w:rPr>
-        <w:t>Functional testing checks whether the app features work as expected. This includes:</w:t>
-      </w:r>
-    </w:p>
-    <w:p>
-      <w:pPr>
-        <w:rPr>
-          <w:lang w:val="en-AT"/>
-        </w:rPr>
-      </w:pPr>
-      <w:r>
-        <w:rPr>
-          <w:lang w:val="en-AT"/>
-        </w:rPr>
-        <w:t>GPS location is detected correctly</w:t>
-      </w:r>
-      <w:r>
-        <w:rPr>
-          <w:lang w:val="en-AT"/>
-        </w:rPr>
-        <w:br/>
-        <w:t>Custom location changes dashboard data</w:t>
-      </w:r>
-      <w:r>
-        <w:rPr>
-          <w:lang w:val="en-AT"/>
-        </w:rPr>
-        <w:br/>
-        <w:t>Weather and alert API data is displayed correctly</w:t>
-      </w:r>
-      <w:r>
-        <w:rPr>
-          <w:lang w:val="en-AT"/>
-        </w:rPr>
-        <w:br/>
-        <w:t>SQLite stores user progress and selected locations</w:t>
-      </w:r>
-      <w:r>
-        <w:rPr>
-          <w:lang w:val="en-AT"/>
-        </w:rPr>
-        <w:br/>
-        <w:t>Notifications are scheduled correctly</w:t>
-      </w:r>
-      <w:r>
-        <w:rPr>
-          <w:lang w:val="en-AT"/>
-        </w:rPr>
-        <w:br/>
-        <w:t>Preparedness badges are granted after completing checklists and quizzes</w:t>
-      </w:r>
-      <w:r>
-        <w:rPr>
-          <w:lang w:val="en-AT"/>
-        </w:rPr>
-        <w:br/>
-        <w:t>Preparedness status expires after the expected time</w:t>
-      </w:r>
-      <w:r>
-        <w:rPr>
-          <w:lang w:val="en-AT"/>
-        </w:rPr>
-        <w:br/>
-        <w:t>Emergency resources are easy to access</w:t>
-      </w:r>
-    </w:p>
-    <w:p>
-      <w:pPr>
-        <w:rPr>
-          <w:lang w:val="en-AT"/>
-        </w:rPr>
-      </w:pPr>
-      <w:r>
-        <w:rPr>
-          <w:lang w:val="en-AT"/>
-        </w:rPr>
-        <w:t>Usability testing checks whether users can understand and use the app. Test users can be asked to complete tasks such as:</w:t>
-      </w:r>
-    </w:p>
-    <w:p>
-      <w:pPr>
-        <w:rPr>
-          <w:lang w:val="en-AT"/>
-        </w:rPr>
-      </w:pPr>
-      <w:r>
-        <w:rPr>
-          <w:lang w:val="en-AT"/>
-        </w:rPr>
-        <w:t>Check the current weather and alert status for their location</w:t>
-      </w:r>
-      <w:r>
-        <w:rPr>
-          <w:lang w:val="en-AT"/>
-        </w:rPr>
-        <w:br/>
-        <w:t>Switch to a custom location</w:t>
-      </w:r>
-      <w:r>
-        <w:rPr>
-          <w:lang w:val="en-AT"/>
-        </w:rPr>
-        <w:br/>
-        <w:t>Find an emergency number</w:t>
-      </w:r>
-      <w:r>
-        <w:rPr>
-          <w:lang w:val="en-AT"/>
-        </w:rPr>
-        <w:br/>
-        <w:t>Complete a preparedness checklist</w:t>
-      </w:r>
-      <w:r>
-        <w:rPr>
-          <w:lang w:val="en-AT"/>
-        </w:rPr>
-        <w:br/>
-        <w:t>Take a quiz and receive a badge</w:t>
-      </w:r>
-      <w:r>
-        <w:rPr>
-          <w:lang w:val="en-AT"/>
-        </w:rPr>
-        <w:br/>
-        <w:t>Find the license and credits section</w:t>
-      </w:r>
-    </w:p>
-    <w:p>
-      <w:pPr>
-        <w:rPr>
-          <w:lang w:val="en-AT"/>
-        </w:rPr>
-      </w:pPr>
-      <w:r>
-        <w:rPr>
-          <w:lang w:val="en-AT"/>
-        </w:rPr>
-        <w:t>Feedback can be collected using Google Forms. The form should include both rating questions and open text questions. Example evaluation questions include:</w:t>
-      </w:r>
-    </w:p>
-    <w:p>
-      <w:pPr>
-        <w:rPr>
-          <w:lang w:val="en-AT"/>
-        </w:rPr>
-      </w:pPr>
-      <w:r>
-        <w:rPr>
-          <w:lang w:val="en-AT"/>
-        </w:rPr>
-        <w:t>Was the dashboard easy to understand?</w:t>
-      </w:r>
-      <w:r>
-        <w:rPr>
-          <w:lang w:val="en-AT"/>
-        </w:rPr>
-        <w:br/>
-        <w:t>Could you find emergency numbers quickly?</w:t>
-      </w:r>
-      <w:r>
-        <w:rPr>
-          <w:lang w:val="en-AT"/>
-        </w:rPr>
-        <w:br/>
-        <w:t>Did the learning mode help you understand how to prepare?</w:t>
-      </w:r>
-      <w:r>
-        <w:rPr>
-          <w:lang w:val="en-AT"/>
-        </w:rPr>
-        <w:br/>
-        <w:t>Was the app navigation clear?</w:t>
-      </w:r>
-      <w:r>
-        <w:rPr>
-          <w:lang w:val="en-AT"/>
-        </w:rPr>
-        <w:br/>
-        <w:t>Which feature felt most useful?</w:t>
-      </w:r>
-      <w:r>
-        <w:rPr>
-          <w:lang w:val="en-AT"/>
-        </w:rPr>
-        <w:br/>
-        <w:t>Which part was confusing or unnecessary?</w:t>
-      </w:r>
-      <w:r>
-        <w:rPr>
-          <w:lang w:val="en-AT"/>
-        </w:rPr>
-        <w:br/>
-        <w:t>Would you use this app during a real weather or disaster situation?</w:t>
-      </w:r>
+        <w:t>Functional testing checks whether the app features work as expected</w:t>
+      </w:r>
+      <w:r>
+        <w:rPr>
+          <w:lang w:val="en-AT"/>
+        </w:rPr>
+        <w:t>, as seen In Table 1.</w:t>
+      </w:r>
+    </w:p>
+    <w:tbl>
+      <w:tblPr>
+        <w:tblStyle w:val="GridTable4-Accent1"/>
+        <w:tblW w:w="0" w:type="auto"/>
+        <w:tblLook w:val="04A0" w:firstRow="1" w:lastRow="0" w:firstColumn="1" w:lastColumn="0" w:noHBand="0" w:noVBand="1"/>
+      </w:tblPr>
+      <w:tblGrid>
+        <w:gridCol w:w="1980"/>
+        <w:gridCol w:w="5528"/>
+        <w:gridCol w:w="1508"/>
+      </w:tblGrid>
+      <w:tr>
+        <w:trPr>
+          <w:cnfStyle w:val="100000000000" w:firstRow="1" w:lastRow="0" w:firstColumn="0" w:lastColumn="0" w:oddVBand="0" w:evenVBand="0" w:oddHBand="0" w:evenHBand="0" w:firstRowFirstColumn="0" w:firstRowLastColumn="0" w:lastRowFirstColumn="0" w:lastRowLastColumn="0"/>
+          <w:trHeight w:val="283"/>
+        </w:trPr>
+        <w:tc>
+          <w:tcPr>
+            <w:cnfStyle w:val="001000000000" w:firstRow="0" w:lastRow="0" w:firstColumn="1" w:lastColumn="0" w:oddVBand="0" w:evenVBand="0" w:oddHBand="0" w:evenHBand="0" w:firstRowFirstColumn="0" w:firstRowLastColumn="0" w:lastRowFirstColumn="0" w:lastRowLastColumn="0"/>
+            <w:tcW w:w="1980" w:type="dxa"/>
+            <w:vAlign w:val="center"/>
+          </w:tcPr>
+          <w:p>
+            <w:pPr>
+              <w:rPr>
+                <w:lang w:val="en-AT"/>
+              </w:rPr>
+            </w:pPr>
+            <w:r>
+              <w:rPr>
+                <w:lang w:val="en-AT"/>
+              </w:rPr>
+              <w:t>Feature</w:t>
+            </w:r>
+          </w:p>
+        </w:tc>
+        <w:tc>
+          <w:tcPr>
+            <w:tcW w:w="5528" w:type="dxa"/>
+            <w:vAlign w:val="center"/>
+          </w:tcPr>
+          <w:p>
+            <w:pPr>
+              <w:cnfStyle w:val="100000000000" w:firstRow="1" w:lastRow="0" w:firstColumn="0" w:lastColumn="0" w:oddVBand="0" w:evenVBand="0" w:oddHBand="0" w:evenHBand="0" w:firstRowFirstColumn="0" w:firstRowLastColumn="0" w:lastRowFirstColumn="0" w:lastRowLastColumn="0"/>
+              <w:rPr>
+                <w:lang w:val="en-AT"/>
+              </w:rPr>
+            </w:pPr>
+            <w:r>
+              <w:rPr>
+                <w:lang w:val="en-AT"/>
+              </w:rPr>
+              <w:t>Expectation</w:t>
+            </w:r>
+          </w:p>
+        </w:tc>
+        <w:tc>
+          <w:tcPr>
+            <w:tcW w:w="1508" w:type="dxa"/>
+            <w:vAlign w:val="center"/>
+          </w:tcPr>
+          <w:p>
+            <w:pPr>
+              <w:cnfStyle w:val="100000000000" w:firstRow="1" w:lastRow="0" w:firstColumn="0" w:lastColumn="0" w:oddVBand="0" w:evenVBand="0" w:oddHBand="0" w:evenHBand="0" w:firstRowFirstColumn="0" w:firstRowLastColumn="0" w:lastRowFirstColumn="0" w:lastRowLastColumn="0"/>
+              <w:rPr>
+                <w:lang w:val="en-AT"/>
+              </w:rPr>
+            </w:pPr>
+            <w:r>
+              <w:rPr>
+                <w:lang w:val="en-AT"/>
+              </w:rPr>
+              <w:t>Passed (y/n)</w:t>
+            </w:r>
+          </w:p>
+        </w:tc>
+      </w:tr>
+      <w:tr>
+        <w:trPr>
+          <w:cnfStyle w:val="000000100000" w:firstRow="0" w:lastRow="0" w:firstColumn="0" w:lastColumn="0" w:oddVBand="0" w:evenVBand="0" w:oddHBand="1" w:evenHBand="0" w:firstRowFirstColumn="0" w:firstRowLastColumn="0" w:lastRowFirstColumn="0" w:lastRowLastColumn="0"/>
+          <w:trHeight w:val="283"/>
+        </w:trPr>
+        <w:tc>
+          <w:tcPr>
+            <w:cnfStyle w:val="001000000000" w:firstRow="0" w:lastRow="0" w:firstColumn="1" w:lastColumn="0" w:oddVBand="0" w:evenVBand="0" w:oddHBand="0" w:evenHBand="0" w:firstRowFirstColumn="0" w:firstRowLastColumn="0" w:lastRowFirstColumn="0" w:lastRowLastColumn="0"/>
+            <w:tcW w:w="1980" w:type="dxa"/>
+            <w:vAlign w:val="center"/>
+          </w:tcPr>
+          <w:p>
+            <w:pPr>
+              <w:rPr>
+                <w:lang w:val="en-AT"/>
+              </w:rPr>
+            </w:pPr>
+            <w:r>
+              <w:rPr>
+                <w:lang w:val="en-AT"/>
+              </w:rPr>
+              <w:t>Dashboard tab</w:t>
+            </w:r>
+          </w:p>
+        </w:tc>
+        <w:tc>
+          <w:tcPr>
+            <w:tcW w:w="5528" w:type="dxa"/>
+            <w:vAlign w:val="center"/>
+          </w:tcPr>
+          <w:p>
+            <w:pPr>
+              <w:spacing w:line="259" w:lineRule="auto"/>
+              <w:cnfStyle w:val="000000100000" w:firstRow="0" w:lastRow="0" w:firstColumn="0" w:lastColumn="0" w:oddVBand="0" w:evenVBand="0" w:oddHBand="1" w:evenHBand="0" w:firstRowFirstColumn="0" w:firstRowLastColumn="0" w:lastRowFirstColumn="0" w:lastRowLastColumn="0"/>
+              <w:rPr>
+                <w:lang w:val="en-AT"/>
+              </w:rPr>
+            </w:pPr>
+            <w:r>
+              <w:rPr>
+                <w:lang w:val="en-AT"/>
+              </w:rPr>
+              <w:t xml:space="preserve">GPS location is </w:t>
+            </w:r>
+            <w:r>
+              <w:rPr>
+                <w:lang w:val="en-AT"/>
+              </w:rPr>
+              <w:t xml:space="preserve">accessible </w:t>
+            </w:r>
+            <w:r>
+              <w:rPr>
+                <w:lang w:val="en-AT"/>
+              </w:rPr>
+              <w:t>detected correctly</w:t>
+            </w:r>
+          </w:p>
+        </w:tc>
+        <w:tc>
+          <w:tcPr>
+            <w:tcW w:w="1508" w:type="dxa"/>
+            <w:vAlign w:val="center"/>
+          </w:tcPr>
+          <w:p>
+            <w:pPr>
+              <w:cnfStyle w:val="000000100000" w:firstRow="0" w:lastRow="0" w:firstColumn="0" w:lastColumn="0" w:oddVBand="0" w:evenVBand="0" w:oddHBand="1" w:evenHBand="0" w:firstRowFirstColumn="0" w:firstRowLastColumn="0" w:lastRowFirstColumn="0" w:lastRowLastColumn="0"/>
+              <w:rPr>
+                <w:lang w:val="en-AT"/>
+              </w:rPr>
+            </w:pPr>
+          </w:p>
+        </w:tc>
+      </w:tr>
+      <w:tr>
+        <w:trPr>
+          <w:trHeight w:val="283"/>
+        </w:trPr>
+        <w:tc>
+          <w:tcPr>
+            <w:cnfStyle w:val="001000000000" w:firstRow="0" w:lastRow="0" w:firstColumn="1" w:lastColumn="0" w:oddVBand="0" w:evenVBand="0" w:oddHBand="0" w:evenHBand="0" w:firstRowFirstColumn="0" w:firstRowLastColumn="0" w:lastRowFirstColumn="0" w:lastRowLastColumn="0"/>
+            <w:tcW w:w="1980" w:type="dxa"/>
+            <w:vAlign w:val="center"/>
+          </w:tcPr>
+          <w:p>
+            <w:pPr>
+              <w:rPr>
+                <w:lang w:val="en-AT"/>
+              </w:rPr>
+            </w:pPr>
+            <w:r>
+              <w:rPr>
+                <w:lang w:val="en-AT"/>
+              </w:rPr>
+              <w:t>Dashboard tab</w:t>
+            </w:r>
+          </w:p>
+        </w:tc>
+        <w:tc>
+          <w:tcPr>
+            <w:tcW w:w="5528" w:type="dxa"/>
+            <w:vAlign w:val="center"/>
+          </w:tcPr>
+          <w:p>
+            <w:pPr>
+              <w:cnfStyle w:val="000000000000" w:firstRow="0" w:lastRow="0" w:firstColumn="0" w:lastColumn="0" w:oddVBand="0" w:evenVBand="0" w:oddHBand="0" w:evenHBand="0" w:firstRowFirstColumn="0" w:firstRowLastColumn="0" w:lastRowFirstColumn="0" w:lastRowLastColumn="0"/>
+              <w:rPr>
+                <w:lang w:val="en-AT"/>
+              </w:rPr>
+            </w:pPr>
+            <w:r>
+              <w:rPr>
+                <w:lang w:val="en-AT"/>
+              </w:rPr>
+              <w:t>Custom location changes dashboard data</w:t>
+            </w:r>
+          </w:p>
+        </w:tc>
+        <w:tc>
+          <w:tcPr>
+            <w:tcW w:w="1508" w:type="dxa"/>
+            <w:vAlign w:val="center"/>
+          </w:tcPr>
+          <w:p>
+            <w:pPr>
+              <w:cnfStyle w:val="000000000000" w:firstRow="0" w:lastRow="0" w:firstColumn="0" w:lastColumn="0" w:oddVBand="0" w:evenVBand="0" w:oddHBand="0" w:evenHBand="0" w:firstRowFirstColumn="0" w:firstRowLastColumn="0" w:lastRowFirstColumn="0" w:lastRowLastColumn="0"/>
+              <w:rPr>
+                <w:lang w:val="en-AT"/>
+              </w:rPr>
+            </w:pPr>
+          </w:p>
+        </w:tc>
+      </w:tr>
+      <w:tr>
+        <w:trPr>
+          <w:cnfStyle w:val="000000100000" w:firstRow="0" w:lastRow="0" w:firstColumn="0" w:lastColumn="0" w:oddVBand="0" w:evenVBand="0" w:oddHBand="1" w:evenHBand="0" w:firstRowFirstColumn="0" w:firstRowLastColumn="0" w:lastRowFirstColumn="0" w:lastRowLastColumn="0"/>
+          <w:trHeight w:val="283"/>
+        </w:trPr>
+        <w:tc>
+          <w:tcPr>
+            <w:cnfStyle w:val="001000000000" w:firstRow="0" w:lastRow="0" w:firstColumn="1" w:lastColumn="0" w:oddVBand="0" w:evenVBand="0" w:oddHBand="0" w:evenHBand="0" w:firstRowFirstColumn="0" w:firstRowLastColumn="0" w:lastRowFirstColumn="0" w:lastRowLastColumn="0"/>
+            <w:tcW w:w="1980" w:type="dxa"/>
+            <w:vAlign w:val="center"/>
+          </w:tcPr>
+          <w:p>
+            <w:pPr>
+              <w:rPr>
+                <w:lang w:val="en-AT"/>
+              </w:rPr>
+            </w:pPr>
+            <w:r>
+              <w:rPr>
+                <w:lang w:val="en-AT"/>
+              </w:rPr>
+              <w:t>Dashboard tab</w:t>
+            </w:r>
+          </w:p>
+        </w:tc>
+        <w:tc>
+          <w:tcPr>
+            <w:tcW w:w="5528" w:type="dxa"/>
+            <w:vAlign w:val="center"/>
+          </w:tcPr>
+          <w:p>
+            <w:pPr>
+              <w:cnfStyle w:val="000000100000" w:firstRow="0" w:lastRow="0" w:firstColumn="0" w:lastColumn="0" w:oddVBand="0" w:evenVBand="0" w:oddHBand="1" w:evenHBand="0" w:firstRowFirstColumn="0" w:firstRowLastColumn="0" w:lastRowFirstColumn="0" w:lastRowLastColumn="0"/>
+              <w:rPr>
+                <w:lang w:val="en-AT"/>
+              </w:rPr>
+            </w:pPr>
+            <w:r>
+              <w:rPr>
+                <w:lang w:val="en-AT"/>
+              </w:rPr>
+              <w:t>Weather and alert API data is displayed correctly</w:t>
+            </w:r>
+          </w:p>
+        </w:tc>
+        <w:tc>
+          <w:tcPr>
+            <w:tcW w:w="1508" w:type="dxa"/>
+            <w:vAlign w:val="center"/>
+          </w:tcPr>
+          <w:p>
+            <w:pPr>
+              <w:cnfStyle w:val="000000100000" w:firstRow="0" w:lastRow="0" w:firstColumn="0" w:lastColumn="0" w:oddVBand="0" w:evenVBand="0" w:oddHBand="1" w:evenHBand="0" w:firstRowFirstColumn="0" w:firstRowLastColumn="0" w:lastRowFirstColumn="0" w:lastRowLastColumn="0"/>
+              <w:rPr>
+                <w:lang w:val="en-AT"/>
+              </w:rPr>
+            </w:pPr>
+          </w:p>
+        </w:tc>
+      </w:tr>
+      <w:tr>
+        <w:trPr>
+          <w:trHeight w:val="283"/>
+        </w:trPr>
+        <w:tc>
+          <w:tcPr>
+            <w:cnfStyle w:val="001000000000" w:firstRow="0" w:lastRow="0" w:firstColumn="1" w:lastColumn="0" w:oddVBand="0" w:evenVBand="0" w:oddHBand="0" w:evenHBand="0" w:firstRowFirstColumn="0" w:firstRowLastColumn="0" w:lastRowFirstColumn="0" w:lastRowLastColumn="0"/>
+            <w:tcW w:w="1980" w:type="dxa"/>
+            <w:vAlign w:val="center"/>
+          </w:tcPr>
+          <w:p>
+            <w:pPr>
+              <w:rPr>
+                <w:lang w:val="en-AT"/>
+              </w:rPr>
+            </w:pPr>
+            <w:r>
+              <w:rPr>
+                <w:lang w:val="en-AT"/>
+              </w:rPr>
+              <w:t>Local storage</w:t>
+            </w:r>
+          </w:p>
+        </w:tc>
+        <w:tc>
+          <w:tcPr>
+            <w:tcW w:w="5528" w:type="dxa"/>
+            <w:vAlign w:val="center"/>
+          </w:tcPr>
+          <w:p>
+            <w:pPr>
+              <w:cnfStyle w:val="000000000000" w:firstRow="0" w:lastRow="0" w:firstColumn="0" w:lastColumn="0" w:oddVBand="0" w:evenVBand="0" w:oddHBand="0" w:evenHBand="0" w:firstRowFirstColumn="0" w:firstRowLastColumn="0" w:lastRowFirstColumn="0" w:lastRowLastColumn="0"/>
+              <w:rPr>
+                <w:lang w:val="en-AT"/>
+              </w:rPr>
+            </w:pPr>
+            <w:r>
+              <w:rPr>
+                <w:lang w:val="en-AT"/>
+              </w:rPr>
+              <w:t>Closing and reopening the app does not reset any saved data</w:t>
+            </w:r>
+          </w:p>
+        </w:tc>
+        <w:tc>
+          <w:tcPr>
+            <w:tcW w:w="1508" w:type="dxa"/>
+            <w:vAlign w:val="center"/>
+          </w:tcPr>
+          <w:p>
+            <w:pPr>
+              <w:cnfStyle w:val="000000000000" w:firstRow="0" w:lastRow="0" w:firstColumn="0" w:lastColumn="0" w:oddVBand="0" w:evenVBand="0" w:oddHBand="0" w:evenHBand="0" w:firstRowFirstColumn="0" w:firstRowLastColumn="0" w:lastRowFirstColumn="0" w:lastRowLastColumn="0"/>
+              <w:rPr>
+                <w:lang w:val="en-AT"/>
+              </w:rPr>
+            </w:pPr>
+          </w:p>
+        </w:tc>
+      </w:tr>
+      <w:tr>
+        <w:trPr>
+          <w:cnfStyle w:val="000000100000" w:firstRow="0" w:lastRow="0" w:firstColumn="0" w:lastColumn="0" w:oddVBand="0" w:evenVBand="0" w:oddHBand="1" w:evenHBand="0" w:firstRowFirstColumn="0" w:firstRowLastColumn="0" w:lastRowFirstColumn="0" w:lastRowLastColumn="0"/>
+          <w:trHeight w:val="283"/>
+        </w:trPr>
+        <w:tc>
+          <w:tcPr>
+            <w:cnfStyle w:val="001000000000" w:firstRow="0" w:lastRow="0" w:firstColumn="1" w:lastColumn="0" w:oddVBand="0" w:evenVBand="0" w:oddHBand="0" w:evenHBand="0" w:firstRowFirstColumn="0" w:firstRowLastColumn="0" w:lastRowFirstColumn="0" w:lastRowLastColumn="0"/>
+            <w:tcW w:w="1980" w:type="dxa"/>
+            <w:vAlign w:val="center"/>
+          </w:tcPr>
+          <w:p>
+            <w:pPr>
+              <w:rPr>
+                <w:lang w:val="en-AT"/>
+              </w:rPr>
+            </w:pPr>
+            <w:r>
+              <w:rPr>
+                <w:lang w:val="en-AT"/>
+              </w:rPr>
+              <w:t>Notifications</w:t>
+            </w:r>
+          </w:p>
+        </w:tc>
+        <w:tc>
+          <w:tcPr>
+            <w:tcW w:w="5528" w:type="dxa"/>
+            <w:vAlign w:val="center"/>
+          </w:tcPr>
+          <w:p>
+            <w:pPr>
+              <w:cnfStyle w:val="000000100000" w:firstRow="0" w:lastRow="0" w:firstColumn="0" w:lastColumn="0" w:oddVBand="0" w:evenVBand="0" w:oddHBand="1" w:evenHBand="0" w:firstRowFirstColumn="0" w:firstRowLastColumn="0" w:lastRowFirstColumn="0" w:lastRowLastColumn="0"/>
+              <w:rPr>
+                <w:lang w:val="en-AT"/>
+              </w:rPr>
+            </w:pPr>
+            <w:r>
+              <w:rPr>
+                <w:lang w:val="en-AT"/>
+              </w:rPr>
+              <w:t xml:space="preserve">Notifications are scheduled </w:t>
+            </w:r>
+            <w:r>
+              <w:rPr>
+                <w:lang w:val="en-AT"/>
+              </w:rPr>
+              <w:t>correctly and triggered at the expected time</w:t>
+            </w:r>
+          </w:p>
+        </w:tc>
+        <w:tc>
+          <w:tcPr>
+            <w:tcW w:w="1508" w:type="dxa"/>
+            <w:vAlign w:val="center"/>
+          </w:tcPr>
+          <w:p>
+            <w:pPr>
+              <w:cnfStyle w:val="000000100000" w:firstRow="0" w:lastRow="0" w:firstColumn="0" w:lastColumn="0" w:oddVBand="0" w:evenVBand="0" w:oddHBand="1" w:evenHBand="0" w:firstRowFirstColumn="0" w:firstRowLastColumn="0" w:lastRowFirstColumn="0" w:lastRowLastColumn="0"/>
+              <w:rPr>
+                <w:lang w:val="en-AT"/>
+              </w:rPr>
+            </w:pPr>
+          </w:p>
+        </w:tc>
+      </w:tr>
+      <w:tr>
+        <w:trPr>
+          <w:trHeight w:val="283"/>
+        </w:trPr>
+        <w:tc>
+          <w:tcPr>
+            <w:cnfStyle w:val="001000000000" w:firstRow="0" w:lastRow="0" w:firstColumn="1" w:lastColumn="0" w:oddVBand="0" w:evenVBand="0" w:oddHBand="0" w:evenHBand="0" w:firstRowFirstColumn="0" w:firstRowLastColumn="0" w:lastRowFirstColumn="0" w:lastRowLastColumn="0"/>
+            <w:tcW w:w="1980" w:type="dxa"/>
+            <w:vAlign w:val="center"/>
+          </w:tcPr>
+          <w:p>
+            <w:pPr>
+              <w:rPr>
+                <w:lang w:val="en-AT"/>
+              </w:rPr>
+            </w:pPr>
+            <w:r>
+              <w:rPr>
+                <w:lang w:val="en-AT"/>
+              </w:rPr>
+              <w:t>Learning centre</w:t>
+            </w:r>
+          </w:p>
+        </w:tc>
+        <w:tc>
+          <w:tcPr>
+            <w:tcW w:w="5528" w:type="dxa"/>
+            <w:vAlign w:val="center"/>
+          </w:tcPr>
+          <w:p>
+            <w:pPr>
+              <w:cnfStyle w:val="000000000000" w:firstRow="0" w:lastRow="0" w:firstColumn="0" w:lastColumn="0" w:oddVBand="0" w:evenVBand="0" w:oddHBand="0" w:evenHBand="0" w:firstRowFirstColumn="0" w:firstRowLastColumn="0" w:lastRowFirstColumn="0" w:lastRowLastColumn="0"/>
+              <w:rPr>
+                <w:lang w:val="en-AT"/>
+              </w:rPr>
+            </w:pPr>
+            <w:r>
+              <w:rPr>
+                <w:lang w:val="en-AT"/>
+              </w:rPr>
+              <w:t>Preparedness badges are granted after completing checklists and quizzes</w:t>
+            </w:r>
+          </w:p>
+        </w:tc>
+        <w:tc>
+          <w:tcPr>
+            <w:tcW w:w="1508" w:type="dxa"/>
+            <w:vAlign w:val="center"/>
+          </w:tcPr>
+          <w:p>
+            <w:pPr>
+              <w:cnfStyle w:val="000000000000" w:firstRow="0" w:lastRow="0" w:firstColumn="0" w:lastColumn="0" w:oddVBand="0" w:evenVBand="0" w:oddHBand="0" w:evenHBand="0" w:firstRowFirstColumn="0" w:firstRowLastColumn="0" w:lastRowFirstColumn="0" w:lastRowLastColumn="0"/>
+              <w:rPr>
+                <w:lang w:val="en-AT"/>
+              </w:rPr>
+            </w:pPr>
+          </w:p>
+        </w:tc>
+      </w:tr>
+      <w:tr>
+        <w:trPr>
+          <w:cnfStyle w:val="000000100000" w:firstRow="0" w:lastRow="0" w:firstColumn="0" w:lastColumn="0" w:oddVBand="0" w:evenVBand="0" w:oddHBand="1" w:evenHBand="0" w:firstRowFirstColumn="0" w:firstRowLastColumn="0" w:lastRowFirstColumn="0" w:lastRowLastColumn="0"/>
+          <w:trHeight w:val="283"/>
+        </w:trPr>
+        <w:tc>
+          <w:tcPr>
+            <w:cnfStyle w:val="001000000000" w:firstRow="0" w:lastRow="0" w:firstColumn="1" w:lastColumn="0" w:oddVBand="0" w:evenVBand="0" w:oddHBand="0" w:evenHBand="0" w:firstRowFirstColumn="0" w:firstRowLastColumn="0" w:lastRowFirstColumn="0" w:lastRowLastColumn="0"/>
+            <w:tcW w:w="1980" w:type="dxa"/>
+            <w:vAlign w:val="center"/>
+          </w:tcPr>
+          <w:p>
+            <w:pPr>
+              <w:rPr>
+                <w:lang w:val="en-AT"/>
+              </w:rPr>
+            </w:pPr>
+            <w:r>
+              <w:rPr>
+                <w:lang w:val="en-AT"/>
+              </w:rPr>
+              <w:t>Learning centre</w:t>
+            </w:r>
+          </w:p>
+        </w:tc>
+        <w:tc>
+          <w:tcPr>
+            <w:tcW w:w="5528" w:type="dxa"/>
+            <w:vAlign w:val="center"/>
+          </w:tcPr>
+          <w:p>
+            <w:pPr>
+              <w:cnfStyle w:val="000000100000" w:firstRow="0" w:lastRow="0" w:firstColumn="0" w:lastColumn="0" w:oddVBand="0" w:evenVBand="0" w:oddHBand="1" w:evenHBand="0" w:firstRowFirstColumn="0" w:firstRowLastColumn="0" w:lastRowFirstColumn="0" w:lastRowLastColumn="0"/>
+              <w:rPr>
+                <w:lang w:val="en-AT"/>
+              </w:rPr>
+            </w:pPr>
+            <w:r>
+              <w:rPr>
+                <w:lang w:val="en-AT"/>
+              </w:rPr>
+              <w:t>Preparedness status expires after the expected time</w:t>
+            </w:r>
+          </w:p>
+        </w:tc>
+        <w:tc>
+          <w:tcPr>
+            <w:tcW w:w="1508" w:type="dxa"/>
+            <w:vAlign w:val="center"/>
+          </w:tcPr>
+          <w:p>
+            <w:pPr>
+              <w:cnfStyle w:val="000000100000" w:firstRow="0" w:lastRow="0" w:firstColumn="0" w:lastColumn="0" w:oddVBand="0" w:evenVBand="0" w:oddHBand="1" w:evenHBand="0" w:firstRowFirstColumn="0" w:firstRowLastColumn="0" w:lastRowFirstColumn="0" w:lastRowLastColumn="0"/>
+              <w:rPr>
+                <w:lang w:val="en-AT"/>
+              </w:rPr>
+            </w:pPr>
+          </w:p>
+        </w:tc>
+      </w:tr>
+      <w:tr>
+        <w:trPr>
+          <w:trHeight w:val="283"/>
+        </w:trPr>
+        <w:tc>
+          <w:tcPr>
+            <w:cnfStyle w:val="001000000000" w:firstRow="0" w:lastRow="0" w:firstColumn="1" w:lastColumn="0" w:oddVBand="0" w:evenVBand="0" w:oddHBand="0" w:evenHBand="0" w:firstRowFirstColumn="0" w:firstRowLastColumn="0" w:lastRowFirstColumn="0" w:lastRowLastColumn="0"/>
+            <w:tcW w:w="1980" w:type="dxa"/>
+            <w:vAlign w:val="center"/>
+          </w:tcPr>
+          <w:p>
+            <w:pPr>
+              <w:rPr>
+                <w:lang w:val="en-AT"/>
+              </w:rPr>
+            </w:pPr>
+            <w:r>
+              <w:rPr>
+                <w:lang w:val="en-AT"/>
+              </w:rPr>
+              <w:t>Emergency tab</w:t>
+            </w:r>
+          </w:p>
+        </w:tc>
+        <w:tc>
+          <w:tcPr>
+            <w:tcW w:w="5528" w:type="dxa"/>
+            <w:vAlign w:val="center"/>
+          </w:tcPr>
+          <w:p>
+            <w:pPr>
+              <w:cnfStyle w:val="000000000000" w:firstRow="0" w:lastRow="0" w:firstColumn="0" w:lastColumn="0" w:oddVBand="0" w:evenVBand="0" w:oddHBand="0" w:evenHBand="0" w:firstRowFirstColumn="0" w:firstRowLastColumn="0" w:lastRowFirstColumn="0" w:lastRowLastColumn="0"/>
+              <w:rPr>
+                <w:lang w:val="en-AT"/>
+              </w:rPr>
+            </w:pPr>
+            <w:r>
+              <w:rPr>
+                <w:lang w:val="en-AT"/>
+              </w:rPr>
+              <w:t xml:space="preserve">Emergency resources are </w:t>
+            </w:r>
+            <w:r>
+              <w:rPr>
+                <w:lang w:val="en-AT"/>
+              </w:rPr>
+              <w:t>available and work reliably</w:t>
+            </w:r>
+          </w:p>
+        </w:tc>
+        <w:tc>
+          <w:tcPr>
+            <w:tcW w:w="1508" w:type="dxa"/>
+            <w:vAlign w:val="center"/>
+          </w:tcPr>
+          <w:p>
+            <w:pPr>
+              <w:cnfStyle w:val="000000000000" w:firstRow="0" w:lastRow="0" w:firstColumn="0" w:lastColumn="0" w:oddVBand="0" w:evenVBand="0" w:oddHBand="0" w:evenHBand="0" w:firstRowFirstColumn="0" w:firstRowLastColumn="0" w:lastRowFirstColumn="0" w:lastRowLastColumn="0"/>
+              <w:rPr>
+                <w:lang w:val="en-AT"/>
+              </w:rPr>
+            </w:pPr>
+          </w:p>
+        </w:tc>
+      </w:tr>
+      <w:tr>
+        <w:trPr>
+          <w:cnfStyle w:val="000000100000" w:firstRow="0" w:lastRow="0" w:firstColumn="0" w:lastColumn="0" w:oddVBand="0" w:evenVBand="0" w:oddHBand="1" w:evenHBand="0" w:firstRowFirstColumn="0" w:firstRowLastColumn="0" w:lastRowFirstColumn="0" w:lastRowLastColumn="0"/>
+          <w:trHeight w:val="283"/>
+        </w:trPr>
+        <w:tc>
+          <w:tcPr>
+            <w:cnfStyle w:val="001000000000" w:firstRow="0" w:lastRow="0" w:firstColumn="1" w:lastColumn="0" w:oddVBand="0" w:evenVBand="0" w:oddHBand="0" w:evenHBand="0" w:firstRowFirstColumn="0" w:firstRowLastColumn="0" w:lastRowFirstColumn="0" w:lastRowLastColumn="0"/>
+            <w:tcW w:w="1980" w:type="dxa"/>
+            <w:vAlign w:val="center"/>
+          </w:tcPr>
+          <w:p>
+            <w:pPr>
+              <w:rPr>
+                <w:lang w:val="en-AT"/>
+              </w:rPr>
+            </w:pPr>
+            <w:r>
+              <w:rPr>
+                <w:lang w:val="en-AT"/>
+              </w:rPr>
+              <w:t>National view tab</w:t>
+            </w:r>
+          </w:p>
+        </w:tc>
+        <w:tc>
+          <w:tcPr>
+            <w:tcW w:w="5528" w:type="dxa"/>
+            <w:vAlign w:val="center"/>
+          </w:tcPr>
+          <w:p>
+            <w:pPr>
+              <w:cnfStyle w:val="000000100000" w:firstRow="0" w:lastRow="0" w:firstColumn="0" w:lastColumn="0" w:oddVBand="0" w:evenVBand="0" w:oddHBand="1" w:evenHBand="0" w:firstRowFirstColumn="0" w:firstRowLastColumn="0" w:lastRowFirstColumn="0" w:lastRowLastColumn="0"/>
+              <w:rPr>
+                <w:lang w:val="en-AT"/>
+              </w:rPr>
+            </w:pPr>
+            <w:r>
+              <w:rPr>
+                <w:lang w:val="en-AT"/>
+              </w:rPr>
+              <w:t>Weather and alert data is updated and displayed</w:t>
+            </w:r>
+          </w:p>
+        </w:tc>
+        <w:tc>
+          <w:tcPr>
+            <w:tcW w:w="1508" w:type="dxa"/>
+            <w:vAlign w:val="center"/>
+          </w:tcPr>
+          <w:p>
+            <w:pPr>
+              <w:cnfStyle w:val="000000100000" w:firstRow="0" w:lastRow="0" w:firstColumn="0" w:lastColumn="0" w:oddVBand="0" w:evenVBand="0" w:oddHBand="1" w:evenHBand="0" w:firstRowFirstColumn="0" w:firstRowLastColumn="0" w:lastRowFirstColumn="0" w:lastRowLastColumn="0"/>
+              <w:rPr>
+                <w:lang w:val="en-AT"/>
+              </w:rPr>
+            </w:pPr>
+          </w:p>
+        </w:tc>
+      </w:tr>
+      <w:tr>
+        <w:trPr>
+          <w:trHeight w:val="283"/>
+        </w:trPr>
+        <w:tc>
+          <w:tcPr>
+            <w:cnfStyle w:val="001000000000" w:firstRow="0" w:lastRow="0" w:firstColumn="1" w:lastColumn="0" w:oddVBand="0" w:evenVBand="0" w:oddHBand="0" w:evenHBand="0" w:firstRowFirstColumn="0" w:firstRowLastColumn="0" w:lastRowFirstColumn="0" w:lastRowLastColumn="0"/>
+            <w:tcW w:w="1980" w:type="dxa"/>
+            <w:vAlign w:val="center"/>
+          </w:tcPr>
+          <w:p>
+            <w:pPr>
+              <w:rPr>
+                <w:lang w:val="en-AT"/>
+              </w:rPr>
+            </w:pPr>
+            <w:r>
+              <w:rPr>
+                <w:lang w:val="en-AT"/>
+              </w:rPr>
+              <w:t>Manual data sync</w:t>
+            </w:r>
+          </w:p>
+        </w:tc>
+        <w:tc>
+          <w:tcPr>
+            <w:tcW w:w="5528" w:type="dxa"/>
+            <w:vAlign w:val="center"/>
+          </w:tcPr>
+          <w:p>
+            <w:pPr>
+              <w:cnfStyle w:val="000000000000" w:firstRow="0" w:lastRow="0" w:firstColumn="0" w:lastColumn="0" w:oddVBand="0" w:evenVBand="0" w:oddHBand="0" w:evenHBand="0" w:firstRowFirstColumn="0" w:firstRowLastColumn="0" w:lastRowFirstColumn="0" w:lastRowLastColumn="0"/>
+              <w:rPr>
+                <w:lang w:val="en-AT"/>
+              </w:rPr>
+            </w:pPr>
+            <w:r>
+              <w:rPr>
+                <w:lang w:val="en-AT"/>
+              </w:rPr>
+              <w:t>Triggering the manual sync button updates the data</w:t>
+            </w:r>
+          </w:p>
+        </w:tc>
+        <w:tc>
+          <w:tcPr>
+            <w:tcW w:w="1508" w:type="dxa"/>
+            <w:vAlign w:val="center"/>
+          </w:tcPr>
+          <w:p>
+            <w:pPr>
+              <w:cnfStyle w:val="000000000000" w:firstRow="0" w:lastRow="0" w:firstColumn="0" w:lastColumn="0" w:oddVBand="0" w:evenVBand="0" w:oddHBand="0" w:evenHBand="0" w:firstRowFirstColumn="0" w:firstRowLastColumn="0" w:lastRowFirstColumn="0" w:lastRowLastColumn="0"/>
+              <w:rPr>
+                <w:lang w:val="en-AT"/>
+              </w:rPr>
+            </w:pPr>
+          </w:p>
+        </w:tc>
+      </w:tr>
+    </w:tbl>
+    <w:p>
+      <w:pPr>
+        <w:pStyle w:val="Caption"/>
+        <w:rPr>
+          <w:lang w:val="en-AT"/>
+        </w:rPr>
+      </w:pPr>
+      <w:r>
+        <w:t xml:space="preserve">Table </w:t>
+      </w:r>
+      <w:r>
+        <w:fldChar w:fldCharType="begin"/>
+      </w:r>
+      <w:r>
+        <w:instrText xml:space="preserve"> SEQ Table \* ARABIC </w:instrText>
+      </w:r>
+      <w:r>
+        <w:fldChar w:fldCharType="separate"/>
+      </w:r>
+      <w:r>
+        <w:rPr>
+          <w:noProof/>
+        </w:rPr>
+        <w:t>1</w:t>
+      </w:r>
+      <w:r>
+        <w:fldChar w:fldCharType="end"/>
+      </w:r>
+      <w:r>
+        <w:t xml:space="preserve">: </w:t>
+      </w:r>
+      <w:proofErr w:type="spellStart"/>
+      <w:r>
+        <w:t>Functional</w:t>
+      </w:r>
+      <w:proofErr w:type="spellEnd"/>
+      <w:r>
+        <w:t xml:space="preserve"> </w:t>
+      </w:r>
+      <w:proofErr w:type="spellStart"/>
+      <w:r>
+        <w:t>testing</w:t>
+      </w:r>
+      <w:proofErr w:type="spellEnd"/>
+      <w:r>
+        <w:t xml:space="preserve"> </w:t>
+      </w:r>
+      <w:proofErr w:type="spellStart"/>
+      <w:r>
+        <w:t>checklist</w:t>
+      </w:r>
+      <w:proofErr w:type="spellEnd"/>
+    </w:p>
+    <w:p>
+      <w:pPr>
+        <w:rPr>
+          <w:lang w:val="en-AT"/>
+        </w:rPr>
+      </w:pPr>
+      <w:r>
+        <w:rPr>
+          <w:lang w:val="en-AT"/>
+        </w:rPr>
+        <w:t xml:space="preserve">Usability testing checks whether users can understand and use the app. Test users </w:t>
+      </w:r>
+      <w:r>
+        <w:rPr>
+          <w:lang w:val="en-AT"/>
+        </w:rPr>
+        <w:t>will b</w:t>
+      </w:r>
+      <w:r>
+        <w:rPr>
+          <w:lang w:val="en-AT"/>
+        </w:rPr>
+        <w:t>e asked to complete tasks</w:t>
+      </w:r>
+      <w:r>
+        <w:rPr>
+          <w:lang w:val="en-AT"/>
+        </w:rPr>
+        <w:t>, as seen in Table 2.</w:t>
+      </w:r>
+    </w:p>
+    <w:tbl>
+      <w:tblPr>
+        <w:tblStyle w:val="GridTable4-Accent1"/>
+        <w:tblW w:w="0" w:type="auto"/>
+        <w:tblLook w:val="04A0" w:firstRow="1" w:lastRow="0" w:firstColumn="1" w:lastColumn="0" w:noHBand="0" w:noVBand="1"/>
+      </w:tblPr>
+      <w:tblGrid>
+        <w:gridCol w:w="6232"/>
+        <w:gridCol w:w="2694"/>
+      </w:tblGrid>
+      <w:tr>
+        <w:trPr>
+          <w:cnfStyle w:val="100000000000" w:firstRow="1" w:lastRow="0" w:firstColumn="0" w:lastColumn="0" w:oddVBand="0" w:evenVBand="0" w:oddHBand="0" w:evenHBand="0" w:firstRowFirstColumn="0" w:firstRowLastColumn="0" w:lastRowFirstColumn="0" w:lastRowLastColumn="0"/>
+          <w:trHeight w:val="340"/>
+        </w:trPr>
+        <w:tc>
+          <w:tcPr>
+            <w:cnfStyle w:val="001000000000" w:firstRow="0" w:lastRow="0" w:firstColumn="1" w:lastColumn="0" w:oddVBand="0" w:evenVBand="0" w:oddHBand="0" w:evenHBand="0" w:firstRowFirstColumn="0" w:firstRowLastColumn="0" w:lastRowFirstColumn="0" w:lastRowLastColumn="0"/>
+            <w:tcW w:w="6232" w:type="dxa"/>
+            <w:vAlign w:val="center"/>
+          </w:tcPr>
+          <w:p>
+            <w:pPr>
+              <w:rPr>
+                <w:lang w:val="en-AT"/>
+              </w:rPr>
+            </w:pPr>
+            <w:r>
+              <w:rPr>
+                <w:lang w:val="en-AT"/>
+              </w:rPr>
+              <w:t>User task</w:t>
+            </w:r>
+          </w:p>
+        </w:tc>
+        <w:tc>
+          <w:tcPr>
+            <w:tcW w:w="2694" w:type="dxa"/>
+            <w:vAlign w:val="center"/>
+          </w:tcPr>
+          <w:p>
+            <w:pPr>
+              <w:cnfStyle w:val="100000000000" w:firstRow="1" w:lastRow="0" w:firstColumn="0" w:lastColumn="0" w:oddVBand="0" w:evenVBand="0" w:oddHBand="0" w:evenHBand="0" w:firstRowFirstColumn="0" w:firstRowLastColumn="0" w:lastRowFirstColumn="0" w:lastRowLastColumn="0"/>
+              <w:rPr>
+                <w:lang w:val="en-AT"/>
+              </w:rPr>
+            </w:pPr>
+            <w:r>
+              <w:rPr>
+                <w:lang w:val="en-AT"/>
+              </w:rPr>
+              <w:t>Achieved</w:t>
+            </w:r>
+            <w:r>
+              <w:rPr>
+                <w:lang w:val="en-AT"/>
+              </w:rPr>
+              <w:t xml:space="preserve"> (y/n)</w:t>
+            </w:r>
+          </w:p>
+        </w:tc>
+      </w:tr>
+      <w:tr>
+        <w:trPr>
+          <w:cnfStyle w:val="000000100000" w:firstRow="0" w:lastRow="0" w:firstColumn="0" w:lastColumn="0" w:oddVBand="0" w:evenVBand="0" w:oddHBand="1" w:evenHBand="0" w:firstRowFirstColumn="0" w:firstRowLastColumn="0" w:lastRowFirstColumn="0" w:lastRowLastColumn="0"/>
+          <w:trHeight w:val="340"/>
+        </w:trPr>
+        <w:tc>
+          <w:tcPr>
+            <w:cnfStyle w:val="001000000000" w:firstRow="0" w:lastRow="0" w:firstColumn="1" w:lastColumn="0" w:oddVBand="0" w:evenVBand="0" w:oddHBand="0" w:evenHBand="0" w:firstRowFirstColumn="0" w:firstRowLastColumn="0" w:lastRowFirstColumn="0" w:lastRowLastColumn="0"/>
+            <w:tcW w:w="6232" w:type="dxa"/>
+            <w:vAlign w:val="center"/>
+          </w:tcPr>
+          <w:p>
+            <w:pPr>
+              <w:spacing w:line="259" w:lineRule="auto"/>
+              <w:rPr>
+                <w:b w:val="0"/>
+                <w:bCs w:val="0"/>
+                <w:lang w:val="en-AT"/>
+              </w:rPr>
+            </w:pPr>
+            <w:r>
+              <w:rPr>
+                <w:b w:val="0"/>
+                <w:bCs w:val="0"/>
+                <w:lang w:val="en-AT"/>
+              </w:rPr>
+              <w:t xml:space="preserve">Check the current weather and alert status for </w:t>
+            </w:r>
+            <w:r>
+              <w:rPr>
+                <w:b w:val="0"/>
+                <w:bCs w:val="0"/>
+                <w:lang w:val="en-AT"/>
+              </w:rPr>
+              <w:t>your</w:t>
+            </w:r>
+            <w:r>
+              <w:rPr>
+                <w:b w:val="0"/>
+                <w:bCs w:val="0"/>
+                <w:lang w:val="en-AT"/>
+              </w:rPr>
+              <w:t xml:space="preserve"> location</w:t>
+            </w:r>
+          </w:p>
+        </w:tc>
+        <w:tc>
+          <w:tcPr>
+            <w:tcW w:w="2694" w:type="dxa"/>
+            <w:vAlign w:val="center"/>
+          </w:tcPr>
+          <w:p>
+            <w:pPr>
+              <w:cnfStyle w:val="000000100000" w:firstRow="0" w:lastRow="0" w:firstColumn="0" w:lastColumn="0" w:oddVBand="0" w:evenVBand="0" w:oddHBand="1" w:evenHBand="0" w:firstRowFirstColumn="0" w:firstRowLastColumn="0" w:lastRowFirstColumn="0" w:lastRowLastColumn="0"/>
+              <w:rPr>
+                <w:lang w:val="en-AT"/>
+              </w:rPr>
+            </w:pPr>
+          </w:p>
+        </w:tc>
+      </w:tr>
+      <w:tr>
+        <w:trPr>
+          <w:trHeight w:val="340"/>
+        </w:trPr>
+        <w:tc>
+          <w:tcPr>
+            <w:cnfStyle w:val="001000000000" w:firstRow="0" w:lastRow="0" w:firstColumn="1" w:lastColumn="0" w:oddVBand="0" w:evenVBand="0" w:oddHBand="0" w:evenHBand="0" w:firstRowFirstColumn="0" w:firstRowLastColumn="0" w:lastRowFirstColumn="0" w:lastRowLastColumn="0"/>
+            <w:tcW w:w="6232" w:type="dxa"/>
+            <w:vAlign w:val="center"/>
+          </w:tcPr>
+          <w:p>
+            <w:pPr>
+              <w:rPr>
+                <w:b w:val="0"/>
+                <w:bCs w:val="0"/>
+                <w:lang w:val="en-AT"/>
+              </w:rPr>
+            </w:pPr>
+            <w:r>
+              <w:rPr>
+                <w:b w:val="0"/>
+                <w:bCs w:val="0"/>
+                <w:lang w:val="en-AT"/>
+              </w:rPr>
+              <w:t>Switch to a custom location</w:t>
+            </w:r>
+          </w:p>
+        </w:tc>
+        <w:tc>
+          <w:tcPr>
+            <w:tcW w:w="2694" w:type="dxa"/>
+            <w:vAlign w:val="center"/>
+          </w:tcPr>
+          <w:p>
+            <w:pPr>
+              <w:cnfStyle w:val="000000000000" w:firstRow="0" w:lastRow="0" w:firstColumn="0" w:lastColumn="0" w:oddVBand="0" w:evenVBand="0" w:oddHBand="0" w:evenHBand="0" w:firstRowFirstColumn="0" w:firstRowLastColumn="0" w:lastRowFirstColumn="0" w:lastRowLastColumn="0"/>
+              <w:rPr>
+                <w:lang w:val="en-AT"/>
+              </w:rPr>
+            </w:pPr>
+          </w:p>
+        </w:tc>
+      </w:tr>
+      <w:tr>
+        <w:trPr>
+          <w:cnfStyle w:val="000000100000" w:firstRow="0" w:lastRow="0" w:firstColumn="0" w:lastColumn="0" w:oddVBand="0" w:evenVBand="0" w:oddHBand="1" w:evenHBand="0" w:firstRowFirstColumn="0" w:firstRowLastColumn="0" w:lastRowFirstColumn="0" w:lastRowLastColumn="0"/>
+          <w:trHeight w:val="340"/>
+        </w:trPr>
+        <w:tc>
+          <w:tcPr>
+            <w:cnfStyle w:val="001000000000" w:firstRow="0" w:lastRow="0" w:firstColumn="1" w:lastColumn="0" w:oddVBand="0" w:evenVBand="0" w:oddHBand="0" w:evenHBand="0" w:firstRowFirstColumn="0" w:firstRowLastColumn="0" w:lastRowFirstColumn="0" w:lastRowLastColumn="0"/>
+            <w:tcW w:w="6232" w:type="dxa"/>
+            <w:vAlign w:val="center"/>
+          </w:tcPr>
+          <w:p>
+            <w:pPr>
+              <w:rPr>
+                <w:b w:val="0"/>
+                <w:bCs w:val="0"/>
+                <w:lang w:val="en-AT"/>
+              </w:rPr>
+            </w:pPr>
+            <w:r>
+              <w:rPr>
+                <w:b w:val="0"/>
+                <w:bCs w:val="0"/>
+                <w:lang w:val="en-AT"/>
+              </w:rPr>
+              <w:t>Find an emergency number</w:t>
+            </w:r>
+          </w:p>
+        </w:tc>
+        <w:tc>
+          <w:tcPr>
+            <w:tcW w:w="2694" w:type="dxa"/>
+            <w:vAlign w:val="center"/>
+          </w:tcPr>
+          <w:p>
+            <w:pPr>
+              <w:cnfStyle w:val="000000100000" w:firstRow="0" w:lastRow="0" w:firstColumn="0" w:lastColumn="0" w:oddVBand="0" w:evenVBand="0" w:oddHBand="1" w:evenHBand="0" w:firstRowFirstColumn="0" w:firstRowLastColumn="0" w:lastRowFirstColumn="0" w:lastRowLastColumn="0"/>
+              <w:rPr>
+                <w:lang w:val="en-AT"/>
+              </w:rPr>
+            </w:pPr>
+          </w:p>
+        </w:tc>
+      </w:tr>
+      <w:tr>
+        <w:trPr>
+          <w:trHeight w:val="340"/>
+        </w:trPr>
+        <w:tc>
+          <w:tcPr>
+            <w:cnfStyle w:val="001000000000" w:firstRow="0" w:lastRow="0" w:firstColumn="1" w:lastColumn="0" w:oddVBand="0" w:evenVBand="0" w:oddHBand="0" w:evenHBand="0" w:firstRowFirstColumn="0" w:firstRowLastColumn="0" w:lastRowFirstColumn="0" w:lastRowLastColumn="0"/>
+            <w:tcW w:w="6232" w:type="dxa"/>
+            <w:vAlign w:val="center"/>
+          </w:tcPr>
+          <w:p>
+            <w:pPr>
+              <w:rPr>
+                <w:b w:val="0"/>
+                <w:bCs w:val="0"/>
+                <w:lang w:val="en-AT"/>
+              </w:rPr>
+            </w:pPr>
+            <w:r>
+              <w:rPr>
+                <w:b w:val="0"/>
+                <w:bCs w:val="0"/>
+                <w:lang w:val="en-AT"/>
+              </w:rPr>
+              <w:t>Complete a preparedness checklist</w:t>
+            </w:r>
+          </w:p>
+        </w:tc>
+        <w:tc>
+          <w:tcPr>
+            <w:tcW w:w="2694" w:type="dxa"/>
+            <w:vAlign w:val="center"/>
+          </w:tcPr>
+          <w:p>
+            <w:pPr>
+              <w:cnfStyle w:val="000000000000" w:firstRow="0" w:lastRow="0" w:firstColumn="0" w:lastColumn="0" w:oddVBand="0" w:evenVBand="0" w:oddHBand="0" w:evenHBand="0" w:firstRowFirstColumn="0" w:firstRowLastColumn="0" w:lastRowFirstColumn="0" w:lastRowLastColumn="0"/>
+              <w:rPr>
+                <w:lang w:val="en-AT"/>
+              </w:rPr>
+            </w:pPr>
+          </w:p>
+        </w:tc>
+      </w:tr>
+      <w:tr>
+        <w:trPr>
+          <w:cnfStyle w:val="000000100000" w:firstRow="0" w:lastRow="0" w:firstColumn="0" w:lastColumn="0" w:oddVBand="0" w:evenVBand="0" w:oddHBand="1" w:evenHBand="0" w:firstRowFirstColumn="0" w:firstRowLastColumn="0" w:lastRowFirstColumn="0" w:lastRowLastColumn="0"/>
+          <w:trHeight w:val="340"/>
+        </w:trPr>
+        <w:tc>
+          <w:tcPr>
+            <w:cnfStyle w:val="001000000000" w:firstRow="0" w:lastRow="0" w:firstColumn="1" w:lastColumn="0" w:oddVBand="0" w:evenVBand="0" w:oddHBand="0" w:evenHBand="0" w:firstRowFirstColumn="0" w:firstRowLastColumn="0" w:lastRowFirstColumn="0" w:lastRowLastColumn="0"/>
+            <w:tcW w:w="6232" w:type="dxa"/>
+            <w:vAlign w:val="center"/>
+          </w:tcPr>
+          <w:p>
+            <w:pPr>
+              <w:rPr>
+                <w:b w:val="0"/>
+                <w:bCs w:val="0"/>
+                <w:lang w:val="en-AT"/>
+              </w:rPr>
+            </w:pPr>
+            <w:r>
+              <w:rPr>
+                <w:b w:val="0"/>
+                <w:bCs w:val="0"/>
+                <w:lang w:val="en-AT"/>
+              </w:rPr>
+              <w:t>Receive</w:t>
+            </w:r>
+            <w:r>
+              <w:rPr>
+                <w:b w:val="0"/>
+                <w:bCs w:val="0"/>
+                <w:lang w:val="en-AT"/>
+              </w:rPr>
+              <w:t xml:space="preserve"> a badge</w:t>
+            </w:r>
+            <w:r>
+              <w:rPr>
+                <w:b w:val="0"/>
+                <w:bCs w:val="0"/>
+                <w:lang w:val="en-AT"/>
+              </w:rPr>
+              <w:t xml:space="preserve"> for preparedness</w:t>
+            </w:r>
+          </w:p>
+        </w:tc>
+        <w:tc>
+          <w:tcPr>
+            <w:tcW w:w="2694" w:type="dxa"/>
+            <w:vAlign w:val="center"/>
+          </w:tcPr>
+          <w:p>
+            <w:pPr>
+              <w:cnfStyle w:val="000000100000" w:firstRow="0" w:lastRow="0" w:firstColumn="0" w:lastColumn="0" w:oddVBand="0" w:evenVBand="0" w:oddHBand="1" w:evenHBand="0" w:firstRowFirstColumn="0" w:firstRowLastColumn="0" w:lastRowFirstColumn="0" w:lastRowLastColumn="0"/>
+              <w:rPr>
+                <w:lang w:val="en-AT"/>
+              </w:rPr>
+            </w:pPr>
+          </w:p>
+        </w:tc>
+      </w:tr>
+      <w:tr>
+        <w:trPr>
+          <w:trHeight w:val="340"/>
+        </w:trPr>
+        <w:tc>
+          <w:tcPr>
+            <w:cnfStyle w:val="001000000000" w:firstRow="0" w:lastRow="0" w:firstColumn="1" w:lastColumn="0" w:oddVBand="0" w:evenVBand="0" w:oddHBand="0" w:evenHBand="0" w:firstRowFirstColumn="0" w:firstRowLastColumn="0" w:lastRowFirstColumn="0" w:lastRowLastColumn="0"/>
+            <w:tcW w:w="6232" w:type="dxa"/>
+            <w:vAlign w:val="center"/>
+          </w:tcPr>
+          <w:p>
+            <w:pPr>
+              <w:rPr>
+                <w:b w:val="0"/>
+                <w:bCs w:val="0"/>
+                <w:lang w:val="en-AT"/>
+              </w:rPr>
+            </w:pPr>
+            <w:r>
+              <w:rPr>
+                <w:b w:val="0"/>
+                <w:bCs w:val="0"/>
+                <w:lang w:val="en-AT"/>
+              </w:rPr>
+              <w:t>Find the license and credits section</w:t>
+            </w:r>
+          </w:p>
+        </w:tc>
+        <w:tc>
+          <w:tcPr>
+            <w:tcW w:w="2694" w:type="dxa"/>
+            <w:vAlign w:val="center"/>
+          </w:tcPr>
+          <w:p>
+            <w:pPr>
+              <w:cnfStyle w:val="000000000000" w:firstRow="0" w:lastRow="0" w:firstColumn="0" w:lastColumn="0" w:oddVBand="0" w:evenVBand="0" w:oddHBand="0" w:evenHBand="0" w:firstRowFirstColumn="0" w:firstRowLastColumn="0" w:lastRowFirstColumn="0" w:lastRowLastColumn="0"/>
+              <w:rPr>
+                <w:lang w:val="en-AT"/>
+              </w:rPr>
+            </w:pPr>
+          </w:p>
+        </w:tc>
+      </w:tr>
+    </w:tbl>
+    <w:p>
+      <w:pPr>
+        <w:pStyle w:val="Caption"/>
+        <w:rPr>
+          <w:lang w:val="en-AT"/>
+        </w:rPr>
+      </w:pPr>
+      <w:r>
+        <w:rPr>
+          <w:lang w:val="en-US"/>
+        </w:rPr>
+        <w:t xml:space="preserve">Table </w:t>
+      </w:r>
+      <w:r>
+        <w:fldChar w:fldCharType="begin"/>
+      </w:r>
+      <w:r>
+        <w:rPr>
+          <w:lang w:val="en-US"/>
+        </w:rPr>
+        <w:instrText xml:space="preserve"> SEQ Table \* ARABIC </w:instrText>
+      </w:r>
+      <w:r>
+        <w:fldChar w:fldCharType="separate"/>
+      </w:r>
+      <w:r>
+        <w:rPr>
+          <w:noProof/>
+          <w:lang w:val="en-US"/>
+        </w:rPr>
+        <w:t>2</w:t>
+      </w:r>
+      <w:r>
+        <w:fldChar w:fldCharType="end"/>
+      </w:r>
+      <w:r>
+        <w:rPr>
+          <w:lang w:val="en-US"/>
+        </w:rPr>
+        <w:t>: Usability testing checklist</w:t>
+      </w:r>
+    </w:p>
+    <w:p>
+      <w:pPr>
+        <w:rPr>
+          <w:lang w:val="en-AT"/>
+        </w:rPr>
+      </w:pPr>
+      <w:r>
+        <w:rPr>
+          <w:lang w:val="en-AT"/>
+        </w:rPr>
+        <w:t xml:space="preserve">Feedback </w:t>
+      </w:r>
+      <w:r>
+        <w:rPr>
+          <w:lang w:val="en-AT"/>
+        </w:rPr>
+        <w:t>will</w:t>
+      </w:r>
+      <w:r>
+        <w:rPr>
+          <w:lang w:val="en-AT"/>
+        </w:rPr>
+        <w:t xml:space="preserve"> be collected using Google Forms. The form should include both rating questions </w:t>
+      </w:r>
+      <w:r>
+        <w:rPr>
+          <w:lang w:val="en-AT"/>
+        </w:rPr>
+        <w:t xml:space="preserve">based on the System Usability Scale (SUS) </w:t>
+      </w:r>
+      <w:sdt>
+        <w:sdtPr>
+          <w:rPr>
+            <w:rFonts w:ascii="Aptos" w:hAnsi="Aptos"/>
+            <w:color w:val="000000"/>
+            <w:lang w:val="en-AT"/>
+          </w:rPr>
+          <w:tag w:val="MENDELEY_CITATION_v3_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"/>
+          <w:id w:val="933328123"/>
+          <w:placeholder>
+            <w:docPart w:val="DefaultPlaceholder_-1854013440"/>
+          </w:placeholder>
+        </w:sdtPr>
+        <w:sdtContent>
+          <w:r>
+            <w:rPr>
+              <w:rFonts w:ascii="Aptos" w:hAnsi="Aptos"/>
+              <w:color w:val="000000"/>
+              <w:lang w:val="en-AT"/>
+            </w:rPr>
+            <w:t>(Brooke, 1996)</w:t>
+          </w:r>
+        </w:sdtContent>
+      </w:sdt>
+      <w:r>
+        <w:rPr>
+          <w:lang w:val="en-AT"/>
+        </w:rPr>
+        <w:t xml:space="preserve"> </w:t>
+      </w:r>
+      <w:r>
+        <w:rPr>
+          <w:lang w:val="en-AT"/>
+        </w:rPr>
+        <w:t>and open text questions</w:t>
+      </w:r>
+      <w:r>
+        <w:rPr>
+          <w:lang w:val="en-AT"/>
+        </w:rPr>
+        <w:t>, as in Table 3</w:t>
+      </w:r>
+      <w:r>
+        <w:rPr>
+          <w:lang w:val="en-AT"/>
+        </w:rPr>
+        <w:t xml:space="preserve">. </w:t>
+      </w:r>
+    </w:p>
+    <w:tbl>
+      <w:tblPr>
+        <w:tblStyle w:val="GridTable4-Accent1"/>
+        <w:tblW w:w="0" w:type="auto"/>
+        <w:tblLook w:val="04A0" w:firstRow="1" w:lastRow="0" w:firstColumn="1" w:lastColumn="0" w:noHBand="0" w:noVBand="1"/>
+      </w:tblPr>
+      <w:tblGrid>
+        <w:gridCol w:w="6232"/>
+        <w:gridCol w:w="2694"/>
+      </w:tblGrid>
+      <w:tr>
+        <w:trPr>
+          <w:cnfStyle w:val="100000000000" w:firstRow="1" w:lastRow="0" w:firstColumn="0" w:lastColumn="0" w:oddVBand="0" w:evenVBand="0" w:oddHBand="0" w:evenHBand="0" w:firstRowFirstColumn="0" w:firstRowLastColumn="0" w:lastRowFirstColumn="0" w:lastRowLastColumn="0"/>
+          <w:trHeight w:val="340"/>
+        </w:trPr>
+        <w:tc>
+          <w:tcPr>
+            <w:cnfStyle w:val="001000000000" w:firstRow="0" w:lastRow="0" w:firstColumn="1" w:lastColumn="0" w:oddVBand="0" w:evenVBand="0" w:oddHBand="0" w:evenHBand="0" w:firstRowFirstColumn="0" w:firstRowLastColumn="0" w:lastRowFirstColumn="0" w:lastRowLastColumn="0"/>
+            <w:tcW w:w="6232" w:type="dxa"/>
+            <w:vAlign w:val="center"/>
+          </w:tcPr>
+          <w:p>
+            <w:pPr>
+              <w:rPr>
+                <w:lang w:val="en-AT"/>
+              </w:rPr>
+            </w:pPr>
+            <w:r>
+              <w:rPr>
+                <w:lang w:val="en-AT"/>
+              </w:rPr>
+              <w:lastRenderedPageBreak/>
+              <w:t>Open feedback questions</w:t>
+            </w:r>
+          </w:p>
+        </w:tc>
+        <w:tc>
+          <w:tcPr>
+            <w:tcW w:w="2694" w:type="dxa"/>
+            <w:vAlign w:val="center"/>
+          </w:tcPr>
+          <w:p>
+            <w:pPr>
+              <w:cnfStyle w:val="100000000000" w:firstRow="1" w:lastRow="0" w:firstColumn="0" w:lastColumn="0" w:oddVBand="0" w:evenVBand="0" w:oddHBand="0" w:evenHBand="0" w:firstRowFirstColumn="0" w:firstRowLastColumn="0" w:lastRowFirstColumn="0" w:lastRowLastColumn="0"/>
+              <w:rPr>
+                <w:lang w:val="en-AT"/>
+              </w:rPr>
+            </w:pPr>
+            <w:r>
+              <w:rPr>
+                <w:lang w:val="en-AT"/>
+              </w:rPr>
+              <w:t>Answer</w:t>
+            </w:r>
+          </w:p>
+        </w:tc>
+      </w:tr>
+      <w:tr>
+        <w:trPr>
+          <w:cnfStyle w:val="000000100000" w:firstRow="0" w:lastRow="0" w:firstColumn="0" w:lastColumn="0" w:oddVBand="0" w:evenVBand="0" w:oddHBand="1" w:evenHBand="0" w:firstRowFirstColumn="0" w:firstRowLastColumn="0" w:lastRowFirstColumn="0" w:lastRowLastColumn="0"/>
+          <w:trHeight w:val="340"/>
+        </w:trPr>
+        <w:tc>
+          <w:tcPr>
+            <w:cnfStyle w:val="001000000000" w:firstRow="0" w:lastRow="0" w:firstColumn="1" w:lastColumn="0" w:oddVBand="0" w:evenVBand="0" w:oddHBand="0" w:evenHBand="0" w:firstRowFirstColumn="0" w:firstRowLastColumn="0" w:lastRowFirstColumn="0" w:lastRowLastColumn="0"/>
+            <w:tcW w:w="6232" w:type="dxa"/>
+            <w:vAlign w:val="center"/>
+          </w:tcPr>
+          <w:p>
+            <w:pPr>
+              <w:spacing w:line="259" w:lineRule="auto"/>
+              <w:rPr>
+                <w:b w:val="0"/>
+                <w:bCs w:val="0"/>
+                <w:lang w:val="en-AT"/>
+              </w:rPr>
+            </w:pPr>
+            <w:r>
+              <w:rPr>
+                <w:b w:val="0"/>
+                <w:bCs w:val="0"/>
+                <w:lang w:val="en-AT"/>
+              </w:rPr>
+              <w:t>Was the dashboard easy to understand?</w:t>
+            </w:r>
+          </w:p>
+        </w:tc>
+        <w:tc>
+          <w:tcPr>
+            <w:tcW w:w="2694" w:type="dxa"/>
+            <w:vAlign w:val="center"/>
+          </w:tcPr>
+          <w:p>
+            <w:pPr>
+              <w:cnfStyle w:val="000000100000" w:firstRow="0" w:lastRow="0" w:firstColumn="0" w:lastColumn="0" w:oddVBand="0" w:evenVBand="0" w:oddHBand="1" w:evenHBand="0" w:firstRowFirstColumn="0" w:firstRowLastColumn="0" w:lastRowFirstColumn="0" w:lastRowLastColumn="0"/>
+              <w:rPr>
+                <w:lang w:val="en-AT"/>
+              </w:rPr>
+            </w:pPr>
+          </w:p>
+        </w:tc>
+      </w:tr>
+      <w:tr>
+        <w:trPr>
+          <w:trHeight w:val="340"/>
+        </w:trPr>
+        <w:tc>
+          <w:tcPr>
+            <w:cnfStyle w:val="001000000000" w:firstRow="0" w:lastRow="0" w:firstColumn="1" w:lastColumn="0" w:oddVBand="0" w:evenVBand="0" w:oddHBand="0" w:evenHBand="0" w:firstRowFirstColumn="0" w:firstRowLastColumn="0" w:lastRowFirstColumn="0" w:lastRowLastColumn="0"/>
+            <w:tcW w:w="6232" w:type="dxa"/>
+            <w:vAlign w:val="center"/>
+          </w:tcPr>
+          <w:p>
+            <w:pPr>
+              <w:rPr>
+                <w:b w:val="0"/>
+                <w:bCs w:val="0"/>
+                <w:lang w:val="en-AT"/>
+              </w:rPr>
+            </w:pPr>
+            <w:r>
+              <w:rPr>
+                <w:b w:val="0"/>
+                <w:bCs w:val="0"/>
+                <w:lang w:val="en-AT"/>
+              </w:rPr>
+              <w:t>Could you find emergency numbers quickly?</w:t>
+            </w:r>
+          </w:p>
+        </w:tc>
+        <w:tc>
+          <w:tcPr>
+            <w:tcW w:w="2694" w:type="dxa"/>
+            <w:vAlign w:val="center"/>
+          </w:tcPr>
+          <w:p>
+            <w:pPr>
+              <w:cnfStyle w:val="000000000000" w:firstRow="0" w:lastRow="0" w:firstColumn="0" w:lastColumn="0" w:oddVBand="0" w:evenVBand="0" w:oddHBand="0" w:evenHBand="0" w:firstRowFirstColumn="0" w:firstRowLastColumn="0" w:lastRowFirstColumn="0" w:lastRowLastColumn="0"/>
+              <w:rPr>
+                <w:lang w:val="en-AT"/>
+              </w:rPr>
+            </w:pPr>
+          </w:p>
+        </w:tc>
+      </w:tr>
+      <w:tr>
+        <w:trPr>
+          <w:cnfStyle w:val="000000100000" w:firstRow="0" w:lastRow="0" w:firstColumn="0" w:lastColumn="0" w:oddVBand="0" w:evenVBand="0" w:oddHBand="1" w:evenHBand="0" w:firstRowFirstColumn="0" w:firstRowLastColumn="0" w:lastRowFirstColumn="0" w:lastRowLastColumn="0"/>
+          <w:trHeight w:val="340"/>
+        </w:trPr>
+        <w:tc>
+          <w:tcPr>
+            <w:cnfStyle w:val="001000000000" w:firstRow="0" w:lastRow="0" w:firstColumn="1" w:lastColumn="0" w:oddVBand="0" w:evenVBand="0" w:oddHBand="0" w:evenHBand="0" w:firstRowFirstColumn="0" w:firstRowLastColumn="0" w:lastRowFirstColumn="0" w:lastRowLastColumn="0"/>
+            <w:tcW w:w="6232" w:type="dxa"/>
+            <w:vAlign w:val="center"/>
+          </w:tcPr>
+          <w:p>
+            <w:pPr>
+              <w:rPr>
+                <w:b w:val="0"/>
+                <w:bCs w:val="0"/>
+                <w:lang w:val="en-AT"/>
+              </w:rPr>
+            </w:pPr>
+            <w:r>
+              <w:rPr>
+                <w:b w:val="0"/>
+                <w:bCs w:val="0"/>
+                <w:lang w:val="en-AT"/>
+              </w:rPr>
+              <w:t>Did the learning mode help you understand how to prepare?</w:t>
+            </w:r>
+          </w:p>
+        </w:tc>
+        <w:tc>
+          <w:tcPr>
+            <w:tcW w:w="2694" w:type="dxa"/>
+            <w:vAlign w:val="center"/>
+          </w:tcPr>
+          <w:p>
+            <w:pPr>
+              <w:cnfStyle w:val="000000100000" w:firstRow="0" w:lastRow="0" w:firstColumn="0" w:lastColumn="0" w:oddVBand="0" w:evenVBand="0" w:oddHBand="1" w:evenHBand="0" w:firstRowFirstColumn="0" w:firstRowLastColumn="0" w:lastRowFirstColumn="0" w:lastRowLastColumn="0"/>
+              <w:rPr>
+                <w:lang w:val="en-AT"/>
+              </w:rPr>
+            </w:pPr>
+          </w:p>
+        </w:tc>
+      </w:tr>
+      <w:tr>
+        <w:trPr>
+          <w:trHeight w:val="340"/>
+        </w:trPr>
+        <w:tc>
+          <w:tcPr>
+            <w:cnfStyle w:val="001000000000" w:firstRow="0" w:lastRow="0" w:firstColumn="1" w:lastColumn="0" w:oddVBand="0" w:evenVBand="0" w:oddHBand="0" w:evenHBand="0" w:firstRowFirstColumn="0" w:firstRowLastColumn="0" w:lastRowFirstColumn="0" w:lastRowLastColumn="0"/>
+            <w:tcW w:w="6232" w:type="dxa"/>
+            <w:vAlign w:val="center"/>
+          </w:tcPr>
+          <w:p>
+            <w:pPr>
+              <w:rPr>
+                <w:b w:val="0"/>
+                <w:bCs w:val="0"/>
+                <w:lang w:val="en-AT"/>
+              </w:rPr>
+            </w:pPr>
+            <w:r>
+              <w:rPr>
+                <w:b w:val="0"/>
+                <w:bCs w:val="0"/>
+                <w:lang w:val="en-AT"/>
+              </w:rPr>
+              <w:t>Was the app navigation clear?</w:t>
+            </w:r>
+          </w:p>
+        </w:tc>
+        <w:tc>
+          <w:tcPr>
+            <w:tcW w:w="2694" w:type="dxa"/>
+            <w:vAlign w:val="center"/>
+          </w:tcPr>
+          <w:p>
+            <w:pPr>
+              <w:cnfStyle w:val="000000000000" w:firstRow="0" w:lastRow="0" w:firstColumn="0" w:lastColumn="0" w:oddVBand="0" w:evenVBand="0" w:oddHBand="0" w:evenHBand="0" w:firstRowFirstColumn="0" w:firstRowLastColumn="0" w:lastRowFirstColumn="0" w:lastRowLastColumn="0"/>
+              <w:rPr>
+                <w:lang w:val="en-AT"/>
+              </w:rPr>
+            </w:pPr>
+          </w:p>
+        </w:tc>
+      </w:tr>
+      <w:tr>
+        <w:trPr>
+          <w:cnfStyle w:val="000000100000" w:firstRow="0" w:lastRow="0" w:firstColumn="0" w:lastColumn="0" w:oddVBand="0" w:evenVBand="0" w:oddHBand="1" w:evenHBand="0" w:firstRowFirstColumn="0" w:firstRowLastColumn="0" w:lastRowFirstColumn="0" w:lastRowLastColumn="0"/>
+          <w:trHeight w:val="340"/>
+        </w:trPr>
+        <w:tc>
+          <w:tcPr>
+            <w:cnfStyle w:val="001000000000" w:firstRow="0" w:lastRow="0" w:firstColumn="1" w:lastColumn="0" w:oddVBand="0" w:evenVBand="0" w:oddHBand="0" w:evenHBand="0" w:firstRowFirstColumn="0" w:firstRowLastColumn="0" w:lastRowFirstColumn="0" w:lastRowLastColumn="0"/>
+            <w:tcW w:w="6232" w:type="dxa"/>
+            <w:vAlign w:val="center"/>
+          </w:tcPr>
+          <w:p>
+            <w:pPr>
+              <w:rPr>
+                <w:b w:val="0"/>
+                <w:bCs w:val="0"/>
+                <w:lang w:val="en-AT"/>
+              </w:rPr>
+            </w:pPr>
+            <w:r>
+              <w:rPr>
+                <w:b w:val="0"/>
+                <w:bCs w:val="0"/>
+                <w:lang w:val="en-AT"/>
+              </w:rPr>
+              <w:t>Which feature felt most useful?</w:t>
+            </w:r>
+          </w:p>
+        </w:tc>
+        <w:tc>
+          <w:tcPr>
+            <w:tcW w:w="2694" w:type="dxa"/>
+            <w:vAlign w:val="center"/>
+          </w:tcPr>
+          <w:p>
+            <w:pPr>
+              <w:cnfStyle w:val="000000100000" w:firstRow="0" w:lastRow="0" w:firstColumn="0" w:lastColumn="0" w:oddVBand="0" w:evenVBand="0" w:oddHBand="1" w:evenHBand="0" w:firstRowFirstColumn="0" w:firstRowLastColumn="0" w:lastRowFirstColumn="0" w:lastRowLastColumn="0"/>
+              <w:rPr>
+                <w:lang w:val="en-AT"/>
+              </w:rPr>
+            </w:pPr>
+          </w:p>
+        </w:tc>
+      </w:tr>
+      <w:tr>
+        <w:trPr>
+          <w:trHeight w:val="340"/>
+        </w:trPr>
+        <w:tc>
+          <w:tcPr>
+            <w:cnfStyle w:val="001000000000" w:firstRow="0" w:lastRow="0" w:firstColumn="1" w:lastColumn="0" w:oddVBand="0" w:evenVBand="0" w:oddHBand="0" w:evenHBand="0" w:firstRowFirstColumn="0" w:firstRowLastColumn="0" w:lastRowFirstColumn="0" w:lastRowLastColumn="0"/>
+            <w:tcW w:w="6232" w:type="dxa"/>
+            <w:vAlign w:val="center"/>
+          </w:tcPr>
+          <w:p>
+            <w:pPr>
+              <w:rPr>
+                <w:b w:val="0"/>
+                <w:bCs w:val="0"/>
+                <w:lang w:val="en-AT"/>
+              </w:rPr>
+            </w:pPr>
+            <w:r>
+              <w:rPr>
+                <w:b w:val="0"/>
+                <w:bCs w:val="0"/>
+                <w:lang w:val="en-AT"/>
+              </w:rPr>
+              <w:t>Which part was confusing or unnecessary?</w:t>
+            </w:r>
+          </w:p>
+        </w:tc>
+        <w:tc>
+          <w:tcPr>
+            <w:tcW w:w="2694" w:type="dxa"/>
+            <w:vAlign w:val="center"/>
+          </w:tcPr>
+          <w:p>
+            <w:pPr>
+              <w:cnfStyle w:val="000000000000" w:firstRow="0" w:lastRow="0" w:firstColumn="0" w:lastColumn="0" w:oddVBand="0" w:evenVBand="0" w:oddHBand="0" w:evenHBand="0" w:firstRowFirstColumn="0" w:firstRowLastColumn="0" w:lastRowFirstColumn="0" w:lastRowLastColumn="0"/>
+              <w:rPr>
+                <w:lang w:val="en-AT"/>
+              </w:rPr>
+            </w:pPr>
+          </w:p>
+        </w:tc>
+      </w:tr>
+      <w:tr>
+        <w:trPr>
+          <w:cnfStyle w:val="000000100000" w:firstRow="0" w:lastRow="0" w:firstColumn="0" w:lastColumn="0" w:oddVBand="0" w:evenVBand="0" w:oddHBand="1" w:evenHBand="0" w:firstRowFirstColumn="0" w:firstRowLastColumn="0" w:lastRowFirstColumn="0" w:lastRowLastColumn="0"/>
+          <w:trHeight w:val="340"/>
+        </w:trPr>
+        <w:tc>
+          <w:tcPr>
+            <w:cnfStyle w:val="001000000000" w:firstRow="0" w:lastRow="0" w:firstColumn="1" w:lastColumn="0" w:oddVBand="0" w:evenVBand="0" w:oddHBand="0" w:evenHBand="0" w:firstRowFirstColumn="0" w:firstRowLastColumn="0" w:lastRowFirstColumn="0" w:lastRowLastColumn="0"/>
+            <w:tcW w:w="6232" w:type="dxa"/>
+            <w:vAlign w:val="center"/>
+          </w:tcPr>
+          <w:p>
+            <w:pPr>
+              <w:rPr>
+                <w:b w:val="0"/>
+                <w:bCs w:val="0"/>
+                <w:lang w:val="en-AT"/>
+              </w:rPr>
+            </w:pPr>
+            <w:r>
+              <w:rPr>
+                <w:b w:val="0"/>
+                <w:bCs w:val="0"/>
+                <w:lang w:val="en-AT"/>
+              </w:rPr>
+              <w:t>Would you use this app during a real weather or disaster situation?</w:t>
+            </w:r>
+          </w:p>
+        </w:tc>
+        <w:tc>
+          <w:tcPr>
+            <w:tcW w:w="2694" w:type="dxa"/>
+            <w:vAlign w:val="center"/>
+          </w:tcPr>
+          <w:p>
+            <w:pPr>
+              <w:cnfStyle w:val="000000100000" w:firstRow="0" w:lastRow="0" w:firstColumn="0" w:lastColumn="0" w:oddVBand="0" w:evenVBand="0" w:oddHBand="1" w:evenHBand="0" w:firstRowFirstColumn="0" w:firstRowLastColumn="0" w:lastRowFirstColumn="0" w:lastRowLastColumn="0"/>
+              <w:rPr>
+                <w:lang w:val="en-AT"/>
+              </w:rPr>
+            </w:pPr>
+          </w:p>
+        </w:tc>
+      </w:tr>
+    </w:tbl>
+    <w:p>
+      <w:pPr>
+        <w:pStyle w:val="Caption"/>
+        <w:rPr>
+          <w:lang w:val="en-AT"/>
+        </w:rPr>
+      </w:pPr>
+      <w:r>
+        <w:t xml:space="preserve">Table </w:t>
+      </w:r>
+      <w:r>
+        <w:fldChar w:fldCharType="begin"/>
+      </w:r>
+      <w:r>
+        <w:instrText xml:space="preserve"> SEQ Table \* ARABIC </w:instrText>
+      </w:r>
+      <w:r>
+        <w:fldChar w:fldCharType="separate"/>
+      </w:r>
+      <w:r>
+        <w:rPr>
+          <w:noProof/>
+        </w:rPr>
+        <w:t>3</w:t>
+      </w:r>
+      <w:r>
+        <w:fldChar w:fldCharType="end"/>
+      </w:r>
+      <w:r>
+        <w:t xml:space="preserve">: Open </w:t>
+      </w:r>
+      <w:proofErr w:type="spellStart"/>
+      <w:r>
+        <w:t>feedback</w:t>
+      </w:r>
+      <w:proofErr w:type="spellEnd"/>
+      <w:r>
+        <w:t xml:space="preserve"> </w:t>
+      </w:r>
+      <w:proofErr w:type="spellStart"/>
+      <w:r>
+        <w:t>questions</w:t>
+      </w:r>
+      <w:proofErr w:type="spellEnd"/>
+      <w:r>
+        <w:t xml:space="preserve"> after SUS </w:t>
+      </w:r>
+      <w:proofErr w:type="spellStart"/>
+      <w:r>
+        <w:t>questionnaire</w:t>
+      </w:r>
+      <w:proofErr w:type="spellEnd"/>
     </w:p>
     <w:p>
       <w:pPr>
@@ -1808,88 +3421,18 @@
         </w:rPr>
         <w:t>The evaluation strategy is appropriate because the app is both functional and educational. Therefore, it is not enough to test only whether the code works. The project also needs to test whether users understand the information, can navigate the app quickly, and feel that the preparedness features are useful.</w:t>
       </w:r>
-    </w:p>
-    <w:p>
-      <w:pPr>
-        <w:rPr>
-          <w:lang w:val="en-AT"/>
-        </w:rPr>
-      </w:pPr>
-      <w:r>
-        <w:rPr>
-          <w:lang w:val="en-AT"/>
-        </w:rPr>
-        <w:t>Success can be measured using the following criteria:</w:t>
-      </w:r>
-    </w:p>
-    <w:p>
-      <w:pPr>
-        <w:rPr>
-          <w:lang w:val="en-AT"/>
-        </w:rPr>
-      </w:pPr>
-      <w:r>
-        <w:rPr>
-          <w:lang w:val="en-AT"/>
-        </w:rPr>
-        <w:lastRenderedPageBreak/>
-        <w:t>Users can complete the main test tasks without major confusion</w:t>
-      </w:r>
-      <w:r>
-        <w:rPr>
-          <w:lang w:val="en-AT"/>
-        </w:rPr>
-        <w:br/>
-        <w:t>The dashboard displays relevant local information</w:t>
-      </w:r>
-      <w:r>
-        <w:rPr>
-          <w:lang w:val="en-AT"/>
-        </w:rPr>
-        <w:br/>
-        <w:t>The learning mode successfully stores progress and grants badges</w:t>
-      </w:r>
-      <w:r>
-        <w:rPr>
-          <w:lang w:val="en-AT"/>
-        </w:rPr>
-        <w:br/>
-        <w:t>Notifications work for preparedness reminders and selected alerts</w:t>
-      </w:r>
-      <w:r>
-        <w:rPr>
-          <w:lang w:val="en-AT"/>
-        </w:rPr>
-        <w:br/>
-        <w:t>Feedback shows that users find the app useful and understandable</w:t>
-      </w:r>
-    </w:p>
-    <w:p>
-      <w:pPr>
-        <w:rPr>
-          <w:lang w:val="en-AT"/>
-        </w:rPr>
-      </w:pPr>
+      <w:r>
+        <w:rPr>
+          <w:lang w:val="en-AT"/>
+        </w:rPr>
+        <w:t xml:space="preserve"> This will define the success of the project. </w:t>
+      </w:r>
       <w:r>
         <w:rPr>
           <w:lang w:val="en-AT"/>
         </w:rPr>
         <w:t>This evaluation approach is comprehensive enough for the project because it covers technical correctness, user experience, and the educational goal of improving preparedness.</w:t>
       </w:r>
-    </w:p>
-    <w:p>
-      <w:pPr>
-        <w:rPr>
-          <w:lang w:val="en-AT"/>
-        </w:rPr>
-      </w:pPr>
-    </w:p>
-    <w:p>
-      <w:pPr>
-        <w:rPr>
-          <w:lang w:val="en-AT"/>
-        </w:rPr>
-      </w:pPr>
     </w:p>
     <w:p>
       <w:pPr>
@@ -2023,10 +3566,11 @@
     </w:lvl>
   </w:abstractNum>
   <w:abstractNum w:abstractNumId="1" w15:restartNumberingAfterBreak="0">
-    <w:nsid w:val="2C0863B1"/>
+    <w:nsid w:val="13277EA0"/>
     <w:multiLevelType w:val="hybridMultilevel"/>
-    <w:tmpl w:val="C010E208"/>
-    <w:lvl w:ilvl="0" w:tplc="A684BAB2">
+    <w:tmpl w:val="9F88BE24"/>
+    <w:lvl w:ilvl="0" w:tplc="F2F8A1A4">
+      <w:start w:val="1"/>
       <w:numFmt w:val="bullet"/>
       <w:lvlText w:val=""/>
       <w:lvlJc w:val="left"/>
@@ -2135,6 +3679,207 @@
     </w:lvl>
   </w:abstractNum>
   <w:abstractNum w:abstractNumId="2" w15:restartNumberingAfterBreak="0">
+    <w:nsid w:val="2AE55DD0"/>
+    <w:multiLevelType w:val="hybridMultilevel"/>
+    <w:tmpl w:val="46D82AC6"/>
+    <w:lvl w:ilvl="0" w:tplc="2000000F">
+      <w:start w:val="1"/>
+      <w:numFmt w:val="decimal"/>
+      <w:lvlText w:val="%1."/>
+      <w:lvlJc w:val="left"/>
+      <w:pPr>
+        <w:ind w:left="720" w:hanging="360"/>
+      </w:pPr>
+      <w:rPr>
+        <w:rFonts w:hint="default"/>
+      </w:rPr>
+    </w:lvl>
+    <w:lvl w:ilvl="1" w:tplc="20000019" w:tentative="1">
+      <w:start w:val="1"/>
+      <w:numFmt w:val="lowerLetter"/>
+      <w:lvlText w:val="%2."/>
+      <w:lvlJc w:val="left"/>
+      <w:pPr>
+        <w:ind w:left="1440" w:hanging="360"/>
+      </w:pPr>
+    </w:lvl>
+    <w:lvl w:ilvl="2" w:tplc="2000001B" w:tentative="1">
+      <w:start w:val="1"/>
+      <w:numFmt w:val="lowerRoman"/>
+      <w:lvlText w:val="%3."/>
+      <w:lvlJc w:val="right"/>
+      <w:pPr>
+        <w:ind w:left="2160" w:hanging="180"/>
+      </w:pPr>
+    </w:lvl>
+    <w:lvl w:ilvl="3" w:tplc="2000000F" w:tentative="1">
+      <w:start w:val="1"/>
+      <w:numFmt w:val="decimal"/>
+      <w:lvlText w:val="%4."/>
+      <w:lvlJc w:val="left"/>
+      <w:pPr>
+        <w:ind w:left="2880" w:hanging="360"/>
+      </w:pPr>
+    </w:lvl>
+    <w:lvl w:ilvl="4" w:tplc="20000019" w:tentative="1">
+      <w:start w:val="1"/>
+      <w:numFmt w:val="lowerLetter"/>
+      <w:lvlText w:val="%5."/>
+      <w:lvlJc w:val="left"/>
+      <w:pPr>
+        <w:ind w:left="3600" w:hanging="360"/>
+      </w:pPr>
+    </w:lvl>
+    <w:lvl w:ilvl="5" w:tplc="2000001B" w:tentative="1">
+      <w:start w:val="1"/>
+      <w:numFmt w:val="lowerRoman"/>
+      <w:lvlText w:val="%6."/>
+      <w:lvlJc w:val="right"/>
+      <w:pPr>
+        <w:ind w:left="4320" w:hanging="180"/>
+      </w:pPr>
+    </w:lvl>
+    <w:lvl w:ilvl="6" w:tplc="2000000F" w:tentative="1">
+      <w:start w:val="1"/>
+      <w:numFmt w:val="decimal"/>
+      <w:lvlText w:val="%7."/>
+      <w:lvlJc w:val="left"/>
+      <w:pPr>
+        <w:ind w:left="5040" w:hanging="360"/>
+      </w:pPr>
+    </w:lvl>
+    <w:lvl w:ilvl="7" w:tplc="20000019" w:tentative="1">
+      <w:start w:val="1"/>
+      <w:numFmt w:val="lowerLetter"/>
+      <w:lvlText w:val="%8."/>
+      <w:lvlJc w:val="left"/>
+      <w:pPr>
+        <w:ind w:left="5760" w:hanging="360"/>
+      </w:pPr>
+    </w:lvl>
+    <w:lvl w:ilvl="8" w:tplc="2000001B" w:tentative="1">
+      <w:start w:val="1"/>
+      <w:numFmt w:val="lowerRoman"/>
+      <w:lvlText w:val="%9."/>
+      <w:lvlJc w:val="right"/>
+      <w:pPr>
+        <w:ind w:left="6480" w:hanging="180"/>
+      </w:pPr>
+    </w:lvl>
+  </w:abstractNum>
+  <w:abstractNum w:abstractNumId="3" w15:restartNumberingAfterBreak="0">
+    <w:nsid w:val="2C0863B1"/>
+    <w:multiLevelType w:val="hybridMultilevel"/>
+    <w:tmpl w:val="C010E208"/>
+    <w:lvl w:ilvl="0" w:tplc="A684BAB2">
+      <w:numFmt w:val="bullet"/>
+      <w:lvlText w:val=""/>
+      <w:lvlJc w:val="left"/>
+      <w:pPr>
+        <w:ind w:left="720" w:hanging="360"/>
+      </w:pPr>
+      <w:rPr>
+        <w:rFonts w:ascii="Symbol" w:eastAsiaTheme="minorEastAsia" w:hAnsi="Symbol" w:cstheme="minorBidi" w:hint="default"/>
+      </w:rPr>
+    </w:lvl>
+    <w:lvl w:ilvl="1" w:tplc="20000003" w:tentative="1">
+      <w:start w:val="1"/>
+      <w:numFmt w:val="bullet"/>
+      <w:lvlText w:val="o"/>
+      <w:lvlJc w:val="left"/>
+      <w:pPr>
+        <w:ind w:left="1440" w:hanging="360"/>
+      </w:pPr>
+      <w:rPr>
+        <w:rFonts w:ascii="Courier New" w:hAnsi="Courier New" w:cs="Courier New" w:hint="default"/>
+      </w:rPr>
+    </w:lvl>
+    <w:lvl w:ilvl="2" w:tplc="20000005" w:tentative="1">
+      <w:start w:val="1"/>
+      <w:numFmt w:val="bullet"/>
+      <w:lvlText w:val=""/>
+      <w:lvlJc w:val="left"/>
+      <w:pPr>
+        <w:ind w:left="2160" w:hanging="360"/>
+      </w:pPr>
+      <w:rPr>
+        <w:rFonts w:ascii="Wingdings" w:hAnsi="Wingdings" w:hint="default"/>
+      </w:rPr>
+    </w:lvl>
+    <w:lvl w:ilvl="3" w:tplc="20000001" w:tentative="1">
+      <w:start w:val="1"/>
+      <w:numFmt w:val="bullet"/>
+      <w:lvlText w:val=""/>
+      <w:lvlJc w:val="left"/>
+      <w:pPr>
+        <w:ind w:left="2880" w:hanging="360"/>
+      </w:pPr>
+      <w:rPr>
+        <w:rFonts w:ascii="Symbol" w:hAnsi="Symbol" w:hint="default"/>
+      </w:rPr>
+    </w:lvl>
+    <w:lvl w:ilvl="4" w:tplc="20000003" w:tentative="1">
+      <w:start w:val="1"/>
+      <w:numFmt w:val="bullet"/>
+      <w:lvlText w:val="o"/>
+      <w:lvlJc w:val="left"/>
+      <w:pPr>
+        <w:ind w:left="3600" w:hanging="360"/>
+      </w:pPr>
+      <w:rPr>
+        <w:rFonts w:ascii="Courier New" w:hAnsi="Courier New" w:cs="Courier New" w:hint="default"/>
+      </w:rPr>
+    </w:lvl>
+    <w:lvl w:ilvl="5" w:tplc="20000005" w:tentative="1">
+      <w:start w:val="1"/>
+      <w:numFmt w:val="bullet"/>
+      <w:lvlText w:val=""/>
+      <w:lvlJc w:val="left"/>
+      <w:pPr>
+        <w:ind w:left="4320" w:hanging="360"/>
+      </w:pPr>
+      <w:rPr>
+        <w:rFonts w:ascii="Wingdings" w:hAnsi="Wingdings" w:hint="default"/>
+      </w:rPr>
+    </w:lvl>
+    <w:lvl w:ilvl="6" w:tplc="20000001" w:tentative="1">
+      <w:start w:val="1"/>
+      <w:numFmt w:val="bullet"/>
+      <w:lvlText w:val=""/>
+      <w:lvlJc w:val="left"/>
+      <w:pPr>
+        <w:ind w:left="5040" w:hanging="360"/>
+      </w:pPr>
+      <w:rPr>
+        <w:rFonts w:ascii="Symbol" w:hAnsi="Symbol" w:hint="default"/>
+      </w:rPr>
+    </w:lvl>
+    <w:lvl w:ilvl="7" w:tplc="20000003" w:tentative="1">
+      <w:start w:val="1"/>
+      <w:numFmt w:val="bullet"/>
+      <w:lvlText w:val="o"/>
+      <w:lvlJc w:val="left"/>
+      <w:pPr>
+        <w:ind w:left="5760" w:hanging="360"/>
+      </w:pPr>
+      <w:rPr>
+        <w:rFonts w:ascii="Courier New" w:hAnsi="Courier New" w:cs="Courier New" w:hint="default"/>
+      </w:rPr>
+    </w:lvl>
+    <w:lvl w:ilvl="8" w:tplc="20000005" w:tentative="1">
+      <w:start w:val="1"/>
+      <w:numFmt w:val="bullet"/>
+      <w:lvlText w:val=""/>
+      <w:lvlJc w:val="left"/>
+      <w:pPr>
+        <w:ind w:left="6480" w:hanging="360"/>
+      </w:pPr>
+      <w:rPr>
+        <w:rFonts w:ascii="Wingdings" w:hAnsi="Wingdings" w:hint="default"/>
+      </w:rPr>
+    </w:lvl>
+  </w:abstractNum>
+  <w:abstractNum w:abstractNumId="4" w15:restartNumberingAfterBreak="0">
     <w:nsid w:val="5C7B1F0A"/>
     <w:multiLevelType w:val="hybridMultilevel"/>
     <w:tmpl w:val="E5EAECFC"/>
@@ -2246,7 +3991,7 @@
       </w:rPr>
     </w:lvl>
   </w:abstractNum>
-  <w:abstractNum w:abstractNumId="3" w15:restartNumberingAfterBreak="0">
+  <w:abstractNum w:abstractNumId="5" w15:restartNumberingAfterBreak="0">
     <w:nsid w:val="6A1877F4"/>
     <w:multiLevelType w:val="multilevel"/>
     <w:tmpl w:val="2E1AF01C"/>
@@ -2363,13 +4108,19 @@
     <w:abstractNumId w:val="0"/>
   </w:num>
   <w:num w:numId="2" w16cid:durableId="401874423">
+    <w:abstractNumId w:val="4"/>
+  </w:num>
+  <w:num w:numId="3" w16cid:durableId="1783963027">
+    <w:abstractNumId w:val="3"/>
+  </w:num>
+  <w:num w:numId="4" w16cid:durableId="2068141763">
+    <w:abstractNumId w:val="5"/>
+  </w:num>
+  <w:num w:numId="5" w16cid:durableId="248660142">
     <w:abstractNumId w:val="2"/>
   </w:num>
-  <w:num w:numId="3" w16cid:durableId="1783963027">
+  <w:num w:numId="6" w16cid:durableId="1591042974">
     <w:abstractNumId w:val="1"/>
-  </w:num>
-  <w:num w:numId="4" w16cid:durableId="2068141763">
-    <w:abstractNumId w:val="3"/>
   </w:num>
 </w:numbering>
 </file>
@@ -2774,6 +4525,7 @@
   <w:style w:type="paragraph" w:default="1" w:styleId="Normal">
     <w:name w:val="Normal"/>
     <w:qFormat/>
+    <w:rsid w:val="00DC32F8"/>
     <w:rPr>
       <w:lang w:val="es-MX"/>
     </w:rPr>
@@ -2786,11 +4538,11 @@
     <w:autoRedefine/>
     <w:uiPriority w:val="9"/>
     <w:qFormat/>
-    <w:rsid w:val="00B26E1D"/>
+    <w:rsid w:val="00973BBE"/>
     <w:pPr>
       <w:keepNext/>
       <w:keepLines/>
-      <w:spacing w:before="360" w:after="80" w:line="278" w:lineRule="auto"/>
+      <w:spacing w:after="80" w:line="278" w:lineRule="auto"/>
       <w:outlineLvl w:val="0"/>
     </w:pPr>
     <w:rPr>
@@ -3013,7 +4765,7 @@
     <w:basedOn w:val="DefaultParagraphFont"/>
     <w:link w:val="Heading1"/>
     <w:uiPriority w:val="9"/>
-    <w:rsid w:val="00B26E1D"/>
+    <w:rsid w:val="00973BBE"/>
     <w:rPr>
       <w:rFonts w:asciiTheme="majorHAnsi" w:eastAsiaTheme="majorEastAsia" w:hAnsiTheme="majorHAnsi" w:cstheme="majorBidi"/>
       <w:color w:val="7030A0"/>
@@ -3314,6 +5066,120 @@
       <w:color w:val="666666"/>
     </w:rPr>
   </w:style>
+  <w:style w:type="paragraph" w:styleId="Caption">
+    <w:name w:val="caption"/>
+    <w:basedOn w:val="Normal"/>
+    <w:next w:val="Normal"/>
+    <w:uiPriority w:val="35"/>
+    <w:unhideWhenUsed/>
+    <w:qFormat/>
+    <w:rsid w:val="007A050B"/>
+    <w:pPr>
+      <w:spacing w:after="200" w:line="240" w:lineRule="auto"/>
+    </w:pPr>
+    <w:rPr>
+      <w:i/>
+      <w:iCs/>
+      <w:color w:val="0E2841" w:themeColor="text2"/>
+      <w:sz w:val="18"/>
+      <w:szCs w:val="18"/>
+    </w:rPr>
+  </w:style>
+  <w:style w:type="table" w:styleId="TableGrid">
+    <w:name w:val="Table Grid"/>
+    <w:basedOn w:val="TableNormal"/>
+    <w:uiPriority w:val="39"/>
+    <w:rsid w:val="00650117"/>
+    <w:pPr>
+      <w:spacing w:after="0" w:line="240" w:lineRule="auto"/>
+    </w:pPr>
+    <w:tblPr>
+      <w:tblBorders>
+        <w:top w:val="single" w:sz="4" w:space="0" w:color="auto"/>
+        <w:left w:val="single" w:sz="4" w:space="0" w:color="auto"/>
+        <w:bottom w:val="single" w:sz="4" w:space="0" w:color="auto"/>
+        <w:right w:val="single" w:sz="4" w:space="0" w:color="auto"/>
+        <w:insideH w:val="single" w:sz="4" w:space="0" w:color="auto"/>
+        <w:insideV w:val="single" w:sz="4" w:space="0" w:color="auto"/>
+      </w:tblBorders>
+    </w:tblPr>
+  </w:style>
+  <w:style w:type="table" w:styleId="GridTable4-Accent1">
+    <w:name w:val="Grid Table 4 Accent 1"/>
+    <w:basedOn w:val="TableNormal"/>
+    <w:uiPriority w:val="49"/>
+    <w:rsid w:val="00DC32F8"/>
+    <w:pPr>
+      <w:spacing w:after="0" w:line="240" w:lineRule="auto"/>
+    </w:pPr>
+    <w:tblPr>
+      <w:tblStyleRowBandSize w:val="1"/>
+      <w:tblStyleColBandSize w:val="1"/>
+      <w:tblBorders>
+        <w:top w:val="single" w:sz="4" w:space="0" w:color="45B0E1" w:themeColor="accent1" w:themeTint="99"/>
+        <w:left w:val="single" w:sz="4" w:space="0" w:color="45B0E1" w:themeColor="accent1" w:themeTint="99"/>
+        <w:bottom w:val="single" w:sz="4" w:space="0" w:color="45B0E1" w:themeColor="accent1" w:themeTint="99"/>
+        <w:right w:val="single" w:sz="4" w:space="0" w:color="45B0E1" w:themeColor="accent1" w:themeTint="99"/>
+        <w:insideH w:val="single" w:sz="4" w:space="0" w:color="45B0E1" w:themeColor="accent1" w:themeTint="99"/>
+        <w:insideV w:val="single" w:sz="4" w:space="0" w:color="45B0E1" w:themeColor="accent1" w:themeTint="99"/>
+      </w:tblBorders>
+    </w:tblPr>
+    <w:tblStylePr w:type="firstRow">
+      <w:rPr>
+        <w:b/>
+        <w:bCs/>
+        <w:color w:val="FFFFFF" w:themeColor="background1"/>
+      </w:rPr>
+      <w:tblPr/>
+      <w:tcPr>
+        <w:tcBorders>
+          <w:top w:val="single" w:sz="4" w:space="0" w:color="156082" w:themeColor="accent1"/>
+          <w:left w:val="single" w:sz="4" w:space="0" w:color="156082" w:themeColor="accent1"/>
+          <w:bottom w:val="single" w:sz="4" w:space="0" w:color="156082" w:themeColor="accent1"/>
+          <w:right w:val="single" w:sz="4" w:space="0" w:color="156082" w:themeColor="accent1"/>
+          <w:insideH w:val="nil"/>
+          <w:insideV w:val="nil"/>
+        </w:tcBorders>
+        <w:shd w:val="clear" w:color="auto" w:fill="156082" w:themeFill="accent1"/>
+      </w:tcPr>
+    </w:tblStylePr>
+    <w:tblStylePr w:type="lastRow">
+      <w:rPr>
+        <w:b/>
+        <w:bCs/>
+      </w:rPr>
+      <w:tblPr/>
+      <w:tcPr>
+        <w:tcBorders>
+          <w:top w:val="double" w:sz="4" w:space="0" w:color="156082" w:themeColor="accent1"/>
+        </w:tcBorders>
+      </w:tcPr>
+    </w:tblStylePr>
+    <w:tblStylePr w:type="firstCol">
+      <w:rPr>
+        <w:b/>
+        <w:bCs/>
+      </w:rPr>
+    </w:tblStylePr>
+    <w:tblStylePr w:type="lastCol">
+      <w:rPr>
+        <w:b/>
+        <w:bCs/>
+      </w:rPr>
+    </w:tblStylePr>
+    <w:tblStylePr w:type="band1Vert">
+      <w:tblPr/>
+      <w:tcPr>
+        <w:shd w:val="clear" w:color="auto" w:fill="C1E4F5" w:themeFill="accent1" w:themeFillTint="33"/>
+      </w:tcPr>
+    </w:tblStylePr>
+    <w:tblStylePr w:type="band1Horz">
+      <w:tblPr/>
+      <w:tcPr>
+        <w:shd w:val="clear" w:color="auto" w:fill="C1E4F5" w:themeFill="accent1" w:themeFillTint="33"/>
+      </w:tcPr>
+    </w:tblStylePr>
+  </w:style>
 </w:styles>
 </file>
 
@@ -3437,7 +5303,7 @@
   </w:compat>
   <w:rsids>
     <w:rsidRoot w:val="0084204F"/>
-    <w:rsid w:val="002E7A38"/>
+    <w:rsid w:val="004B5232"/>
     <w:rsid w:val="00766FDD"/>
     <w:rsid w:val="0084204F"/>
   </w:rsids>
@@ -4222,7 +6088,7 @@
   <we:properties>
     <we:property name="MENDELEY_BIBLIOGRAPHY_IS_DIRTY" value="true"/>
     <we:property name="MENDELEY_BIBLIOGRAPHY_LAST_MODIFIED" value="1778586340449"/>
-    <we:property name="MENDELEY_CITATIONS" value="[{&quot;citationID&quot;:&quot;MENDELEY_CITATION_2079b87b-67f9-4a66-b0db-ef8bb10146ab&quot;,&quot;properties&quot;:{&quot;noteIndex&quot;:0},&quot;isEdited&quot;:false,&quot;manualOverride&quot;:{&quot;isManuallyOverridden&quot;:false,&quot;citeprocText&quot;:&quot;(Gehirn Inc., 2026)&quot;,&quot;manualOverrideText&quot;:&quot;&quot;},&quot;citationTag&quot;:&quot;MENDELEY_CITATION_v3_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&quot;,&quot;citationItems&quot;:[{&quot;id&quot;:&quot;d433b857-53be-3bee-b10b-cee97cab9c7b&quot;,&quot;itemData&quot;:{&quot;type&quot;:&quot;article&quot;,&quot;id&quot;:&quot;d433b857-53be-3bee-b10b-cee97cab9c7b&quot;,&quot;title&quot;:&quot;NERV Disaster Prevention&quot;,&quot;author&quot;:[{&quot;family&quot;:&quot;Gehirn Inc.&quot;,&quot;given&quot;:&quot;&quot;,&quot;parse-names&quot;:false,&quot;dropping-particle&quot;:&quot;&quot;,&quot;non-dropping-particle&quot;:&quot;&quot;}],&quot;accessed&quot;:{&quot;date-parts&quot;:[[2026,5,11]]},&quot;URL&quot;:&quot;https://play.google.com/store/apps/details?id=app.nerv&amp;hl=en&quot;,&quot;issued&quot;:{&quot;date-parts&quot;:[[2026]]},&quot;container-title-short&quot;:&quot;&quot;},&quot;isTemporary&quot;:false}]}]"/>
+    <we:property name="MENDELEY_CITATIONS" value="[{&quot;citationID&quot;:&quot;MENDELEY_CITATION_2079b87b-67f9-4a66-b0db-ef8bb10146ab&quot;,&quot;properties&quot;:{&quot;noteIndex&quot;:0},&quot;isEdited&quot;:false,&quot;manualOverride&quot;:{&quot;isManuallyOverridden&quot;:false,&quot;citeprocText&quot;:&quot;(Gehirn Inc., 2026)&quot;,&quot;manualOverrideText&quot;:&quot;&quot;},&quot;citationTag&quot;:&quot;MENDELEY_CITATION_v3_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&quot;,&quot;citationItems&quot;:[{&quot;id&quot;:&quot;d433b857-53be-3bee-b10b-cee97cab9c7b&quot;,&quot;itemData&quot;:{&quot;type&quot;:&quot;article&quot;,&quot;id&quot;:&quot;d433b857-53be-3bee-b10b-cee97cab9c7b&quot;,&quot;title&quot;:&quot;NERV Disaster Prevention&quot;,&quot;author&quot;:[{&quot;family&quot;:&quot;Gehirn Inc.&quot;,&quot;given&quot;:&quot;&quot;,&quot;parse-names&quot;:false,&quot;dropping-particle&quot;:&quot;&quot;,&quot;non-dropping-particle&quot;:&quot;&quot;}],&quot;accessed&quot;:{&quot;date-parts&quot;:[[2026,5,11]]},&quot;URL&quot;:&quot;https://play.google.com/store/apps/details?id=app.nerv&amp;hl=en&quot;,&quot;issued&quot;:{&quot;date-parts&quot;:[[2026]]},&quot;container-title-short&quot;:&quot;&quot;},&quot;isTemporary&quot;:false}]},{&quot;citationID&quot;:&quot;MENDELEY_CITATION_58ea0770-dbb5-4070-99ad-7d3009b63fca&quot;,&quot;properties&quot;:{&quot;noteIndex&quot;:0},&quot;isEdited&quot;:false,&quot;manualOverride&quot;:{&quot;isManuallyOverridden&quot;:false,&quot;citeprocText&quot;:&quot;(Brooke, 1996)&quot;,&quot;manualOverrideText&quot;:&quot;&quot;},&quot;citationTag&quot;:&quot;MENDELEY_CITATION_v3_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&quot;,&quot;citationItems&quot;:[{&quot;id&quot;:&quot;5afb2a21-fb5b-3b85-b235-1998f7f57b80&quot;,&quot;itemData&quot;:{&quot;type&quot;:&quot;chapter&quot;,&quot;id&quot;:&quot;5afb2a21-fb5b-3b85-b235-1998f7f57b80&quot;,&quot;title&quot;:&quot;SUS -- a quick and dirty usability scale&quot;,&quot;author&quot;:[{&quot;family&quot;:&quot;Brooke&quot;,&quot;given&quot;:&quot;John&quot;,&quot;parse-names&quot;:false,&quot;dropping-particle&quot;:&quot;&quot;,&quot;non-dropping-particle&quot;:&quot;&quot;}],&quot;container-title&quot;:&quot;Usability Evaluation in Industry&quot;,&quot;issued&quot;:{&quot;date-parts&quot;:[[1996]]},&quot;page&quot;:&quot;189-194&quot;,&quot;container-title-short&quot;:&quot;&quot;},&quot;isTemporary&quot;:false,&quot;suppress-author&quot;:false,&quot;composite&quot;:false,&quot;author-only&quot;:false}]}]"/>
     <we:property name="MENDELEY_CITATIONS_STYLE" value="{&quot;id&quot;:&quot;https://www.zotero.org/styles/apa&quot;,&quot;title&quot;:&quot;APA Style 7th edition&quot;,&quot;format&quot;:&quot;author-date&quot;,&quot;defaultLocale&quot;:null,&quot;isLocaleCodeValid&quot;:true}"/>
   </we:properties>
   <we:bindings/>

</xml_diff>